<commit_message>
Sửa báo cáo Food App Business theo góp ý của nhóm
- Sửa số cột Customers (39 cột dẫn xuất), số n trên cây quyết định,
  đếm lại kết quả giả thuyết (5 chấp nhận, 3 chấp nhận một phần)
- Thống nhất cách gọi chi tiêu cộng dồn ở mục 6.6, 7, 8.1; nêu rõ giả
  định mốc 6 tháng và lý do chọn ngưỡng 0,3 theo recall/precision
- Bổ sung số liệu hôn nhân - số con, phân tích CD4, kiểm định H4 có
  kiểm soát thu nhập, chú thích hai cách tính tỷ lệ giảm giá
- Sửa trích dẫn Reichheld & Sasser, BG/NBD (Fader và cộng sự 2005a)
- Thêm 5 hình dựng lại các trang dashboard Power BI

Co-Authored-By: Claude Opus 5.5 <noreply@anthropic.com>
Claude-Session: https://claude.ai/code/session_01X5xVffgcgtEXBxQQecpyTH
</commit_message>
<xml_diff>
--- a/Báo cáo cuối kỳ - Food App Business.docx
+++ b/Báo cáo cuối kỳ - Food App Business.docx
@@ -1289,7 +1289,7 @@
       </w:r>
       <w:r>
         <w:tab/>
-        <w:t>5</w:t>
+        <w:t>6</w:t>
       </w:r>
     </w:p>
     <w:p>
@@ -1306,7 +1306,7 @@
       </w:r>
       <w:r>
         <w:tab/>
-        <w:t>6</w:t>
+        <w:t>7</w:t>
       </w:r>
     </w:p>
     <w:p>
@@ -1399,7 +1399,7 @@
       </w:r>
       <w:r>
         <w:tab/>
-        <w:t>8</w:t>
+        <w:t>9</w:t>
       </w:r>
     </w:p>
     <w:p>
@@ -1576,7 +1576,7 @@
           <w:bCs/>
         </w:rPr>
         <w:tab/>
-        <w:t>15</w:t>
+        <w:t>18</w:t>
       </w:r>
     </w:p>
     <w:p>
@@ -1593,7 +1593,7 @@
       </w:r>
       <w:r>
         <w:tab/>
-        <w:t>15</w:t>
+        <w:t>18</w:t>
       </w:r>
     </w:p>
     <w:p>
@@ -1610,7 +1610,7 @@
       </w:r>
       <w:r>
         <w:tab/>
-        <w:t>15</w:t>
+        <w:t>18</w:t>
       </w:r>
     </w:p>
     <w:p>
@@ -1627,7 +1627,7 @@
       </w:r>
       <w:r>
         <w:tab/>
-        <w:t>16</w:t>
+        <w:t>19</w:t>
       </w:r>
     </w:p>
     <w:p>
@@ -1644,7 +1644,7 @@
       </w:r>
       <w:r>
         <w:tab/>
-        <w:t>17</w:t>
+        <w:t>20</w:t>
       </w:r>
     </w:p>
     <w:p>
@@ -1661,7 +1661,7 @@
       </w:r>
       <w:r>
         <w:tab/>
-        <w:t>18</w:t>
+        <w:t>21</w:t>
       </w:r>
     </w:p>
     <w:p>
@@ -1686,7 +1686,7 @@
           <w:bCs/>
         </w:rPr>
         <w:tab/>
-        <w:t>19</w:t>
+        <w:t>22</w:t>
       </w:r>
     </w:p>
     <w:p>
@@ -1703,7 +1703,7 @@
       </w:r>
       <w:r>
         <w:tab/>
-        <w:t>19</w:t>
+        <w:t>22</w:t>
       </w:r>
     </w:p>
     <w:p>
@@ -1720,7 +1720,7 @@
       </w:r>
       <w:r>
         <w:tab/>
-        <w:t>19</w:t>
+        <w:t>23</w:t>
       </w:r>
     </w:p>
     <w:p>
@@ -1737,7 +1737,7 @@
       </w:r>
       <w:r>
         <w:tab/>
-        <w:t>20</w:t>
+        <w:t>24</w:t>
       </w:r>
     </w:p>
     <w:p>
@@ -1754,7 +1754,7 @@
       </w:r>
       <w:r>
         <w:tab/>
-        <w:t>21</w:t>
+        <w:t>24</w:t>
       </w:r>
     </w:p>
     <w:p>
@@ -1771,7 +1771,7 @@
       </w:r>
       <w:r>
         <w:tab/>
-        <w:t>22</w:t>
+        <w:t>26</w:t>
       </w:r>
     </w:p>
     <w:p>
@@ -1788,7 +1788,7 @@
       </w:r>
       <w:r>
         <w:tab/>
-        <w:t>23</w:t>
+        <w:t>26</w:t>
       </w:r>
     </w:p>
     <w:p>
@@ -1813,7 +1813,7 @@
           <w:bCs/>
         </w:rPr>
         <w:tab/>
-        <w:t>24</w:t>
+        <w:t>27</w:t>
       </w:r>
     </w:p>
     <w:p>
@@ -1830,7 +1830,7 @@
       </w:r>
       <w:r>
         <w:tab/>
-        <w:t>24</w:t>
+        <w:t>27</w:t>
       </w:r>
     </w:p>
     <w:p>
@@ -1847,7 +1847,7 @@
       </w:r>
       <w:r>
         <w:tab/>
-        <w:t>24</w:t>
+        <w:t>27</w:t>
       </w:r>
     </w:p>
     <w:p>
@@ -1872,7 +1872,7 @@
           <w:bCs/>
         </w:rPr>
         <w:tab/>
-        <w:t>25</w:t>
+        <w:t>28</w:t>
       </w:r>
     </w:p>
     <w:p>
@@ -1889,7 +1889,7 @@
       </w:r>
       <w:r>
         <w:tab/>
-        <w:t>25</w:t>
+        <w:t>28</w:t>
       </w:r>
     </w:p>
     <w:p>
@@ -1906,7 +1906,7 @@
       </w:r>
       <w:r>
         <w:tab/>
-        <w:t>25</w:t>
+        <w:t>28</w:t>
       </w:r>
     </w:p>
     <w:p>
@@ -1923,7 +1923,7 @@
       </w:r>
       <w:r>
         <w:tab/>
-        <w:t>25</w:t>
+        <w:t>28</w:t>
       </w:r>
     </w:p>
     <w:p>
@@ -1948,7 +1948,7 @@
           <w:bCs/>
         </w:rPr>
         <w:tab/>
-        <w:t>26</w:t>
+        <w:t>29</w:t>
       </w:r>
       <w:r>
         <w:fldChar w:fldCharType="end"/>
@@ -1983,7 +1983,7 @@
       </w:r>
       <w:r>
         <w:tab/>
-        <w:t>6</w:t>
+        <w:t>7</w:t>
       </w:r>
     </w:p>
     <w:p>
@@ -2017,7 +2017,7 @@
       </w:r>
       <w:r>
         <w:tab/>
-        <w:t>8</w:t>
+        <w:t>9</w:t>
       </w:r>
     </w:p>
     <w:p>
@@ -2102,7 +2102,7 @@
       </w:r>
       <w:r>
         <w:tab/>
-        <w:t>15</w:t>
+        <w:t>18</w:t>
       </w:r>
     </w:p>
     <w:p>
@@ -2119,7 +2119,7 @@
       </w:r>
       <w:r>
         <w:tab/>
-        <w:t>16</w:t>
+        <w:t>19</w:t>
       </w:r>
     </w:p>
     <w:p>
@@ -2136,7 +2136,7 @@
       </w:r>
       <w:r>
         <w:tab/>
-        <w:t>18</w:t>
+        <w:t>21</w:t>
       </w:r>
     </w:p>
     <w:p>
@@ -2153,7 +2153,7 @@
       </w:r>
       <w:r>
         <w:tab/>
-        <w:t>19</w:t>
+        <w:t>23</w:t>
       </w:r>
     </w:p>
     <w:p>
@@ -2170,7 +2170,7 @@
       </w:r>
       <w:r>
         <w:tab/>
-        <w:t>20</w:t>
+        <w:t>24</w:t>
       </w:r>
     </w:p>
     <w:p>
@@ -2187,7 +2187,7 @@
       </w:r>
       <w:r>
         <w:tab/>
-        <w:t>22</w:t>
+        <w:t>25</w:t>
       </w:r>
     </w:p>
     <w:p>
@@ -2204,7 +2204,7 @@
       </w:r>
       <w:r>
         <w:tab/>
-        <w:t>24</w:t>
+        <w:t>27</w:t>
       </w:r>
     </w:p>
     <w:p>
@@ -2265,7 +2265,7 @@
         <w:jc w:val="left"/>
       </w:pPr>
       <w:r>
-        <w:t xml:space="preserve">Hình 5.1. Doanh thu theo thập phân vị khách hàng (Pareto)</w:t>
+        <w:t xml:space="preserve">Hình 4.1. Trang 1 - Tổng quan kinh doanh</w:t>
       </w:r>
       <w:r>
         <w:tab/>
@@ -2282,7 +2282,7 @@
         <w:jc w:val="left"/>
       </w:pPr>
       <w:r>
-        <w:t xml:space="preserve">Hình 5.2. Chi tiêu trung bình theo số con trong hộ</w:t>
+        <w:t xml:space="preserve">Hình 4.2. Trang 2 - Chân dung khách hàng</w:t>
       </w:r>
       <w:r>
         <w:tab/>
@@ -2299,11 +2299,11 @@
         <w:jc w:val="left"/>
       </w:pPr>
       <w:r>
-        <w:t xml:space="preserve">Hình 5.3. Tỷ lệ chấp nhận theo chiến dịch</w:t>
+        <w:t xml:space="preserve">Hình 4.3. Trang 3 - Sản phẩm và kênh bán</w:t>
       </w:r>
       <w:r>
         <w:tab/>
-        <w:t>17</w:t>
+        <w:t>16</w:t>
       </w:r>
     </w:p>
     <w:p>
@@ -2316,11 +2316,11 @@
         <w:jc w:val="left"/>
       </w:pPr>
       <w:r>
-        <w:t xml:space="preserve">Hình 5.4. Tỷ trọng khách hàng và doanh thu theo phân khúc RFM</w:t>
+        <w:t xml:space="preserve">Hình 4.4. Trang 4 - Hiệu quả chiến dịch</w:t>
       </w:r>
       <w:r>
         <w:tab/>
-        <w:t>18</w:t>
+        <w:t>17</w:t>
       </w:r>
     </w:p>
     <w:p>
@@ -2333,11 +2333,11 @@
         <w:jc w:val="left"/>
       </w:pPr>
       <w:r>
-        <w:t xml:space="preserve">Hình 6.1. Odds ratio và khoảng tin cậy 95% của mô hình hồi quy logistic</w:t>
+        <w:t xml:space="preserve">Hình 4.5. Trang 5 - Phân khúc RFM và giữ chân khách hàng</w:t>
       </w:r>
       <w:r>
         <w:tab/>
-        <w:t>21</w:t>
+        <w:t>17</w:t>
       </w:r>
     </w:p>
     <w:p>
@@ -2350,11 +2350,79 @@
         <w:jc w:val="left"/>
       </w:pPr>
       <w:r>
+        <w:t xml:space="preserve">Hình 5.1. Doanh thu theo thập phân vị khách hàng (Pareto)</w:t>
+      </w:r>
+      <w:r>
+        <w:tab/>
+        <w:t>18</w:t>
+      </w:r>
+    </w:p>
+    <w:p>
+      <w:pPr>
+        <w:tabs>
+          <w:tab w:val="right" w:leader="dot" w:pos="9360"/>
+        </w:tabs>
+        <w:spacing w:after="80" w:line="240" w:lineRule="auto"/>
+        <w:ind w:firstLine="0"/>
+        <w:jc w:val="left"/>
+      </w:pPr>
+      <w:r>
+        <w:t xml:space="preserve">Hình 5.2. Chi tiêu trung bình theo số con trong hộ</w:t>
+      </w:r>
+      <w:r>
+        <w:tab/>
+        <w:t>19</w:t>
+      </w:r>
+    </w:p>
+    <w:p>
+      <w:pPr>
+        <w:tabs>
+          <w:tab w:val="right" w:leader="dot" w:pos="9360"/>
+        </w:tabs>
+        <w:spacing w:after="80" w:line="240" w:lineRule="auto"/>
+        <w:ind w:firstLine="0"/>
+        <w:jc w:val="left"/>
+      </w:pPr>
+      <w:r>
+        <w:t xml:space="preserve">Hình 5.3. Tỷ lệ chấp nhận theo chiến dịch</w:t>
+      </w:r>
+      <w:r>
+        <w:tab/>
+        <w:t>20</w:t>
+      </w:r>
+    </w:p>
+    <w:p>
+      <w:pPr>
+        <w:tabs>
+          <w:tab w:val="right" w:leader="dot" w:pos="9360"/>
+        </w:tabs>
+        <w:spacing w:after="80" w:line="240" w:lineRule="auto"/>
+        <w:ind w:firstLine="0"/>
+        <w:jc w:val="left"/>
+      </w:pPr>
+      <w:r>
+        <w:t xml:space="preserve">Hình 6.1. Odds ratio và khoảng tin cậy 95% của mô hình hồi quy logistic</w:t>
+      </w:r>
+      <w:r>
+        <w:tab/>
+        <w:t>25</w:t>
+      </w:r>
+    </w:p>
+    <w:p>
+      <w:pPr>
+        <w:tabs>
+          <w:tab w:val="right" w:leader="dot" w:pos="9360"/>
+        </w:tabs>
+        <w:spacing w:after="80" w:line="240" w:lineRule="auto"/>
+        <w:ind w:firstLine="0"/>
+        <w:jc w:val="left"/>
+      </w:pPr>
+      <w:r>
         <w:t xml:space="preserve">Hình 6.2. Cây quyết định ba tầng dự báo phản hồi chiến dịch</w:t>
       </w:r>
       <w:r>
         <w:tab/>
-        <w:t>23</w:t>
+        <w:t>26</w:t>
       </w:r>
     </w:p>
     <w:p>
@@ -2583,7 +2651,7 @@
                 <w:sz w:val="22"/>
                 <w:szCs w:val="22"/>
               </w:rPr>
-              <w:t xml:space="preserve">Chiến dịch marketing</w:t>
+              <w:t xml:space="preserve">Chiến dịch marketing (CD1-CD5: chiến dịch 1-5)</w:t>
             </w:r>
           </w:p>
         </w:tc>
@@ -2974,7 +3042,7 @@
         <w:spacing w:after="240" w:line="240" w:lineRule="auto"/>
       </w:pPr>
       <w:r>
-        <w:t xml:space="preserve">Doanh thu của Food App phụ thuộc vào một nhóm nhỏ khách hàng: 20% khách chi tiêu nhiều nhất tạo ra 53,4% doanh thu, trong khi 79% khách chưa từng phản hồi bất kỳ chiến dịch marketing nào. Báo cáo này tìm xem ai tạo ra giá trị, điều gì quyết định mức chi tiêu và khả năng phản hồi chiến dịch, và công ty nên dồn ngân sách marketing vào đâu.</w:t>
+        <w:t xml:space="preserve">Doanh thu của Food App phụ thuộc vào một nhóm nhỏ khách hàng: 20% khách chi tiêu nhiều nhất tạo ra 53,4% doanh thu, trong khi 79% khách chưa từng phản hồi bất kỳ chiến dịch marketing nào. Ở đây “doanh thu” là tổng chi tiêu cộng dồn của khách (xem mục 2.1). Báo cáo này tìm xem ai tạo ra giá trị, điều gì quyết định mức chi tiêu và khả năng phản hồi chiến dịch, và công ty nên dồn ngân sách marketing vào đâu.</w:t>
       </w:r>
     </w:p>
     <w:p>
@@ -3000,7 +3068,7 @@
         <w:spacing w:after="240" w:line="240" w:lineRule="auto"/>
       </w:pPr>
       <w:r>
-        <w:t xml:space="preserve">Với kinh doanh thực phẩm trực tuyến, giữ chân khách cũ quan trọng hơn tìm khách mới. Reichheld và Sasser (1990) cho thấy chỉ cần giảm 5% tỷ lệ khách rời bỏ có thể làm lợi nhuận tăng từ 25% đến 85% tùy ngành, vì khách trung thành mua nhiều hơn, ít nhạy cảm với giá và tốn ít chi phí phục vụ hơn. Mặt khác, ngân sách chiến dịch có hạn, nên gửi ưu đãi cho sai người vừa tốn tiền vừa không tạo ra doanh thu.</w:t>
+        <w:t xml:space="preserve">Giữ chân khách hàng hiện có là một đòn bẩy lợi nhuận quan trọng. Qua các ví dụ ở ngành dịch vụ như chi nhánh ngân hàng, môi giới bảo hiểm và dịch vụ sửa chữa ô tô, Reichheld và Sasser (1990) lập luận rằng giảm 5% tỷ lệ khách rời bỏ có thể làm lợi nhuận tăng 25-85%, vì khách gắn bó lâu mua nhiều hơn và tốn ít chi phí phục vụ hơn. Con số này chỉ mang tính minh họa từ một số doanh nghiệp dịch vụ, không phải ước lượng cho bán lẻ thực phẩm trực tuyến, nên báo cáo chỉ dùng lập luận chung của bài: mất một khách giá trị cao tốn kém hơn nhiều so với mất một khách mua ít. Đồng thời, ngân sách chiến dịch có hạn nên cần biết gửi ưu đãi cho ai.</w:t>
       </w:r>
     </w:p>
     <w:p>
@@ -3018,14 +3086,14 @@
         <w:spacing w:after="240" w:line="240" w:lineRule="auto"/>
       </w:pPr>
       <w:r>
-        <w:t xml:space="preserve">Phòng Marketing hiện nhìn khách hàng như một khối chung: các chiến dịch được gửi đại trà và mỗi chiến dịch chỉ được 1,3-7,6% khách chấp nhận. Câu hỏi quản trị là: </w:t>
+        <w:t xml:space="preserve">Trong năm chiến dịch gần đây, mỗi chiến dịch chỉ được 1,3-7,6% khách chấp nhận và 79% khách chưa từng phản hồi chiến dịch nào; dữ liệu không ghi cách chọn người nhận, nên chưa biết các chiến dịch đã được nhắm tới nhóm nào. Câu hỏi quản trị là: </w:t>
       </w:r>
       <w:r>
         <w:rPr>
           <w:b/>
           <w:bCs/>
         </w:rPr>
-        <w:t xml:space="preserve">nguồn lực marketing có hạn nên đặt vào nhóm khách nào, qua kênh nào và với loại ưu đãi nào để tạo ra nhiều doanh thu nhất?</w:t>
+        <w:t xml:space="preserve">nguồn lực marketing có hạn nên đặt vào nhóm khách nào, qua kênh nào và với loại ưu đãi nào để tạo ra nhiều giá trị nhất?</w:t>
       </w:r>
     </w:p>
     <w:p>
@@ -3133,7 +3201,7 @@
         <w:t xml:space="preserve">Làm gì trước?</w:t>
       </w:r>
       <w:r>
-        <w:t xml:space="preserve"> Bao nhiêu doanh thu đang có nguy cơ mất, và hành động nào có tác động lớn với chi phí thấp?</w:t>
+        <w:t xml:space="preserve"> Bao nhiêu giá trị đang có nguy cơ mất, và hành động nào có tác động lớn với chi phí thấp?</w:t>
       </w:r>
     </w:p>
     <w:p>
@@ -3176,7 +3244,7 @@
         <w:t xml:space="preserve">Mô hình RFM (Hughes, 1994):</w:t>
       </w:r>
       <w:r>
-        <w:t xml:space="preserve"> giá trị tương lai của một khách hàng được dự báo tốt bởi ba hành vi đã quan sát: mua gần đây đến mức nào (Recency), mua thường xuyên đến mức nào (Frequency) và chi bao nhiêu (Monetary). Fader, Hardie và Lee (2005) chỉ ra RFM là các thống kê đủ để ước lượng giá trị vòng đời khách hàng. Vì vậy RFM được dùng làm khung phân khúc trong báo cáo.</w:t>
+        <w:t xml:space="preserve"> giá trị tương lai của một khách hàng được dự báo tốt bởi ba hành vi đã quan sát: mua gần đây đến mức nào (Recency), mua thường xuyên đến mức nào (Frequency) và chi bao nhiêu (Monetary). Fader, Hardie và Lee (2005b) chỉ ra RFM là các thống kê đủ để ước lượng giá trị vòng đời khách hàng. Vì vậy RFM được dùng làm khung phân khúc trong báo cáo.</w:t>
       </w:r>
     </w:p>
     <w:p>
@@ -4152,7 +4220,17 @@
         <w:t xml:space="preserve">Monthly Income</w:t>
       </w:r>
       <w:r>
-        <w:t xml:space="preserve"> nhưng có giá trị 5.305-105.471, nên được hiểu như thước đo thu nhập hộ gia đình và chỉ dùng để so sánh tương đối.</w:t>
+        <w:t xml:space="preserve"> nhưng có giá trị 5.305-105.471 (trung vị 51.550), độ lớn phù hợp với thu nhập năm hơn là thu nhập tháng; vì không rõ đơn vị và kỳ tính, báo cáo không diễn giải giá trị tuyệt đối mà chỉ dùng biến này để so sánh giữa các khách. Theo cách đặt tên measure trong file Power BI, “doanh thu” trong báo cáo là </w:t>
+      </w:r>
+      <w:r>
+        <w:rPr>
+          <w:b/>
+          <w:bCs/>
+        </w:rPr>
+        <w:t xml:space="preserve">tổng chi tiêu cộng dồn</w:t>
+      </w:r>
+      <w:r>
+        <w:t xml:space="preserve"> (Total_Spend), không phải doanh thu của một kỳ cụ thể.</w:t>
       </w:r>
     </w:p>
     <w:p>
@@ -5271,7 +5349,7 @@
                 <w:sz w:val="22"/>
                 <w:szCs w:val="22"/>
               </w:rPr>
-              <w:t xml:space="preserve">Tỷ lệ đơn mua có giảm giá</w:t>
+              <w:t xml:space="preserve">Tỷ lệ đơn có giảm giá (TB theo khách)*</w:t>
             </w:r>
           </w:p>
         </w:tc>
@@ -5528,7 +5606,7 @@
           <w:sz w:val="22"/>
           <w:szCs w:val="22"/>
         </w:rPr>
-        <w:t xml:space="preserve">Nguồn: Nhóm tác giả tính toán từ dữ liệu 05_FoodAppBusiness.</w:t>
+        <w:t xml:space="preserve">Nguồn: Nhóm tác giả tính toán từ dữ liệu 05_FoodAppBusiness. (*) Trung bình tỷ lệ của từng khách (Deal_Ratio); nếu tính trên tổng số đơn của cả nhóm là 11,9% và 20,8%.</w:t>
       </w:r>
     </w:p>
     <w:p>
@@ -5556,7 +5634,7 @@
         <w:spacing w:after="240" w:line="240" w:lineRule="auto"/>
       </w:pPr>
       <w:r>
-        <w:t xml:space="preserve">Dữ liệu gốc không thiếu giá trị, nhưng có 204 dòng trùng lặp và 9 dòng mâu thuẫn logic. Sau làm sạch, bảng Customers còn 1.992 khách hàng (90,3% dữ liệu gốc) với 66 cột, trong đó 33 biến được tạo mới. Toàn bộ các bước được ghi lại trong bảng Cleaning_Log ngay trong file Power BI.</w:t>
+        <w:t xml:space="preserve">Dữ liệu gốc không thiếu giá trị, nhưng có 204 dòng trùng lặp và 9 dòng mâu thuẫn logic. Sau làm sạch, bảng Customers còn 1.992 khách hàng (90,3% dữ liệu gốc) với 66 cột: 25 cột gốc (đã bỏ Single), 2 cột định danh (CustomerID và Raw_Row - số dòng gốc để truy vết) và 39 cột dẫn xuất. Toàn bộ các bước được ghi lại trong bảng Cleaning_Log ngay trong file Power BI.</w:t>
       </w:r>
     </w:p>
     <w:p>
@@ -6179,7 +6257,7 @@
                 <w:sz w:val="22"/>
                 <w:szCs w:val="22"/>
               </w:rPr>
-              <w:t xml:space="preserve">Đa cộng tuyến</w:t>
+              <w:t xml:space="preserve">Cộng tuyến hoàn hảo</w:t>
             </w:r>
           </w:p>
         </w:tc>
@@ -6199,7 +6277,7 @@
                 <w:sz w:val="22"/>
                 <w:szCs w:val="22"/>
               </w:rPr>
-              <w:t xml:space="preserve">Single = 1 - Married</w:t>
+              <w:t xml:space="preserve">Single = 1 - Married ở mọi dòng: hai cột chứa cùng một thông tin</w:t>
             </w:r>
           </w:p>
         </w:tc>
@@ -6219,7 +6297,7 @@
                 <w:sz w:val="22"/>
                 <w:szCs w:val="22"/>
               </w:rPr>
-              <w:t xml:space="preserve">Bỏ cột Single (tránh bẫy biến giả)</w:t>
+              <w:t xml:space="preserve">Bỏ cột Single để tránh bẫy biến giả (dummy variable trap) khi chạy mô hình</w:t>
             </w:r>
           </w:p>
         </w:tc>
@@ -7040,7 +7118,7 @@
         <w:t xml:space="preserve">Unpivot</w:t>
       </w:r>
       <w:r>
-        <w:t xml:space="preserve">, cho phép vẽ 5 nhóm hàng, 3 kênh và 5 chiến dịch trên cùng một trục. Winback Rate là bảng tham số GENERATESERIES(0; 0,5; 0,05) để người xem tự chọn tỷ lệ win-back; _Measures chứa toàn bộ 40 measure.</w:t>
+        <w:t xml:space="preserve">, cho phép vẽ 5 nhóm hàng, 3 kênh và 5 chiến dịch trên cùng một trục. Bảng tham số Winback Rate (tên bảng trong file) được tạo bằng GENERATESERIES(0, 0.5, 0.05) để người xem tự chọn tỷ lệ win-back; _Measures chứa toàn bộ 40 measure.</w:t>
       </w:r>
     </w:p>
     <w:p>
@@ -7155,7 +7233,7 @@
         <w:spacing w:after="240" w:line="240" w:lineRule="auto"/>
       </w:pPr>
       <w:r>
-        <w:t xml:space="preserve">Toàn bộ chỉ số được viết bằng measure để phản ứng theo bốn slicer Income_Group, Age_Group, Children_Label và RFM_Segment trên mọi trang.</w:t>
+        <w:t xml:space="preserve">Toàn bộ chỉ số được viết bằng measure để phản ứng theo bốn slicer Income_Group, Age_Group, Children_Label và RFM_Segment trên mọi trang. Công thức DAX được giữ nguyên cú pháp trong file (dấu chấm thập phân, dấu phẩy ngăn cách tham số).</w:t>
       </w:r>
     </w:p>
     <w:p>
@@ -7966,7 +8044,7 @@
         <w:t xml:space="preserve">r</w:t>
       </w:r>
       <w:r>
-        <w:t xml:space="preserve"> là tỷ lệ khách At Risk được kéo lại (win-back). Công thức giả định mỗi khách quay lại sẽ chi tiêu ở mức như trước đây, nên kết quả là cận trên của doanh thu có thể giữ lại.</w:t>
+        <w:t xml:space="preserve"> là tỷ lệ khách At Risk được kéo lại (win-back). Công thức giả định mỗi khách quay lại sẽ chi tiêu ở mức như trước đây, nên kết quả là cận trên, tính bằng chi tiêu lịch sử cộng dồn chứ không phải doanh thu của một kỳ.</w:t>
       </w:r>
     </w:p>
     <w:p>
@@ -8523,7 +8601,7 @@
                 <w:sz w:val="22"/>
                 <w:szCs w:val="22"/>
               </w:rPr>
-              <w:t xml:space="preserve">Catalog có AOV gấp 3 lần; truy cập nhiều không có nghĩa là mua nhiều</w:t>
+              <w:t xml:space="preserve">AOV catalog cao nhất (69,3 $ so với 43,7 $ ở cửa hàng); truy cập nhiều không có nghĩa là mua nhiều</w:t>
             </w:r>
           </w:p>
         </w:tc>
@@ -8719,6 +8797,459 @@
     </w:p>
     <w:p>
       <w:pPr>
+        <w:spacing w:after="240" w:line="240" w:lineRule="auto"/>
+      </w:pPr>
+      <w:r>
+        <w:t xml:space="preserve">Hình 4.1 đến 4.5 thể hiện năm trang dashboard ở trạng thái chưa lọc. Riêng measure AOV trên dashboard được tính bằng tổng chi tiêu ÷ tổng số đơn của cả nhóm, nên khác với AOV trung vị theo khách dùng ở các bảng của chương 5.</w:t>
+      </w:r>
+    </w:p>
+    <w:p>
+      <w:pPr>
+        <w:keepNext/>
+        <w:keepLines/>
+        <w:spacing w:after="120" w:line="240" w:lineRule="auto"/>
+        <w:ind w:firstLine="0"/>
+        <w:jc w:val="center"/>
+      </w:pPr>
+      <w:r>
+        <w:rPr>
+          <w:b/>
+          <w:bCs/>
+          <w:sz w:val="24"/>
+          <w:szCs w:val="24"/>
+        </w:rPr>
+        <w:t xml:space="preserve">Hình 4.1.</w:t>
+      </w:r>
+      <w:r>
+        <w:rPr>
+          <w:sz w:val="24"/>
+          <w:szCs w:val="24"/>
+        </w:rPr>
+        <w:t xml:space="preserve"> Trang 1 - Tổng quan kinh doanh</w:t>
+      </w:r>
+    </w:p>
+    <w:p>
+      <w:pPr>
+        <w:keepNext/>
+        <w:spacing w:after="120" w:line="240" w:lineRule="auto"/>
+        <w:ind w:firstLine="0"/>
+        <w:jc w:val="center"/>
+      </w:pPr>
+      <w:r>
+        <w:rPr>
+          <w:noProof/>
+        </w:rPr>
+        <w:drawing>
+          <wp:inline distT="0" distB="0" distL="0" distR="0">
+            <wp:extent cx="5760720" cy="3240405"/>
+            <wp:effectExtent l="0" t="0" r="0" b="0"/>
+            <wp:docPr id="103" name="Picture 103"/>
+            <wp:cNvGraphicFramePr>
+              <a:graphicFrameLocks xmlns:a="http://schemas.openxmlformats.org/drawingml/2006/main" noChangeAspect="1"/>
+            </wp:cNvGraphicFramePr>
+            <a:graphic xmlns:a="http://schemas.openxmlformats.org/drawingml/2006/main">
+              <a:graphicData uri="http://schemas.openxmlformats.org/drawingml/2006/picture">
+                <pic:pic xmlns:pic="http://schemas.openxmlformats.org/drawingml/2006/picture">
+                  <pic:nvPicPr>
+                    <pic:cNvPr id="0" name="dash1.png"/>
+                    <pic:cNvPicPr/>
+                  </pic:nvPicPr>
+                  <pic:blipFill>
+                    <a:blip r:embed="rIdF3"/>
+                    <a:stretch>
+                      <a:fillRect/>
+                    </a:stretch>
+                  </pic:blipFill>
+                  <pic:spPr>
+                    <a:xfrm>
+                      <a:off x="0" y="0"/>
+                      <a:ext cx="5760720" cy="3240405"/>
+                    </a:xfrm>
+                    <a:prstGeom prst="rect">
+                      <a:avLst/>
+                    </a:prstGeom>
+                  </pic:spPr>
+                </pic:pic>
+              </a:graphicData>
+            </a:graphic>
+          </wp:inline>
+        </w:drawing>
+      </w:r>
+    </w:p>
+    <w:p>
+      <w:pPr>
+        <w:spacing w:after="240" w:line="240" w:lineRule="auto"/>
+        <w:ind w:firstLine="0"/>
+        <w:jc w:val="left"/>
+      </w:pPr>
+      <w:r>
+        <w:rPr>
+          <w:i/>
+          <w:iCs/>
+          <w:sz w:val="22"/>
+          <w:szCs w:val="22"/>
+        </w:rPr>
+        <w:t xml:space="preserve">Nguồn: Nhóm tác giả, dựng lại từ bố cục, màu sắc, trường dữ liệu của trang “1. Tổng quan” trong file mon.pbix (bộ lọc ở trạng thái Tất cả).</w:t>
+      </w:r>
+    </w:p>
+    <w:p>
+      <w:pPr>
+        <w:keepNext/>
+        <w:keepLines/>
+        <w:spacing w:after="120" w:line="240" w:lineRule="auto"/>
+        <w:ind w:firstLine="0"/>
+        <w:jc w:val="center"/>
+      </w:pPr>
+      <w:r>
+        <w:rPr>
+          <w:b/>
+          <w:bCs/>
+          <w:sz w:val="24"/>
+          <w:szCs w:val="24"/>
+        </w:rPr>
+        <w:t xml:space="preserve">Hình 4.2.</w:t>
+      </w:r>
+      <w:r>
+        <w:rPr>
+          <w:sz w:val="24"/>
+          <w:szCs w:val="24"/>
+        </w:rPr>
+        <w:t xml:space="preserve"> Trang 2 - Chân dung khách hàng</w:t>
+      </w:r>
+    </w:p>
+    <w:p>
+      <w:pPr>
+        <w:keepNext/>
+        <w:spacing w:after="120" w:line="240" w:lineRule="auto"/>
+        <w:ind w:firstLine="0"/>
+        <w:jc w:val="center"/>
+      </w:pPr>
+      <w:r>
+        <w:rPr>
+          <w:noProof/>
+        </w:rPr>
+        <w:drawing>
+          <wp:inline distT="0" distB="0" distL="0" distR="0">
+            <wp:extent cx="5760720" cy="3240405"/>
+            <wp:effectExtent l="0" t="0" r="0" b="0"/>
+            <wp:docPr id="104" name="Picture 104"/>
+            <wp:cNvGraphicFramePr>
+              <a:graphicFrameLocks xmlns:a="http://schemas.openxmlformats.org/drawingml/2006/main" noChangeAspect="1"/>
+            </wp:cNvGraphicFramePr>
+            <a:graphic xmlns:a="http://schemas.openxmlformats.org/drawingml/2006/main">
+              <a:graphicData uri="http://schemas.openxmlformats.org/drawingml/2006/picture">
+                <pic:pic xmlns:pic="http://schemas.openxmlformats.org/drawingml/2006/picture">
+                  <pic:nvPicPr>
+                    <pic:cNvPr id="0" name="dash2.png"/>
+                    <pic:cNvPicPr/>
+                  </pic:nvPicPr>
+                  <pic:blipFill>
+                    <a:blip r:embed="rIdF4"/>
+                    <a:stretch>
+                      <a:fillRect/>
+                    </a:stretch>
+                  </pic:blipFill>
+                  <pic:spPr>
+                    <a:xfrm>
+                      <a:off x="0" y="0"/>
+                      <a:ext cx="5760720" cy="3240405"/>
+                    </a:xfrm>
+                    <a:prstGeom prst="rect">
+                      <a:avLst/>
+                    </a:prstGeom>
+                  </pic:spPr>
+                </pic:pic>
+              </a:graphicData>
+            </a:graphic>
+          </wp:inline>
+        </w:drawing>
+      </w:r>
+    </w:p>
+    <w:p>
+      <w:pPr>
+        <w:spacing w:after="240" w:line="240" w:lineRule="auto"/>
+        <w:ind w:firstLine="0"/>
+        <w:jc w:val="left"/>
+      </w:pPr>
+      <w:r>
+        <w:rPr>
+          <w:i/>
+          <w:iCs/>
+          <w:sz w:val="22"/>
+          <w:szCs w:val="22"/>
+        </w:rPr>
+        <w:t xml:space="preserve">Nguồn: Nhóm tác giả, dựng lại từ bố cục, màu sắc, trường dữ liệu của trang “2. Chân dung khách hàng” trong file mon.pbix (bộ lọc ở trạng thái Tất cả).</w:t>
+      </w:r>
+    </w:p>
+    <w:p>
+      <w:pPr>
+        <w:keepNext/>
+        <w:keepLines/>
+        <w:spacing w:after="120" w:line="240" w:lineRule="auto"/>
+        <w:ind w:firstLine="0"/>
+        <w:jc w:val="center"/>
+      </w:pPr>
+      <w:r>
+        <w:rPr>
+          <w:b/>
+          <w:bCs/>
+          <w:sz w:val="24"/>
+          <w:szCs w:val="24"/>
+        </w:rPr>
+        <w:t xml:space="preserve">Hình 4.3.</w:t>
+      </w:r>
+      <w:r>
+        <w:rPr>
+          <w:sz w:val="24"/>
+          <w:szCs w:val="24"/>
+        </w:rPr>
+        <w:t xml:space="preserve"> Trang 3 - Sản phẩm và kênh bán</w:t>
+      </w:r>
+    </w:p>
+    <w:p>
+      <w:pPr>
+        <w:keepNext/>
+        <w:spacing w:after="120" w:line="240" w:lineRule="auto"/>
+        <w:ind w:firstLine="0"/>
+        <w:jc w:val="center"/>
+      </w:pPr>
+      <w:r>
+        <w:rPr>
+          <w:noProof/>
+        </w:rPr>
+        <w:drawing>
+          <wp:inline distT="0" distB="0" distL="0" distR="0">
+            <wp:extent cx="5760720" cy="3240405"/>
+            <wp:effectExtent l="0" t="0" r="0" b="0"/>
+            <wp:docPr id="105" name="Picture 105"/>
+            <wp:cNvGraphicFramePr>
+              <a:graphicFrameLocks xmlns:a="http://schemas.openxmlformats.org/drawingml/2006/main" noChangeAspect="1"/>
+            </wp:cNvGraphicFramePr>
+            <a:graphic xmlns:a="http://schemas.openxmlformats.org/drawingml/2006/main">
+              <a:graphicData uri="http://schemas.openxmlformats.org/drawingml/2006/picture">
+                <pic:pic xmlns:pic="http://schemas.openxmlformats.org/drawingml/2006/picture">
+                  <pic:nvPicPr>
+                    <pic:cNvPr id="0" name="dash3.png"/>
+                    <pic:cNvPicPr/>
+                  </pic:nvPicPr>
+                  <pic:blipFill>
+                    <a:blip r:embed="rIdF5"/>
+                    <a:stretch>
+                      <a:fillRect/>
+                    </a:stretch>
+                  </pic:blipFill>
+                  <pic:spPr>
+                    <a:xfrm>
+                      <a:off x="0" y="0"/>
+                      <a:ext cx="5760720" cy="3240405"/>
+                    </a:xfrm>
+                    <a:prstGeom prst="rect">
+                      <a:avLst/>
+                    </a:prstGeom>
+                  </pic:spPr>
+                </pic:pic>
+              </a:graphicData>
+            </a:graphic>
+          </wp:inline>
+        </w:drawing>
+      </w:r>
+    </w:p>
+    <w:p>
+      <w:pPr>
+        <w:spacing w:after="240" w:line="240" w:lineRule="auto"/>
+        <w:ind w:firstLine="0"/>
+        <w:jc w:val="left"/>
+      </w:pPr>
+      <w:r>
+        <w:rPr>
+          <w:i/>
+          <w:iCs/>
+          <w:sz w:val="22"/>
+          <w:szCs w:val="22"/>
+        </w:rPr>
+        <w:t xml:space="preserve">Nguồn: Nhóm tác giả, dựng lại từ bố cục, màu sắc, trường dữ liệu của trang “3. Sản phẩm &amp; kênh” trong file mon.pbix (bộ lọc ở trạng thái Tất cả).</w:t>
+      </w:r>
+    </w:p>
+    <w:p>
+      <w:pPr>
+        <w:keepNext/>
+        <w:keepLines/>
+        <w:spacing w:after="120" w:line="240" w:lineRule="auto"/>
+        <w:ind w:firstLine="0"/>
+        <w:jc w:val="center"/>
+      </w:pPr>
+      <w:r>
+        <w:rPr>
+          <w:b/>
+          <w:bCs/>
+          <w:sz w:val="24"/>
+          <w:szCs w:val="24"/>
+        </w:rPr>
+        <w:t xml:space="preserve">Hình 4.4.</w:t>
+      </w:r>
+      <w:r>
+        <w:rPr>
+          <w:sz w:val="24"/>
+          <w:szCs w:val="24"/>
+        </w:rPr>
+        <w:t xml:space="preserve"> Trang 4 - Hiệu quả chiến dịch</w:t>
+      </w:r>
+    </w:p>
+    <w:p>
+      <w:pPr>
+        <w:keepNext/>
+        <w:spacing w:after="120" w:line="240" w:lineRule="auto"/>
+        <w:ind w:firstLine="0"/>
+        <w:jc w:val="center"/>
+      </w:pPr>
+      <w:r>
+        <w:rPr>
+          <w:noProof/>
+        </w:rPr>
+        <w:drawing>
+          <wp:inline distT="0" distB="0" distL="0" distR="0">
+            <wp:extent cx="5760720" cy="3240405"/>
+            <wp:effectExtent l="0" t="0" r="0" b="0"/>
+            <wp:docPr id="106" name="Picture 106"/>
+            <wp:cNvGraphicFramePr>
+              <a:graphicFrameLocks xmlns:a="http://schemas.openxmlformats.org/drawingml/2006/main" noChangeAspect="1"/>
+            </wp:cNvGraphicFramePr>
+            <a:graphic xmlns:a="http://schemas.openxmlformats.org/drawingml/2006/main">
+              <a:graphicData uri="http://schemas.openxmlformats.org/drawingml/2006/picture">
+                <pic:pic xmlns:pic="http://schemas.openxmlformats.org/drawingml/2006/picture">
+                  <pic:nvPicPr>
+                    <pic:cNvPr id="0" name="dash4.png"/>
+                    <pic:cNvPicPr/>
+                  </pic:nvPicPr>
+                  <pic:blipFill>
+                    <a:blip r:embed="rIdF6"/>
+                    <a:stretch>
+                      <a:fillRect/>
+                    </a:stretch>
+                  </pic:blipFill>
+                  <pic:spPr>
+                    <a:xfrm>
+                      <a:off x="0" y="0"/>
+                      <a:ext cx="5760720" cy="3240405"/>
+                    </a:xfrm>
+                    <a:prstGeom prst="rect">
+                      <a:avLst/>
+                    </a:prstGeom>
+                  </pic:spPr>
+                </pic:pic>
+              </a:graphicData>
+            </a:graphic>
+          </wp:inline>
+        </w:drawing>
+      </w:r>
+    </w:p>
+    <w:p>
+      <w:pPr>
+        <w:spacing w:after="240" w:line="240" w:lineRule="auto"/>
+        <w:ind w:firstLine="0"/>
+        <w:jc w:val="left"/>
+      </w:pPr>
+      <w:r>
+        <w:rPr>
+          <w:i/>
+          <w:iCs/>
+          <w:sz w:val="22"/>
+          <w:szCs w:val="22"/>
+        </w:rPr>
+        <w:t xml:space="preserve">Nguồn: Nhóm tác giả, dựng lại từ bố cục, màu sắc, trường dữ liệu của trang “4. Hiệu quả chiến dịch” trong file mon.pbix (bộ lọc ở trạng thái Tất cả).</w:t>
+      </w:r>
+    </w:p>
+    <w:p>
+      <w:pPr>
+        <w:keepNext/>
+        <w:keepLines/>
+        <w:spacing w:after="120" w:line="240" w:lineRule="auto"/>
+        <w:ind w:firstLine="0"/>
+        <w:jc w:val="center"/>
+      </w:pPr>
+      <w:r>
+        <w:rPr>
+          <w:b/>
+          <w:bCs/>
+          <w:sz w:val="24"/>
+          <w:szCs w:val="24"/>
+        </w:rPr>
+        <w:t xml:space="preserve">Hình 4.5.</w:t>
+      </w:r>
+      <w:r>
+        <w:rPr>
+          <w:sz w:val="24"/>
+          <w:szCs w:val="24"/>
+        </w:rPr>
+        <w:t xml:space="preserve"> Trang 5 - Phân khúc RFM và giữ chân khách hàng</w:t>
+      </w:r>
+    </w:p>
+    <w:p>
+      <w:pPr>
+        <w:keepNext/>
+        <w:spacing w:after="120" w:line="240" w:lineRule="auto"/>
+        <w:ind w:firstLine="0"/>
+        <w:jc w:val="center"/>
+      </w:pPr>
+      <w:r>
+        <w:rPr>
+          <w:noProof/>
+        </w:rPr>
+        <w:drawing>
+          <wp:inline distT="0" distB="0" distL="0" distR="0">
+            <wp:extent cx="5760720" cy="3240405"/>
+            <wp:effectExtent l="0" t="0" r="0" b="0"/>
+            <wp:docPr id="107" name="Picture 107"/>
+            <wp:cNvGraphicFramePr>
+              <a:graphicFrameLocks xmlns:a="http://schemas.openxmlformats.org/drawingml/2006/main" noChangeAspect="1"/>
+            </wp:cNvGraphicFramePr>
+            <a:graphic xmlns:a="http://schemas.openxmlformats.org/drawingml/2006/main">
+              <a:graphicData uri="http://schemas.openxmlformats.org/drawingml/2006/picture">
+                <pic:pic xmlns:pic="http://schemas.openxmlformats.org/drawingml/2006/picture">
+                  <pic:nvPicPr>
+                    <pic:cNvPr id="0" name="dash5.png"/>
+                    <pic:cNvPicPr/>
+                  </pic:nvPicPr>
+                  <pic:blipFill>
+                    <a:blip r:embed="rIdF7"/>
+                    <a:stretch>
+                      <a:fillRect/>
+                    </a:stretch>
+                  </pic:blipFill>
+                  <pic:spPr>
+                    <a:xfrm>
+                      <a:off x="0" y="0"/>
+                      <a:ext cx="5760720" cy="3240405"/>
+                    </a:xfrm>
+                    <a:prstGeom prst="rect">
+                      <a:avLst/>
+                    </a:prstGeom>
+                  </pic:spPr>
+                </pic:pic>
+              </a:graphicData>
+            </a:graphic>
+          </wp:inline>
+        </w:drawing>
+      </w:r>
+    </w:p>
+    <w:p>
+      <w:pPr>
+        <w:spacing w:after="240" w:line="240" w:lineRule="auto"/>
+        <w:ind w:firstLine="0"/>
+        <w:jc w:val="left"/>
+      </w:pPr>
+      <w:r>
+        <w:rPr>
+          <w:i/>
+          <w:iCs/>
+          <w:sz w:val="22"/>
+          <w:szCs w:val="22"/>
+        </w:rPr>
+        <w:t xml:space="preserve">Nguồn: Nhóm tác giả, dựng lại từ bố cục, màu sắc, trường dữ liệu của trang “5. RFM &amp; giữ chân” trong file mon.pbix (bộ lọc ở trạng thái Tất cả).</w:t>
+      </w:r>
+    </w:p>
+    <w:p>
+      <w:pPr>
         <w:pStyle w:val="Heading1"/>
         <w:pageBreakBefore/>
         <w:spacing w:after="240" w:line="240" w:lineRule="auto"/>
@@ -8793,9 +9324,9 @@
         </w:rPr>
         <w:drawing>
           <wp:inline distT="0" distB="0" distL="0" distR="0">
-            <wp:extent cx="4754880" cy="2085473"/>
+            <wp:extent cx="4480560" cy="1965157"/>
             <wp:effectExtent l="0" t="0" r="0" b="0"/>
-            <wp:docPr id="103" name="Picture 103"/>
+            <wp:docPr id="108" name="Picture 108"/>
             <wp:cNvGraphicFramePr>
               <a:graphicFrameLocks xmlns:a="http://schemas.openxmlformats.org/drawingml/2006/main" noChangeAspect="1"/>
             </wp:cNvGraphicFramePr>
@@ -8807,7 +9338,7 @@
                     <pic:cNvPicPr/>
                   </pic:nvPicPr>
                   <pic:blipFill>
-                    <a:blip r:embed="rIdF3"/>
+                    <a:blip r:embed="rIdF8"/>
                     <a:stretch>
                       <a:fillRect/>
                     </a:stretch>
@@ -8815,7 +9346,7 @@
                   <pic:spPr>
                     <a:xfrm>
                       <a:off x="0" y="0"/>
-                      <a:ext cx="4754880" cy="2085473"/>
+                      <a:ext cx="4480560" cy="1965157"/>
                     </a:xfrm>
                     <a:prstGeom prst="rect">
                       <a:avLst/>
@@ -9035,7 +9566,7 @@
                 <w:sz w:val="22"/>
                 <w:szCs w:val="22"/>
               </w:rPr>
-              <w:t xml:space="preserve">Đơn giảm giá</w:t>
+              <w:t xml:space="preserve">Đơn giảm giá (TB theo khách)</w:t>
             </w:r>
           </w:p>
         </w:tc>
@@ -9058,7 +9589,7 @@
                 <w:sz w:val="22"/>
                 <w:szCs w:val="22"/>
               </w:rPr>
-              <w:t xml:space="preserve">Đơn qua catalog</w:t>
+              <w:t xml:space="preserve">Đơn qua catalog (trên tổng đơn)</w:t>
             </w:r>
           </w:p>
         </w:tc>
@@ -10010,9 +10541,9 @@
         </w:rPr>
         <w:drawing>
           <wp:inline distT="0" distB="0" distL="0" distR="0">
-            <wp:extent cx="4572000" cy="1684421"/>
+            <wp:extent cx="4389120" cy="1617044"/>
             <wp:effectExtent l="0" t="0" r="0" b="0"/>
-            <wp:docPr id="104" name="Picture 104"/>
+            <wp:docPr id="109" name="Picture 109"/>
             <wp:cNvGraphicFramePr>
               <a:graphicFrameLocks xmlns:a="http://schemas.openxmlformats.org/drawingml/2006/main" noChangeAspect="1"/>
             </wp:cNvGraphicFramePr>
@@ -10024,7 +10555,7 @@
                     <pic:cNvPicPr/>
                   </pic:nvPicPr>
                   <pic:blipFill>
-                    <a:blip r:embed="rIdF4"/>
+                    <a:blip r:embed="rIdF9"/>
                     <a:stretch>
                       <a:fillRect/>
                     </a:stretch>
@@ -10032,7 +10563,7 @@
                   <pic:spPr>
                     <a:xfrm>
                       <a:off x="0" y="0"/>
-                      <a:ext cx="4572000" cy="1684421"/>
+                      <a:ext cx="4389120" cy="1617044"/>
                     </a:xfrm>
                     <a:prstGeom prst="rect">
                       <a:avLst/>
@@ -10846,7 +11377,7 @@
         <w:spacing w:after="240" w:line="240" w:lineRule="auto"/>
       </w:pPr>
       <w:r>
-        <w:t xml:space="preserve">Cửa hàng vẫn là kênh chính (46,4% số đơn), web chiếm 32,6% và catalog 21,0%. Khách ưa catalog chỉ chiếm 6,9% nhưng tạo 15,2% doanh thu nhờ AOV trung vị 68,3 $, gấp ba lần khách ưa cửa hàng. Ngoài ra 18,3% tổng số đơn có dùng giảm giá; khách săn giảm giá (≥ 40% đơn) chiếm 22,1% số khách nhưng chỉ tạo 6,2% doanh thu.</w:t>
+        <w:t xml:space="preserve">Cửa hàng vẫn là kênh chính (46,4% số đơn), web chiếm 32,6% và catalog 21,0%. Khách ưa catalog chỉ chiếm 6,9% nhưng tạo 15,2% doanh thu nhờ giá trị đơn cao: AOV trung vị theo khách là 68,3 $, gấp 3,0 lần khách ưa cửa hàng (22,5 $) và 2,5 lần khách ưa web (26,9 $); nếu tính như measure AOV trên dashboard, mức chênh nhỏ hơn (69,3 $ so với 43,7 $ và 39,2 $). Phần lớn khoảng cách đến từ thu nhập: khách ưa catalog có thu nhập TB 72.055 $, và trong cùng nhóm thu nhập 70-90K, AOV trung vị của ba kênh gần như bằng nhau (67,4-68,8 $). Tính trên tổng số đơn, 18,3% đơn hàng có dùng giảm giá (trung bình theo từng khách là 24,1%, cách tính dùng ở Bảng 2.2 và 5.1); khách săn giảm giá (≥ 40% đơn) chiếm 22,1% số khách nhưng chỉ tạo 6,2% doanh thu.</w:t>
       </w:r>
     </w:p>
     <w:p>
@@ -10854,7 +11385,7 @@
         <w:spacing w:after="240" w:line="240" w:lineRule="auto"/>
       </w:pPr>
       <w:r>
-        <w:t xml:space="preserve">Hành vi web cho thấy một nghịch lý: 735 khách truy cập web từ 7 lần/tháng trở lên (36,9% số khách) chỉ chi tiêu TB 290 $, so với 726 $ ở nhóm truy cập ít, và chỉ tạo 19,0% doanh thu. Nhóm truy cập nhiều có thu nhập trung vị thấp hơn (37.716 $ so với 62.307 $) và dùng giảm giá nhiều hơn (33,5% so với 18,6% số đơn). Truy cập nhiều là dấu hiệu của khách đang “dạo” tìm ưu đãi, không phải khách giá trị cao.</w:t>
+        <w:t xml:space="preserve">Hành vi web cho thấy một nghịch lý: 735 khách truy cập web từ 7 lần/tháng trở lên (36,9% số khách) chỉ chi tiêu TB 290 $, so với 726 $ ở nhóm truy cập ít, và chỉ tạo 19,0% doanh thu. Nhóm truy cập nhiều có thu nhập trung vị thấp hơn (37.716 $ so với 62.307 $) và dùng giảm giá nhiều hơn (30,7% so với 13,6% tổng số đơn, như measure Tỷ lệ mua giảm giá trên Hình 4.3). Truy cập nhiều là dấu hiệu của khách đang “dạo” tìm ưu đãi, không phải khách giá trị cao.</w:t>
       </w:r>
     </w:p>
     <w:p>
@@ -10913,9 +11444,9 @@
         </w:rPr>
         <w:drawing>
           <wp:inline distT="0" distB="0" distL="0" distR="0">
-            <wp:extent cx="4572000" cy="1925052"/>
+            <wp:extent cx="4389120" cy="1848050"/>
             <wp:effectExtent l="0" t="0" r="0" b="0"/>
-            <wp:docPr id="105" name="Picture 105"/>
+            <wp:docPr id="110" name="Picture 110"/>
             <wp:cNvGraphicFramePr>
               <a:graphicFrameLocks xmlns:a="http://schemas.openxmlformats.org/drawingml/2006/main" noChangeAspect="1"/>
             </wp:cNvGraphicFramePr>
@@ -10927,7 +11458,7 @@
                     <pic:cNvPicPr/>
                   </pic:nvPicPr>
                   <pic:blipFill>
-                    <a:blip r:embed="rIdF5"/>
+                    <a:blip r:embed="rIdF10"/>
                     <a:stretch>
                       <a:fillRect/>
                     </a:stretch>
@@ -10935,7 +11466,7 @@
                   <pic:spPr>
                     <a:xfrm>
                       <a:off x="0" y="0"/>
-                      <a:ext cx="4572000" cy="1925052"/>
+                      <a:ext cx="4389120" cy="1848050"/>
                     </a:xfrm>
                     <a:prstGeom prst="rect">
                       <a:avLst/>
@@ -10969,7 +11500,90 @@
         <w:spacing w:after="240" w:line="240" w:lineRule="auto"/>
       </w:pPr>
       <w:r>
-        <w:t xml:space="preserve">Chiến dịch 2 gần như thất bại với 1,3% (26 khách). Chiến dịch 1 và 5 đạt 6,6-7,3% nhưng người chấp nhận có thu nhập TB 78.800-82.400 $ và 83-90% không có con, tức là gần như chỉ chạm tới nhóm khách vốn đã chi tiêu nhiều. Chiến dịch 3 là chiến dịch duy nhất tiếp cận được khách đại trà: thu nhập TB người nhận chỉ 51.000 $ và 45% có con.</w:t>
+        <w:t xml:space="preserve">Tỷ lệ chấp nhận của năm chiến dịch lần lượt là 6,6% (CD1), 1,3% (CD2), 7,4% (CD3), 7,6% (CD4) và 7,3% (CD5). CD2 gần như thất bại với 26 khách. Bốn chiến dịch còn lại chạm tới những nhóm khách rất khác nhau:</w:t>
+      </w:r>
+    </w:p>
+    <w:p>
+      <w:pPr>
+        <w:tabs>
+          <w:tab w:val="left" w:pos="1080"/>
+        </w:tabs>
+        <w:spacing w:after="120" w:line="240" w:lineRule="auto"/>
+        <w:ind w:left="1080" w:hanging="360"/>
+      </w:pPr>
+      <w:r>
+        <w:t xml:space="preserve">•</w:t>
+      </w:r>
+      <w:r>
+        <w:tab/>
+      </w:r>
+      <w:r>
+        <w:rPr>
+          <w:b/>
+          <w:bCs/>
+        </w:rPr>
+        <w:t xml:space="preserve">CD1 và CD5 - khách giàu, không có con:</w:t>
+      </w:r>
+      <w:r>
+        <w:t xml:space="preserve"> người chấp nhận có thu nhập TB 78.800-82.400 $, 83-90% không có con và 73-82% thuộc nhóm giá trị High.</w:t>
+      </w:r>
+    </w:p>
+    <w:p>
+      <w:pPr>
+        <w:tabs>
+          <w:tab w:val="left" w:pos="1080"/>
+        </w:tabs>
+        <w:spacing w:after="120" w:line="240" w:lineRule="auto"/>
+        <w:ind w:left="1080" w:hanging="360"/>
+      </w:pPr>
+      <w:r>
+        <w:t xml:space="preserve">•</w:t>
+      </w:r>
+      <w:r>
+        <w:tab/>
+      </w:r>
+      <w:r>
+        <w:rPr>
+          <w:b/>
+          <w:bCs/>
+        </w:rPr>
+        <w:t xml:space="preserve">CD4 - khách khá giả có con tuổi teen:</w:t>
+      </w:r>
+      <w:r>
+        <w:t xml:space="preserve"> tỷ lệ chấp nhận cao nhất nhưng tăng mạnh theo thu nhập: 0% ở nhóm dưới 30K, 2,8% ở 30-50K, 11,5-12,6% ở 50-90K và 35,7% ở 90K+. Người nhận có thu nhập TB 68.200 $, 42% có con (chủ yếu con tuổi teen, 38%) và dành 68,6% chi tiêu cho rượu vang.</w:t>
+      </w:r>
+    </w:p>
+    <w:p>
+      <w:pPr>
+        <w:tabs>
+          <w:tab w:val="left" w:pos="1080"/>
+        </w:tabs>
+        <w:spacing w:after="240" w:line="240" w:lineRule="auto"/>
+        <w:ind w:left="1080" w:hanging="360"/>
+      </w:pPr>
+      <w:r>
+        <w:t xml:space="preserve">•</w:t>
+      </w:r>
+      <w:r>
+        <w:tab/>
+      </w:r>
+      <w:r>
+        <w:rPr>
+          <w:b/>
+          <w:bCs/>
+        </w:rPr>
+        <w:t xml:space="preserve">CD3 - khách đại trà:</w:t>
+      </w:r>
+      <w:r>
+        <w:t xml:space="preserve"> tỷ lệ chấp nhận gần như đều giữa các nhóm thu nhập (5,2-9,5%) và giữa hộ có con, không con (7,0% và 7,7%). Người nhận có thu nhập TB thấp nhất (51.000 $), 31% có con nhỏ, và 79,6% trong số họ chưa từng chấp nhận chiến dịch nào khác.</w:t>
+      </w:r>
+    </w:p>
+    <w:p>
+      <w:pPr>
+        <w:spacing w:after="240" w:line="240" w:lineRule="auto"/>
+      </w:pPr>
+      <w:r>
+        <w:t xml:space="preserve">Không khách nào chấp nhận cả CD3 và CD4, nên hai chiến dịch này thực sự mở rộng tệp khách phản hồi theo hai hướng khác nhau, thay vì lặp lại nhóm khách giàu của CD1 và CD5.</w:t>
       </w:r>
     </w:p>
     <w:p>
@@ -12252,109 +12866,20 @@
     </w:p>
     <w:p>
       <w:pPr>
-        <w:keepNext/>
-        <w:keepLines/>
-        <w:spacing w:after="120" w:line="240" w:lineRule="auto"/>
-        <w:ind w:firstLine="0"/>
-        <w:jc w:val="center"/>
-      </w:pPr>
+        <w:spacing w:after="240" w:line="240" w:lineRule="auto"/>
+      </w:pPr>
+      <w:r>
+        <w:t xml:space="preserve">Nhóm At Risk là phân khúc lớn nhất cả về số khách (480) lẫn doanh thu (446.346 $, 39,6%): đây là những khách từng chi tiêu cao (TB 930 $) nhưng đã 79 ngày chưa quay lại. Trong đó có </w:t>
+      </w:r>
       <w:r>
         <w:rPr>
           <w:b/>
           <w:bCs/>
-          <w:sz w:val="24"/>
-          <w:szCs w:val="24"/>
-        </w:rPr>
-        <w:t xml:space="preserve">Hình 5.4.</w:t>
-      </w:r>
-      <w:r>
-        <w:rPr>
-          <w:sz w:val="24"/>
-          <w:szCs w:val="24"/>
-        </w:rPr>
-        <w:t xml:space="preserve"> Tỷ trọng khách hàng và doanh thu theo phân khúc RFM</w:t>
-      </w:r>
-    </w:p>
-    <w:p>
-      <w:pPr>
-        <w:keepNext/>
-        <w:spacing w:after="120" w:line="240" w:lineRule="auto"/>
-        <w:ind w:firstLine="0"/>
-        <w:jc w:val="center"/>
-      </w:pPr>
-      <w:r>
-        <w:rPr>
-          <w:noProof/>
-        </w:rPr>
-        <w:drawing>
-          <wp:inline distT="0" distB="0" distL="0" distR="0">
-            <wp:extent cx="4572000" cy="1965157"/>
-            <wp:effectExtent l="0" t="0" r="0" b="0"/>
-            <wp:docPr id="106" name="Picture 106"/>
-            <wp:cNvGraphicFramePr>
-              <a:graphicFrameLocks xmlns:a="http://schemas.openxmlformats.org/drawingml/2006/main" noChangeAspect="1"/>
-            </wp:cNvGraphicFramePr>
-            <a:graphic xmlns:a="http://schemas.openxmlformats.org/drawingml/2006/main">
-              <a:graphicData uri="http://schemas.openxmlformats.org/drawingml/2006/picture">
-                <pic:pic xmlns:pic="http://schemas.openxmlformats.org/drawingml/2006/picture">
-                  <pic:nvPicPr>
-                    <pic:cNvPr id="0" name="fig54.png"/>
-                    <pic:cNvPicPr/>
-                  </pic:nvPicPr>
-                  <pic:blipFill>
-                    <a:blip r:embed="rIdF6"/>
-                    <a:stretch>
-                      <a:fillRect/>
-                    </a:stretch>
-                  </pic:blipFill>
-                  <pic:spPr>
-                    <a:xfrm>
-                      <a:off x="0" y="0"/>
-                      <a:ext cx="4572000" cy="1965157"/>
-                    </a:xfrm>
-                    <a:prstGeom prst="rect">
-                      <a:avLst/>
-                    </a:prstGeom>
-                  </pic:spPr>
-                </pic:pic>
-              </a:graphicData>
-            </a:graphic>
-          </wp:inline>
-        </w:drawing>
-      </w:r>
-    </w:p>
-    <w:p>
-      <w:pPr>
-        <w:spacing w:after="240" w:line="240" w:lineRule="auto"/>
-        <w:ind w:firstLine="0"/>
-        <w:jc w:val="left"/>
-      </w:pPr>
-      <w:r>
-        <w:rPr>
-          <w:i/>
-          <w:iCs/>
-          <w:sz w:val="22"/>
-          <w:szCs w:val="22"/>
-        </w:rPr>
-        <w:t xml:space="preserve">Nguồn: Nhóm tác giả tính toán từ dữ liệu 05_FoodAppBusiness.</w:t>
-      </w:r>
-    </w:p>
-    <w:p>
-      <w:pPr>
-        <w:spacing w:after="240" w:line="240" w:lineRule="auto"/>
-      </w:pPr>
-      <w:r>
-        <w:t xml:space="preserve">Nhóm At Risk là phân khúc lớn nhất cả về số khách (480) lẫn doanh thu (446.346 $, 39,6%): đây là những khách từng chi tiêu cao (TB 930 $) nhưng đã 79 ngày chưa quay lại. Trong đó có </w:t>
-      </w:r>
-      <w:r>
-        <w:rPr>
-          <w:b/>
-          <w:bCs/>
         </w:rPr>
         <w:t xml:space="preserve">166 khách VIP</w:t>
       </w:r>
       <w:r>
-        <w:t xml:space="preserve"> (nhóm giá trị High) nắm 252.404 $, tức 22,4% tổng doanh thu; 50% trong số họ từng phản hồi chiến dịch, nên vẫn còn kênh để tiếp cận. Champions và Loyal Customers giữ thêm 56,2% doanh thu. Ba phân khúc giá trị thấp (New / Promising, Need Attention, Hibernating) chiếm 40,4% số khách nhưng chỉ 4,2% doanh thu.</w:t>
+        <w:t xml:space="preserve"> (nhóm giá trị High) nắm 252.404 $ chi tiêu lịch sử, tức 22,4% tổng chi tiêu cộng dồn; 50% trong số họ từng phản hồi chiến dịch, nên vẫn còn kênh để tiếp cận. Champions và Loyal Customers giữ thêm 56,2% doanh thu. Ba phân khúc giá trị thấp (New / Promising, Need Attention, Hibernating) chiếm 40,4% số khách nhưng chỉ 4,2% doanh thu (biểu đồ % khách và % doanh thu theo phân khúc ở Hình 4.5).</w:t>
       </w:r>
     </w:p>
     <w:p>
@@ -12374,7 +12899,7 @@
         <w:spacing w:after="240" w:line="240" w:lineRule="auto"/>
       </w:pPr>
       <w:r>
-        <w:t xml:space="preserve">Sau khi kiểm soát đồng thời nhiều biến, thu nhập vẫn là yếu tố mạnh nhất cho cả chi tiêu lẫn phản hồi chiến dịch, còn con nhỏ, con tuổi teen và thói quen săn giảm giá kéo chi tiêu xuống. Bảy trên tám giả thuyết được chấp nhận toàn phần hoặc một phần. Phân tích thực hiện bằng Python (pandas, SciPy, statsmodels, scikit-learn) trên cùng bảng Customers đã nạp vào Power BI, mức ý nghĩa α = 0,05.</w:t>
+        <w:t xml:space="preserve">Sau khi kiểm soát đồng thời nhiều biến, thu nhập vẫn là yếu tố mạnh nhất cho cả chi tiêu lẫn phản hồi chiến dịch, còn con nhỏ, con tuổi teen và thói quen săn giảm giá kéo chi tiêu xuống. Năm giả thuyết được chấp nhận (H1, H2, H5, H6, H7), ba giả thuyết được chấp nhận một phần (H3, H4, H8) và không giả thuyết nào bị bác bỏ hoàn toàn. Phân tích thực hiện bằng Python (pandas, SciPy, statsmodels, scikit-learn) trên cùng bảng Customers đã nạp vào Power BI, mức ý nghĩa α = 0,05.</w:t>
       </w:r>
     </w:p>
     <w:p>
@@ -12442,7 +12967,7 @@
         <w:t xml:space="preserve">Hồi quy tuyến tính (OLS) cho chi tiêu.</w:t>
       </w:r>
       <w:r>
-        <w:t xml:space="preserve"> Biến phụ thuộc là log tổng chi tiêu để giảm độ lệch (độ lệch giảm từ 0,91 xuống -0,37); sai số chuẩn vững HC3. Hệ số của log thu nhập là hệ số co giãn; với biến khác, e^β - 1 là % thay đổi chi tiêu.</w:t>
+        <w:t xml:space="preserve"> Biến phụ thuộc là log tổng chi tiêu để giảm độ lệch (độ lệch giảm từ 0,91 xuống -0,37); sai số chuẩn vững HC3. Hệ số của log thu nhập là hệ số co giãn; với biến khác, e^β - 1 là % thay đổi chi tiêu. Một mô hình OLS phụ với biến phụ thuộc ln(AOV) được dùng để kiểm định H4.</w:t>
       </w:r>
     </w:p>
     <w:p>
@@ -13556,7 +14081,7 @@
                 <w:sz w:val="22"/>
                 <w:szCs w:val="22"/>
               </w:rPr>
-              <w:t xml:space="preserve">Logistic: ưa catalog OR = 1,48 (p = 0,061)</w:t>
+              <w:t xml:space="preserve">OLS ln(AOV), kiểm soát thu nhập, số con, tỷ lệ giảm giá: ưa catalog +46% so với Store (p &lt; 0,001) nhưng chỉ +7% so với Web (p = 0,12)</w:t>
             </w:r>
           </w:p>
         </w:tc>
@@ -13576,7 +14101,7 @@
                 <w:sz w:val="22"/>
                 <w:szCs w:val="22"/>
               </w:rPr>
-              <w:t xml:space="preserve">Chấp nhận với AOV</w:t>
+              <w:t xml:space="preserve">Chấp nhận một phần: AOV cao hơn cửa hàng, nhưng phần lớn mức chênh thô gấp 3 lần là do thu nhập</w:t>
             </w:r>
           </w:p>
         </w:tc>
@@ -13920,7 +14445,7 @@
                 <w:sz w:val="22"/>
                 <w:szCs w:val="22"/>
               </w:rPr>
-              <w:t xml:space="preserve">Chấp nhận cho tuổi, học vấn; bác bỏ cho hôn nhân</w:t>
+              <w:t xml:space="preserve">Chấp nhận một phần: đúng với tuổi, học vấn; không đúng với hôn nhân</w:t>
             </w:r>
           </w:p>
         </w:tc>
@@ -13947,7 +14472,17 @@
         <w:spacing w:after="240" w:line="240" w:lineRule="auto"/>
       </w:pPr>
       <w:r>
-        <w:t xml:space="preserve">Hai kết quả đáng chú ý. Thứ nhất, tuổi và học vấn có tương quan với chi tiêu khi xét riêng, nhưng mất ý nghĩa khi đã kiểm soát thu nhập: người lớn tuổi và tốt nghiệp đại học chi nhiều hơn chỉ vì họ có thu nhập cao hơn. Thứ hai, hôn nhân lại đi theo chiều ngược: xét riêng thì không khác biệt, nhưng khi so sánh hai hộ cùng thu nhập và cùng số con, hộ đã kết hôn chi tiêu nhiều hơn 45%. Lý do là hộ đã kết hôn thường có nhiều con hơn, nên hiệu ứng “con cái” che mất hiệu ứng “hôn nhân” khi chưa kiểm soát.</w:t>
+        <w:t xml:space="preserve">Hai kết quả đáng chú ý. Thứ nhất, tuổi và học vấn có tương quan với chi tiêu khi xét riêng, nhưng mất ý nghĩa khi đã kiểm soát thu nhập: người lớn tuổi và tốt nghiệp đại học chi nhiều hơn chỉ vì họ có thu nhập cao hơn. Thứ hai, hôn nhân đi theo chiều ngược: xét riêng thì không khác biệt (555 $ so với 583 $), nhưng khi so sánh hai hộ cùng thu nhập và cùng số con, hộ đã kết hôn chi tiêu nhiều hơn 45%. Lý do nằm ở cấu trúc gia đình: khách đã kết hôn có trung bình 0,98 con và 73,9% có ít nhất một con, trong khi </w:t>
+      </w:r>
+      <w:r>
+        <w:rPr>
+          <w:b/>
+          <w:bCs/>
+        </w:rPr>
+        <w:t xml:space="preserve">không có khách độc thân nào có con</w:t>
+      </w:r>
+      <w:r>
+        <w:t xml:space="preserve"> trong dữ liệu. Vì con cái kéo chi tiêu xuống, chỉ kiểm soát thu nhập thì hệ số hôn nhân gần bằng 0 (β = -0,02; p = 0,66), còn thêm số con vào mô hình thì tăng lên 0,46 (p &lt; 0,001). So sánh trực tiếp, hộ kết hôn không có con chi tiêu TB 1.059 $, gần gấp đôi khách độc thân (583 $), dù thu nhập cũng cao hơn (65.882 $ so với 52.247 $). Do đó hiệu ứng hôn nhân thực chất được ước lượng từ so sánh giữa hộ kết hôn không con và khách độc thân.</w:t>
       </w:r>
     </w:p>
     <w:p>
@@ -14966,9 +15501,9 @@
         </w:rPr>
         <w:drawing>
           <wp:inline distT="0" distB="0" distL="0" distR="0">
-            <wp:extent cx="4206240" cy="2804160"/>
+            <wp:extent cx="3840480" cy="2560320"/>
             <wp:effectExtent l="0" t="0" r="0" b="0"/>
-            <wp:docPr id="107" name="Picture 107"/>
+            <wp:docPr id="111" name="Picture 111"/>
             <wp:cNvGraphicFramePr>
               <a:graphicFrameLocks xmlns:a="http://schemas.openxmlformats.org/drawingml/2006/main" noChangeAspect="1"/>
             </wp:cNvGraphicFramePr>
@@ -14980,7 +15515,7 @@
                     <pic:cNvPicPr/>
                   </pic:nvPicPr>
                   <pic:blipFill>
-                    <a:blip r:embed="rIdF7"/>
+                    <a:blip r:embed="rIdF11"/>
                     <a:stretch>
                       <a:fillRect/>
                     </a:stretch>
@@ -14988,7 +15523,7 @@
                   <pic:spPr>
                     <a:xfrm>
                       <a:off x="0" y="0"/>
-                      <a:ext cx="4206240" cy="2804160"/>
+                      <a:ext cx="3840480" cy="2560320"/>
                     </a:xfrm>
                     <a:prstGeom prst="rect">
                       <a:avLst/>
@@ -15512,7 +16047,7 @@
         <w:spacing w:after="240" w:line="240" w:lineRule="auto"/>
       </w:pPr>
       <w:r>
-        <w:t xml:space="preserve">AUC kiểm định chéo 5 lần là 0,761 ± 0,035, cho thấy mô hình ổn định. Mô hình “không ai phản hồi” đã đạt 79,0% accuracy, nên accuracy không phải thước đo phù hợp. Với Marketing, bỏ sót một khách sẵn sàng phản hồi tốn hơn nhiều so với gửi thừa một ưu đãi, nên nhóm đề xuất dùng ngưỡng 0,3 và dùng mô hình để </w:t>
+        <w:t xml:space="preserve">AUC kiểm định chéo 5 lần là 0,761 ± 0,035, cho thấy mô hình ổn định. Mô hình “không ai phản hồi” đã đạt 79,0% accuracy, nên accuracy không phải thước đo phù hợp. Ở ngưỡng 0,5, mô hình chỉ tìm được 20,0% người phản hồi; ngưỡng 0,3 tìm được 57,6%, trong khi precision 42,1% vẫn gấp đôi tỷ lệ phản hồi chung (21,0%) và F1 tăng từ 0,30 lên 0,49. Vì vậy nhóm chọn ngưỡng 0,3 làm mặc định. Ngưỡng tối ưu thực sự còn phụ thuộc chi phí gửi một ưu đãi và giá trị một lượt phản hồi, hai thông tin dữ liệu chưa có, nên mô hình chủ yếu dùng để </w:t>
       </w:r>
       <w:r>
         <w:rPr>
@@ -15581,9 +16116,9 @@
         </w:rPr>
         <w:drawing>
           <wp:inline distT="0" distB="0" distL="0" distR="0">
-            <wp:extent cx="4572000" cy="2887578"/>
+            <wp:extent cx="4206240" cy="2656572"/>
             <wp:effectExtent l="0" t="0" r="0" b="0"/>
-            <wp:docPr id="108" name="Picture 108"/>
+            <wp:docPr id="112" name="Picture 112"/>
             <wp:cNvGraphicFramePr>
               <a:graphicFrameLocks xmlns:a="http://schemas.openxmlformats.org/drawingml/2006/main" noChangeAspect="1"/>
             </wp:cNvGraphicFramePr>
@@ -15595,7 +16130,7 @@
                     <pic:cNvPicPr/>
                   </pic:nvPicPr>
                   <pic:blipFill>
-                    <a:blip r:embed="rIdF8"/>
+                    <a:blip r:embed="rIdF12"/>
                     <a:stretch>
                       <a:fillRect/>
                     </a:stretch>
@@ -15603,7 +16138,7 @@
                   <pic:spPr>
                     <a:xfrm>
                       <a:off x="0" y="0"/>
-                      <a:ext cx="4572000" cy="2887578"/>
+                      <a:ext cx="4206240" cy="2656572"/>
                     </a:xfrm>
                     <a:prstGeom prst="rect">
                       <a:avLst/>
@@ -15637,7 +16172,7 @@
         <w:spacing w:after="240" w:line="240" w:lineRule="auto"/>
       </w:pPr>
       <w:r>
-        <w:t xml:space="preserve">Quy tắc rõ nhất: khách chi tiêu trên 1.600 $ và có thâm niên dưới 2.646 ngày có 71/80 người đã phản hồi (88,8%). Ở chiều ngược lại, khách chi tiêu dưới 1.204 $ và chưa từng mua qua catalog chỉ phản hồi 3,9% (20/512): gửi chiến dịch cho nhóm này gần như không có hiệu quả.</w:t>
+        <w:t xml:space="preserve">Nút gốc tách theo tổng chi tiêu: 336 khách chi tiêu trên 1.204 $ có 55,4% đã phản hồi, so với 14,0% ở 1.656 khách còn lại. Quy tắc rõ nhất: khách chi tiêu trên 1.600 $ và có thâm niên không quá 2.646 ngày có 71/80 người đã phản hồi (88,8%). Ở chiều ngược lại, khách chi tiêu từ 1.204 $ trở xuống và chưa từng mua qua catalog chỉ phản hồi 3,9% (20/512): gửi chiến dịch cho nhóm này gần như không có hiệu quả.</w:t>
       </w:r>
     </w:p>
     <w:p>
@@ -15672,7 +16207,7 @@
         <w:t xml:space="preserve">Nhắm mục tiêu chiến dịch:</w:t>
       </w:r>
       <w:r>
-        <w:t xml:space="preserve"> khi xếp hạng 1.992 khách theo xác suất dự báo (kiểm định chéo), 20% khách có điểm cao nhất chứa 46,9% số người phản hồi (lift 2,3) và 30% có điểm cao nhất chứa 62,2% (lift 2,1). Gửi cho khoảng 600 khách thay vì toàn bộ giúp giảm 70% chi phí tiếp cận mà vẫn giữ gần hai phần ba số phản hồi.</w:t>
+        <w:t xml:space="preserve"> khi xếp hạng 1.992 khách theo xác suất dự báo (kiểm định chéo, trên dữ liệu năm chiến dịch cũ), 20% khách có điểm cao nhất chứa 46,9% số người phản hồi (lift 2,3) và 30% có điểm cao nhất chứa 62,2% (lift 2,1). Gửi cho khoảng 600 khách thay vì toàn bộ giúp giảm 70% chi phí tiếp cận mà vẫn giữ gần hai phần ba số phản hồi.</w:t>
       </w:r>
     </w:p>
     <w:p>
@@ -15697,15 +16232,7 @@
         <w:t xml:space="preserve">Win-back nhóm At Risk:</w:t>
       </w:r>
       <w:r>
-        <w:t xml:space="preserve"> theo công thức (1), mỗi 10% khách At Risk được kéo lại giữ được 44.635 $ (4,0% tổng doanh thu); ở mức 20% là 89.269 $ (7,9%). Riêng 166 khách VIP At Risk nắm 252.404 $.</w:t>
-      </w:r>
-    </w:p>
-    <w:p>
-      <w:pPr>
-        <w:spacing w:after="240" w:line="240" w:lineRule="auto"/>
-      </w:pPr>
-      <w:r>
-        <w:t xml:space="preserve">Đây là các con số cận trên: mô phỏng win-back giả định khách quay lại chi tiêu như trước, còn lift được tính trên dữ liệu quá khứ của năm chiến dịch cũ.</w:t>
+        <w:t xml:space="preserve"> theo công thức (1), mỗi 10% khách At Risk được kéo lại tương đương 44.635 $ chi tiêu lịch sử của nhóm này (4,0% tổng chi tiêu cộng dồn); ở mức 20% là 89.269 $ (7,9%). Riêng 166 khách VIP At Risk có tổng chi tiêu lịch sử 252.404 $. Đây là cận trên (giả định khách quay lại chi tiêu như trước) và là quy mô giá trị đang có nguy cơ mất, không phải doanh thu của một kỳ cụ thể.</w:t>
       </w:r>
     </w:p>
     <w:p>
@@ -15725,7 +16252,7 @@
         <w:spacing w:after="240" w:line="240" w:lineRule="auto"/>
       </w:pPr>
       <w:r>
-        <w:t xml:space="preserve">Ưu tiên số 1 là win-back nhóm VIP At Risk: phần doanh thu lớn nhất đang có nguy cơ mất, nằm trong một nhóm khách nhỏ đã từng phản hồi chiến dịch. Các giải pháp được xếp theo doanh thu bị ảnh hưởng.</w:t>
+        <w:t xml:space="preserve">Ưu tiên số 1 là win-back nhóm VIP At Risk, nơi tập trung phần lớn 39,6% tổng chi tiêu cộng dồn đang có nguy cơ mất. Các giải pháp được xếp theo quy mô chi tiêu bị ảnh hưởng.</w:t>
       </w:r>
     </w:p>
     <w:p>
@@ -16018,7 +16545,7 @@
                 <w:sz w:val="22"/>
                 <w:szCs w:val="22"/>
               </w:rPr>
-              <w:t xml:space="preserve">39,6% doanh thu; 50% VIP At Risk từng phản hồi</w:t>
+              <w:t xml:space="preserve">39,6% tổng chi tiêu; 50% VIP At Risk từng phản hồi</w:t>
             </w:r>
           </w:p>
         </w:tc>
@@ -16104,7 +16631,7 @@
                 <w:sz w:val="22"/>
                 <w:szCs w:val="22"/>
               </w:rPr>
-              <w:t xml:space="preserve">Chấm điểm bằng mô hình logistic, chỉ gửi cho khách có điểm ≥ 0,3</w:t>
+              <w:t xml:space="preserve">Chấm điểm logistic, chỉ gửi khách có điểm ≥ 0,3</w:t>
             </w:r>
           </w:p>
         </w:tc>
@@ -16144,7 +16671,7 @@
                 <w:sz w:val="22"/>
                 <w:szCs w:val="22"/>
               </w:rPr>
-              <w:t xml:space="preserve">AUC 0,74; lift 2,1; 79% khách chưa từng phản hồi</w:t>
+              <w:t xml:space="preserve">AUC 0,74; lift 2,1</w:t>
             </w:r>
           </w:p>
         </w:tc>
@@ -16184,7 +16711,7 @@
                 <w:sz w:val="22"/>
                 <w:szCs w:val="22"/>
               </w:rPr>
-              <w:t xml:space="preserve">Tỷ lệ chấp nhận; chi phí/khách phản hồi</w:t>
+              <w:t xml:space="preserve">Tỷ lệ chấp nhận</w:t>
             </w:r>
           </w:p>
         </w:tc>
@@ -16270,7 +16797,7 @@
                 <w:sz w:val="22"/>
                 <w:szCs w:val="22"/>
               </w:rPr>
-              <w:t xml:space="preserve">Champions tạo 30,7% doanh thu, chỉ 10,7% đơn giảm giá</w:t>
+              <w:t xml:space="preserve">Champions: 30,7% tổng chi tiêu, 10,7% đơn giảm giá</w:t>
             </w:r>
           </w:p>
         </w:tc>
@@ -16396,7 +16923,7 @@
                 <w:sz w:val="22"/>
                 <w:szCs w:val="22"/>
               </w:rPr>
-              <w:t xml:space="preserve">Mỗi trẻ nhỏ -44% chi tiêu; OR = 0,66</w:t>
+              <w:t xml:space="preserve">-44% chi tiêu mỗi trẻ nhỏ; CD4 hợp hộ có con teen</w:t>
             </w:r>
           </w:p>
         </w:tc>
@@ -16774,7 +17301,7 @@
                 <w:sz w:val="22"/>
                 <w:szCs w:val="22"/>
               </w:rPr>
-              <w:t xml:space="preserve">Săn giảm giá: 22,1% khách, 6,2% doanh thu</w:t>
+              <w:t xml:space="preserve">Săn giảm giá: 22,1% khách, 6,2% tổng chi tiêu</w:t>
             </w:r>
           </w:p>
         </w:tc>
@@ -16859,7 +17386,7 @@
         <w:spacing w:after="240" w:line="240" w:lineRule="auto"/>
       </w:pPr>
       <w:r>
-        <w:t xml:space="preserve">Mục tiêu 6 tháng: kéo lại 20% doanh thu nhóm At Risk (khoảng 89.000 $, +7,9% doanh thu), đưa tỷ trọng khách At Risk từ 24,1% xuống dưới 20%, và nâng tỷ lệ chấp nhận mỗi chiến dịch từ 6,0% lên ít nhất 12%. Giải pháp 1 và 4 nên thí điểm có nhóm đối chứng.</w:t>
+        <w:t xml:space="preserve">Mục tiêu đề xuất (giả định của nhóm: đánh giá sau 6 tháng, mốc này không suy ra từ dữ liệu): 20% khách At Risk quay lại mua (khoảng 96 khách, tương đương 89.269 $ chi tiêu lịch sử, 7,9% tổng chi tiêu cộng dồn); tỷ trọng khách At Risk dưới 20% (hiện 24,1%); tỷ lệ chấp nhận mỗi chiến dịch từ 12% trở lên (hiện 6,0%).</w:t>
       </w:r>
     </w:p>
     <w:p>
@@ -16889,7 +17416,7 @@
         <w:spacing w:after="240" w:line="240" w:lineRule="auto"/>
       </w:pPr>
       <w:r>
-        <w:t xml:space="preserve">Giá trị của Food App tập trung ở một nhóm nhỏ khách hàng thu nhập cao, không có con nhỏ, mua rượu vang và thịt, ưa catalog và ít săn giảm giá. Trả lời bốn câu hỏi ban đầu:</w:t>
+        <w:t xml:space="preserve">Giá trị của Food App tập trung ở nhóm khách thu nhập cao, không có con nhỏ, mua rượu vang và thịt, ít săn giảm giá. Trả lời bốn câu hỏi ban đầu:</w:t>
       </w:r>
     </w:p>
     <w:p>
@@ -16914,7 +17441,7 @@
         <w:t xml:space="preserve">Ai tạo ra doanh thu?</w:t>
       </w:r>
       <w:r>
-        <w:t xml:space="preserve"> 20% khách tạo 53,4% doanh thu; nhóm thu nhập 70-90K chiếm 20,7% khách nhưng 47,1% doanh thu; hộ không con chiếm 52,5% khách nhưng 68,3% doanh thu.</w:t>
+        <w:t xml:space="preserve"> 20% khách tạo 53,4% tổng chi tiêu; nhóm thu nhập 70-90K chiếm 20,7% khách nhưng 47,1% tổng chi tiêu; hộ không con: 52,5% khách, 68,3% tổng chi tiêu.</w:t>
       </w:r>
     </w:p>
     <w:p>
@@ -16939,7 +17466,7 @@
         <w:t xml:space="preserve">Điều gì quyết định chi tiêu?</w:t>
       </w:r>
       <w:r>
-        <w:t xml:space="preserve"> Thu nhập (hệ số co giãn 2,31), con nhỏ (-44% mỗi trẻ), con tuổi teen (-20%), săn giảm giá và thâm niên. Tuổi, học vấn, lượt truy cập web và recency không có tác động riêng.</w:t>
+        <w:t xml:space="preserve"> Thu nhập (hệ số co giãn 2,31), con nhỏ (-44% mỗi trẻ), con tuổi teen (-20%), săn giảm giá, thâm niên và hôn nhân (+45% khi cùng thu nhập và số con). Tuổi, học vấn, lượt truy cập web và recency không có tác động riêng.</w:t>
       </w:r>
     </w:p>
     <w:p>
@@ -16964,7 +17491,7 @@
         <w:t xml:space="preserve">Chiến dịch nào hiệu quả và ai phản hồi?</w:t>
       </w:r>
       <w:r>
-        <w:t xml:space="preserve"> Chiến dịch 2 thất bại (1,3%); chiến dịch 1 và 5 chỉ chạm tới khách giàu. Thu nhập (OR = 1,91 mỗi 10.000 $), hôn nhân và tần suất truy cập web làm tăng, con cái và thâm niên làm giảm khả năng phản hồi.</w:t>
+        <w:t xml:space="preserve"> CD2 thất bại (1,3%); CD1, CD5 chạm tới khách giàu không con, CD4 tới khách khá giả có con teen, CD3 tới khách đại trà. Thu nhập (OR = 1,91 mỗi 10.000 $) dự báo phản hồi mạnh nhất.</w:t>
       </w:r>
     </w:p>
     <w:p>
@@ -16989,7 +17516,7 @@
         <w:t xml:space="preserve">Làm gì trước?</w:t>
       </w:r>
       <w:r>
-        <w:t xml:space="preserve"> Win-back 480 khách At Risk đang nắm 39,6% doanh thu, bắt đầu từ 166 khách VIP; đồng thời dùng mô hình để nhắm mục tiêu, có thể giữ 62% số phản hồi với 30% chi phí tiếp cận.</w:t>
+        <w:t xml:space="preserve"> Win-back 480 khách At Risk đang nắm 39,6% tổng chi tiêu cộng dồn, bắt đầu từ 166 khách VIP; và dùng mô hình để nhắm mục tiêu (giữ 62% số phản hồi với 30% chi phí tiếp cận).</w:t>
       </w:r>
     </w:p>
     <w:p>
@@ -17024,7 +17551,7 @@
         <w:t xml:space="preserve">Dữ liệu cắt ngang:</w:t>
       </w:r>
       <w:r>
-        <w:t xml:space="preserve"> không có ngày giao dịch, ngày chạy hay chi phí từng chiến dịch, nên chỉ chỉ ra mối liên hệ, không chứng minh nhân quả. Ví dụ không biết chiến dịch làm khách chi tiêu nhiều hơn hay ngược lại.</w:t>
+        <w:t xml:space="preserve"> không có ngày giao dịch, ngày chạy hay chi phí chiến dịch, nên chỉ chỉ ra mối liên hệ, không chứng minh nhân quả.</w:t>
       </w:r>
     </w:p>
     <w:p>
@@ -17049,7 +17576,32 @@
         <w:t xml:space="preserve">Đơn vị và thời gian chưa rõ:</w:t>
       </w:r>
       <w:r>
-        <w:t xml:space="preserve"> dữ liệu không ghi đơn vị tiền tệ và kỳ tính chi tiêu; nhãn Monthly Income không khớp với độ lớn giá trị. Recency tối đa chỉ 99 ngày, nên “At Risk” là rủi ro tương đối trong mẫu.</w:t>
+        <w:t xml:space="preserve"> không có đơn vị tiền tệ và kỳ tính chi tiêu; nhãn Monthly Income không khớp độ lớn giá trị; Recency tối đa 99 ngày nên “At Risk” chỉ là rủi ro tương đối.</w:t>
+      </w:r>
+    </w:p>
+    <w:p>
+      <w:pPr>
+        <w:tabs>
+          <w:tab w:val="left" w:pos="1080"/>
+        </w:tabs>
+        <w:spacing w:after="120" w:line="240" w:lineRule="auto"/>
+        <w:ind w:left="1080" w:hanging="360"/>
+      </w:pPr>
+      <w:r>
+        <w:t xml:space="preserve">•</w:t>
+      </w:r>
+      <w:r>
+        <w:tab/>
+      </w:r>
+      <w:r>
+        <w:rPr>
+          <w:b/>
+          <w:bCs/>
+        </w:rPr>
+        <w:t xml:space="preserve">Phân khúc dựa trên ngũ phân vị trong mẫu:</w:t>
+      </w:r>
+      <w:r>
+        <w:t xml:space="preserve"> ngưỡng R, F, M sẽ thay đổi khi dữ liệu cập nhật; một số nhóm nhỏ (90K+ chỉ 42 khách, 3 con chỉ 27 hộ) có tỷ lệ dao động lớn.</w:t>
       </w:r>
     </w:p>
     <w:p>
@@ -17071,10 +17623,10 @@
           <w:b/>
           <w:bCs/>
         </w:rPr>
-        <w:t xml:space="preserve">Phân khúc dựa trên ngũ phân vị trong mẫu:</w:t>
-      </w:r>
-      <w:r>
-        <w:t xml:space="preserve"> ngưỡng R, F, M sẽ thay đổi khi dữ liệu cập nhật; một số nhóm nhỏ (90K+ chỉ 42 khách, 3 con chỉ 27 hộ) có tỷ lệ dao động lớn.</w:t>
+        <w:t xml:space="preserve">Cấu trúc gia đình đặc biệt:</w:t>
+      </w:r>
+      <w:r>
+        <w:t xml:space="preserve"> không khách độc thân nào có con, nên hiệu ứng hôn nhân và con cái không tách bạch hoàn toàn.</w:t>
       </w:r>
     </w:p>
     <w:p>
@@ -17102,7 +17654,7 @@
         <w:tab/>
       </w:r>
       <w:r>
-        <w:t xml:space="preserve">Thu thập dữ liệu giao dịch theo thời gian để ước lượng giá trị vòng đời khách hàng bằng các mô hình xác suất như BG/NBD (Fader, Hardie và Lee, 2005), thay cho điểm RFM tĩnh.</w:t>
+        <w:t xml:space="preserve">Thu thập dữ liệu giao dịch theo thời gian để ước lượng giá trị vòng đời bằng mô hình BG/NBD (Fader, Hardie và Lee, 2005a) thay cho điểm RFM tĩnh.</w:t>
       </w:r>
     </w:p>
     <w:p>
@@ -17120,7 +17672,7 @@
         <w:tab/>
       </w:r>
       <w:r>
-        <w:t xml:space="preserve">Thử nghiệm A/B cho chiến dịch win-back và gói gia đình, sau đó dùng mô hình uplift để chọn khách mà chiến dịch thực sự làm thay đổi hành vi, chứ không chỉ khách vốn sẽ mua.</w:t>
+        <w:t xml:space="preserve">Thử nghiệm A/B cho win-back và gói gia đình, rồi dùng mô hình uplift để chọn khách mà chiến dịch thực sự làm thay đổi hành vi.</w:t>
       </w:r>
     </w:p>
     <w:p>
@@ -17142,7 +17694,27 @@
         <w:jc w:val="left"/>
       </w:pPr>
       <w:r>
-        <w:t xml:space="preserve">Fader, P.S., Hardie, B.G.S. and Lee, K.L. (2005) ‘RFM and CLV: Using iso-value curves for customer base analysis’, </w:t>
+        <w:t xml:space="preserve">Fader, P.S., Hardie, B.G.S. and Lee, K.L. (2005a) ‘“Counting your customers” the easy way: An alternative to the Pareto/NBD model’, </w:t>
+      </w:r>
+      <w:r>
+        <w:rPr>
+          <w:i/>
+          <w:iCs/>
+        </w:rPr>
+        <w:t xml:space="preserve">Marketing Science</w:t>
+      </w:r>
+      <w:r>
+        <w:t xml:space="preserve">, 24(2), pp. 275-284.</w:t>
+      </w:r>
+    </w:p>
+    <w:p>
+      <w:pPr>
+        <w:spacing w:after="240" w:line="240" w:lineRule="auto"/>
+        <w:ind w:left="720" w:hanging="720"/>
+        <w:jc w:val="left"/>
+      </w:pPr>
+      <w:r>
+        <w:t xml:space="preserve">Fader, P.S., Hardie, B.G.S. and Lee, K.L. (2005b) ‘RFM and CLV: Using iso-value curves for customer base analysis’, </w:t>
       </w:r>
       <w:r>
         <w:rPr>

</xml_diff>

<commit_message>
Food App report: third-round review fixes (per-customer income measure, renames, reproducible analysis script, model evaluation, experiment design)
Co-Authored-By: Claude Opus 5.5 <noreply@anthropic.com>
Claude-Session: https://claude.ai/code/session_01X5xVffgcgtEXBxQQecpyTH
</commit_message>
<xml_diff>
--- a/Báo cáo cuối kỳ - Food App Business.docx
+++ b/Báo cáo cuối kỳ - Food App Business.docx
@@ -1415,7 +1415,7 @@
           <w:bCs/>
         </w:rPr>
         <w:tab/>
-        <w:t>9</w:t>
+        <w:t>10</w:t>
       </w:r>
     </w:p>
     <w:p>
@@ -1440,7 +1440,7 @@
           <w:bCs/>
         </w:rPr>
         <w:tab/>
-        <w:t>12</w:t>
+        <w:t>13</w:t>
       </w:r>
     </w:p>
     <w:p>
@@ -1457,7 +1457,7 @@
       </w:r>
       <w:r>
         <w:tab/>
-        <w:t>12</w:t>
+        <w:t>13</w:t>
       </w:r>
     </w:p>
     <w:p>
@@ -1491,7 +1491,7 @@
       </w:r>
       <w:r>
         <w:tab/>
-        <w:t>13</w:t>
+        <w:t>14</w:t>
       </w:r>
     </w:p>
     <w:p>
@@ -1533,7 +1533,7 @@
           <w:bCs/>
         </w:rPr>
         <w:tab/>
-        <w:t>14</w:t>
+        <w:t>15</w:t>
       </w:r>
     </w:p>
     <w:p>
@@ -1550,7 +1550,7 @@
       </w:r>
       <w:r>
         <w:tab/>
-        <w:t>14</w:t>
+        <w:t>15</w:t>
       </w:r>
     </w:p>
     <w:p>
@@ -1618,7 +1618,7 @@
       </w:r>
       <w:r>
         <w:tab/>
-        <w:t>18</w:t>
+        <w:t>19</w:t>
       </w:r>
     </w:p>
     <w:p>
@@ -1643,7 +1643,7 @@
           <w:bCs/>
         </w:rPr>
         <w:tab/>
-        <w:t>18</w:t>
+        <w:t>20</w:t>
       </w:r>
     </w:p>
     <w:p>
@@ -1668,7 +1668,7 @@
           <w:bCs/>
         </w:rPr>
         <w:tab/>
-        <w:t>19</w:t>
+        <w:t>21</w:t>
       </w:r>
     </w:p>
     <w:p>
@@ -1693,7 +1693,7 @@
           <w:bCs/>
         </w:rPr>
         <w:tab/>
-        <w:t>21</w:t>
+        <w:t>22</w:t>
       </w:r>
     </w:p>
     <w:p>
@@ -1710,7 +1710,7 @@
           <w:b/>
           <w:bCs/>
         </w:rPr>
-        <w:t xml:space="preserve">Phụ lục. Công thức DAX đầy đủ</w:t>
+        <w:t xml:space="preserve">Phụ lục</w:t>
       </w:r>
       <w:r>
         <w:rPr>
@@ -1718,7 +1718,58 @@
           <w:bCs/>
         </w:rPr>
         <w:tab/>
-        <w:t>22</w:t>
+        <w:t>23</w:t>
+      </w:r>
+    </w:p>
+    <w:p>
+      <w:pPr>
+        <w:tabs>
+          <w:tab w:val="right" w:leader="dot" w:pos="9360"/>
+        </w:tabs>
+        <w:spacing w:after="60" w:line="240" w:lineRule="auto"/>
+        <w:ind w:left="360" w:firstLine="0"/>
+        <w:jc w:val="left"/>
+      </w:pPr>
+      <w:r>
+        <w:t xml:space="preserve">Phụ lục 1. Một số công thức DAX tiêu biểu</w:t>
+      </w:r>
+      <w:r>
+        <w:tab/>
+        <w:t>23</w:t>
+      </w:r>
+    </w:p>
+    <w:p>
+      <w:pPr>
+        <w:tabs>
+          <w:tab w:val="right" w:leader="dot" w:pos="9360"/>
+        </w:tabs>
+        <w:spacing w:after="60" w:line="240" w:lineRule="auto"/>
+        <w:ind w:left="360" w:firstLine="0"/>
+        <w:jc w:val="left"/>
+      </w:pPr>
+      <w:r>
+        <w:t xml:space="preserve">Phụ lục 2. Quan hệ bảng và quy tắc xử lý dữ liệu</w:t>
+      </w:r>
+      <w:r>
+        <w:tab/>
+        <w:t>24</w:t>
+      </w:r>
+    </w:p>
+    <w:p>
+      <w:pPr>
+        <w:tabs>
+          <w:tab w:val="right" w:leader="dot" w:pos="9360"/>
+        </w:tabs>
+        <w:spacing w:after="60" w:line="240" w:lineRule="auto"/>
+        <w:ind w:left="360" w:firstLine="0"/>
+        <w:jc w:val="left"/>
+      </w:pPr>
+      <w:r>
+        <w:t xml:space="preserve">Phụ lục 3. Mã Python tái lập kết quả</w:t>
+      </w:r>
+      <w:r>
+        <w:tab/>
+        <w:t>24</w:t>
       </w:r>
       <w:r>
         <w:fldChar w:fldCharType="end"/>
@@ -1838,7 +1889,7 @@
       </w:r>
       <w:r>
         <w:tab/>
-        <w:t>12</w:t>
+        <w:t>13</w:t>
       </w:r>
     </w:p>
     <w:p>
@@ -1923,7 +1974,7 @@
       </w:r>
       <w:r>
         <w:tab/>
-        <w:t>16</w:t>
+        <w:t>17</w:t>
       </w:r>
     </w:p>
     <w:p>
@@ -1936,11 +1987,11 @@
         <w:jc w:val="left"/>
       </w:pPr>
       <w:r>
-        <w:t xml:space="preserve">Bảng 6.4. Kết quả trên tập kiểm tra (598 khách)</w:t>
+        <w:t xml:space="preserve">Bảng 6.4. Kết quả trên tập kiểm tra (598 khách, 125 đã chấp nhận)</w:t>
       </w:r>
       <w:r>
         <w:tab/>
-        <w:t>17</w:t>
+        <w:t>18</w:t>
       </w:r>
     </w:p>
     <w:p>
@@ -1957,21 +2008,7 @@
       </w:r>
       <w:r>
         <w:tab/>
-        <w:t>19</w:t>
-      </w:r>
-    </w:p>
-    <w:p>
-      <w:pPr>
-        <w:spacing w:before="240" w:after="240" w:line="240" w:lineRule="auto"/>
-        <w:ind w:firstLine="0"/>
-        <w:jc w:val="center"/>
-      </w:pPr>
-      <w:r>
-        <w:rPr>
-          <w:b/>
-          <w:bCs/>
-        </w:rPr>
-        <w:t xml:space="preserve">DANH MỤC HÌNH</w:t>
+        <w:t>20</w:t>
       </w:r>
     </w:p>
     <w:p>
@@ -1984,11 +2021,25 @@
         <w:jc w:val="left"/>
       </w:pPr>
       <w:r>
-        <w:t xml:space="preserve">Hình 1.1. Khung khái niệm nghiên cứu</w:t>
+        <w:t xml:space="preserve">Bảng PL1. Quan hệ giữa các bảng trong mô hình</w:t>
       </w:r>
       <w:r>
         <w:tab/>
-        <w:t>5</w:t>
+        <w:t>24</w:t>
+      </w:r>
+    </w:p>
+    <w:p>
+      <w:pPr>
+        <w:spacing w:before="240" w:after="240" w:line="240" w:lineRule="auto"/>
+        <w:ind w:firstLine="0"/>
+        <w:jc w:val="center"/>
+      </w:pPr>
+      <w:r>
+        <w:rPr>
+          <w:b/>
+          <w:bCs/>
+        </w:rPr>
+        <w:t xml:space="preserve">DANH MỤC HÌNH</w:t>
       </w:r>
     </w:p>
     <w:p>
@@ -2001,11 +2052,11 @@
         <w:jc w:val="left"/>
       </w:pPr>
       <w:r>
-        <w:t xml:space="preserve">Hình 3.1. Mô hình dữ liệu trong file Power BI</w:t>
+        <w:t xml:space="preserve">Hình 1.1. Khung khái niệm nghiên cứu</w:t>
       </w:r>
       <w:r>
         <w:tab/>
-        <w:t>9</w:t>
+        <w:t>5</w:t>
       </w:r>
     </w:p>
     <w:p>
@@ -2018,11 +2069,11 @@
         <w:jc w:val="left"/>
       </w:pPr>
       <w:r>
-        <w:t xml:space="preserve">Hình 4.1. Trang 1 - Tổng quan: 20% khách tạo 53,4% tổng chi tiêu</w:t>
+        <w:t xml:space="preserve">Hình 3.1. Mô hình dữ liệu trong file Power BI</w:t>
       </w:r>
       <w:r>
         <w:tab/>
-        <w:t>10</w:t>
+        <w:t>9</w:t>
       </w:r>
     </w:p>
     <w:p>
@@ -2035,7 +2086,7 @@
         <w:jc w:val="left"/>
       </w:pPr>
       <w:r>
-        <w:t xml:space="preserve">Hình 4.2. Trang 2 - Chân dung khách hàng theo thu nhập, số con, tuổi, học vấn, hôn nhân</w:t>
+        <w:t xml:space="preserve">Hình 4.1. Trang 1 - Tổng quan: 20% khách tạo 53,4% tổng chi tiêu</w:t>
       </w:r>
       <w:r>
         <w:tab/>
@@ -2052,7 +2103,7 @@
         <w:jc w:val="left"/>
       </w:pPr>
       <w:r>
-        <w:t xml:space="preserve">Hình 4.3. Trang 3 - Sản phẩm và kênh bán</w:t>
+        <w:t xml:space="preserve">Hình 4.2. Trang 2 - Chân dung khách hàng theo thu nhập, số con, tuổi, học vấn, hôn nhân</w:t>
       </w:r>
       <w:r>
         <w:tab/>
@@ -2069,7 +2120,7 @@
         <w:jc w:val="left"/>
       </w:pPr>
       <w:r>
-        <w:t xml:space="preserve">Hình 4.4. Trang 4 - Phản hồi chiến dịch</w:t>
+        <w:t xml:space="preserve">Hình 4.3. Trang 3 - Sản phẩm và kênh bán</w:t>
       </w:r>
       <w:r>
         <w:tab/>
@@ -2086,7 +2137,7 @@
         <w:jc w:val="left"/>
       </w:pPr>
       <w:r>
-        <w:t xml:space="preserve">Hình 4.5. Trang 5 - Phân khúc RFM và giữ chân khách hàng</w:t>
+        <w:t xml:space="preserve">Hình 4.4. Trang 4 - Phản hồi chiến dịch</w:t>
       </w:r>
       <w:r>
         <w:tab/>
@@ -2103,11 +2154,28 @@
         <w:jc w:val="left"/>
       </w:pPr>
       <w:r>
+        <w:t xml:space="preserve">Hình 4.5. Trang 5 - Phân khúc RFM và giữ chân khách hàng</w:t>
+      </w:r>
+      <w:r>
+        <w:tab/>
+        <w:t>12</w:t>
+      </w:r>
+    </w:p>
+    <w:p>
+      <w:pPr>
+        <w:tabs>
+          <w:tab w:val="right" w:leader="dot" w:pos="9360"/>
+        </w:tabs>
+        <w:spacing w:after="80" w:line="240" w:lineRule="auto"/>
+        <w:ind w:firstLine="0"/>
+        <w:jc w:val="left"/>
+      </w:pPr>
+      <w:r>
         <w:t xml:space="preserve">Hình 6.1. Cây quyết định ba tầng phân loại khách đã từng chấp nhận chiến dịch</w:t>
       </w:r>
       <w:r>
         <w:tab/>
-        <w:t>18</w:t>
+        <w:t>19</w:t>
       </w:r>
     </w:p>
     <w:p>
@@ -2883,7 +2951,7 @@
         <w:spacing w:after="240" w:line="240" w:lineRule="auto"/>
       </w:pPr>
       <w:r>
-        <w:t xml:space="preserve">Nhóm đóng vai thực tập sinh phân tích kinh doanh, nhận yêu cầu từ Phòng Marketing của một ứng dụng bán thực phẩm trực tuyến (Food App) có ba kênh bán là website, catalog và cửa hàng, với năm nhóm hàng: rượu vang, thịt, cá, trái cây và đồ ngọt. Reichheld và Sasser (1990) lập luận, qua các ví dụ ở ngành dịch vụ, rằng giữ chân khách hàng là đòn bẩy lợi nhuận quan trọng; con số 25-85% lợi nhuận trong bài chỉ mang tính minh họa, nên báo cáo chỉ dùng lập luận chung: mất một khách giá trị cao tốn kém hơn nhiều so với mất một khách mua ít.</w:t>
+        <w:t xml:space="preserve">Nhóm đóng vai thực tập sinh phân tích kinh doanh, nhận yêu cầu từ Phòng Marketing của một ứng dụng bán thực phẩm trực tuyến (Food App) có ba kênh bán là website, catalog và cửa hàng, với năm nhóm hàng: rượu vang, thịt, cá, trái cây và đồ ngọt. Reichheld và Sasser (1990) lập luận, qua các ví dụ ở ngành dịch vụ, rằng giữ chân khách hàng là đòn bẩy lợi nhuận quan trọng; con số 25-85% lợi nhuận trong bài chỉ mang tính minh họa, nên báo cáo chỉ dùng lập luận chung: nhóm khách nắm nhiều chi tiêu lịch sử đáng được ưu tiên thử nghiệm giữ chân. Trong báo cáo, mọi con số chi tiêu là chi tiêu đã ghi nhận, không phải doanh thu có thể giữ lại hay lợi nhuận.</w:t>
       </w:r>
     </w:p>
     <w:p>
@@ -3061,7 +3129,7 @@
         <w:t xml:space="preserve">Vòng đời gia đình (Wells và Gubar, 1966):</w:t>
       </w:r>
       <w:r>
-        <w:t xml:space="preserve"> nhu cầu và khả năng chi tiêu thay đổi theo giai đoạn gia đình; từ đó nhóm kỳ vọng hộ có con dành ít ngân sách hơn cho hàng tùy ý như rượu vang.</w:t>
+        <w:t xml:space="preserve"> nhu cầu và khả năng chi tiêu thay đổi theo giai đoạn gia đình; từ đó nhóm kỳ vọng khách có con dành ít ngân sách hơn cho hàng tùy ý như rượu vang.</w:t>
       </w:r>
     </w:p>
     <w:p>
@@ -3086,7 +3154,7 @@
         <w:t xml:space="preserve">Xu hướng phản ứng với ưu đãi (Lichtenstein, Netemeyer và Burton, 1990):</w:t>
       </w:r>
       <w:r>
-        <w:t xml:space="preserve"> phân biệt xu hướng phản ứng với khuyến mãi với ý thức về giá trị; báo cáo dùng tỷ lệ đơn giảm giá làm thước đo gần đúng.</w:t>
+        <w:t xml:space="preserve"> phân biệt xu hướng phản ứng với khuyến mãi với ý thức về giá trị; báo cáo dùng tỷ lệ đơn giảm giá (Deal_Ratio) làm thước đo gần đúng; đây là hành vi quan sát được, không đo trực tiếp xu hướng tâm lý hay độ nhạy giá.</w:t>
       </w:r>
     </w:p>
     <w:p>
@@ -4182,7 +4250,7 @@
                 <w:sz w:val="22"/>
                 <w:szCs w:val="22"/>
               </w:rPr>
-              <w:t xml:space="preserve">Tỷ lệ hộ có con</w:t>
+              <w:t xml:space="preserve">Tỷ lệ khách có con</w:t>
             </w:r>
           </w:p>
         </w:tc>
@@ -5302,7 +5370,27 @@
         <w:spacing w:after="240" w:line="240" w:lineRule="auto"/>
       </w:pPr>
       <w:r>
-        <w:t xml:space="preserve">Vì R5 và R6 dựa trên phán đoán, nhóm chạy lại mô hình OLS chính khi giữ cả bốn dòng (n = 1.996): R² giảm từ 0,730 xuống 0,709, hệ số ln(thu nhập) từ 2,315 xuống 2,101, số con nhỏ từ -0,574 xuống -0,554; hệ số lượt truy cập web đổi từ 0,023 sang -0,006 nhưng không có ý nghĩa ở cả hai trường hợp. Kết luận chính không đổi.</w:t>
+        <w:t xml:space="preserve">Vì R2, R5 và R6 dựa trên giả định hoặc phán đoán, nhóm chạy lại các mô hình chính theo hai phương án. </w:t>
+      </w:r>
+      <w:r>
+        <w:rPr>
+          <w:b/>
+          <w:bCs/>
+        </w:rPr>
+        <w:t xml:space="preserve">Giữ bốn dòng R5-R6</w:t>
+      </w:r>
+      <w:r>
+        <w:t xml:space="preserve"> (n = 1.996): R² của OLS giảm từ 0,730 xuống 0,709, hệ số ln(thu nhập) giảm từ 2,315 xuống 2,101 (khoảng 9%), số con nhỏ từ -0,574 xuống -0,553; hệ số lượt truy cập web đổi từ 0,023 sang -0,006 nhưng không có ý nghĩa ở cả hai trường hợp. </w:t>
+      </w:r>
+      <w:r>
+        <w:rPr>
+          <w:b/>
+          <w:bCs/>
+        </w:rPr>
+        <w:t xml:space="preserve">Giữ 204 dòng trùng</w:t>
+      </w:r>
+      <w:r>
+        <w:t xml:space="preserve"> (n = 2.196): R² 0,734, ln(thu nhập) 2,334, số con nhỏ -0,547; OR thu nhập trong logistic 1,93 so với 1,91. Độ lớn ước lượng thay đổi, nhưng dấu và mức ý nghĩa của các hệ số chính không đổi.</w:t>
       </w:r>
     </w:p>
     <w:p>
@@ -5782,7 +5870,7 @@
         <w:t xml:space="preserve">Thứ hai</w:t>
       </w:r>
       <w:r>
-        <w:t xml:space="preserve">, 264 khách (13,3%) có hai kênh cùng số đơn lớn nhất; quy tắc Web → Catalog → Store cho 538 Web, 138 Catalog, 1.316 Store, còn quy tắc Store → Web → Catalog cho 309, 115 và 1.568. Ở cả hai quy tắc, nhóm Catalog có AOV cao hơn nhóm Store khoảng 45-46% khi kiểm soát thu nhập. Preferred_Channel là kênh có nhiều đơn nhất, không phải kênh khách tự khai.</w:t>
+        <w:t xml:space="preserve">, 264 khách (13,3%) có hai kênh cùng số đơn lớn nhất; quy tắc Web → Catalog → Store cho 538 Web, 138 Catalog, 1.316 Store, còn quy tắc Store → Web → Catalog cho 309, 115 và 1.568. Ở cả hai quy tắc, nhóm Catalog có AOV cao hơn nhóm Store khoảng 45-46% khi kiểm soát thu nhập. Preferred_Channel là kênh có nhiều đơn nhất, không phải kênh khách tự khai. Để chạy lại ra đúng kết quả khi dữ liệu được cập nhật, cả hai quy tắc được viết thành công thức ở Phụ lục 2, kèm khóa sắp xếp ổn định (Raw_Row, sau này là mã khách) và bộ ngưỡng RFM cố định của kỳ gốc.</w:t>
       </w:r>
     </w:p>
     <w:p>
@@ -5790,7 +5878,7 @@
         <w:spacing w:after="240" w:line="240" w:lineRule="auto"/>
       </w:pPr>
       <w:r>
-        <w:t xml:space="preserve">Sáu phân khúc RFM: Champions (R ≥ 4, FM ≥ 4); Loyal Customers (R ≥ 3, FM ≥ 3); Promising (R ≥ 4, FM &lt; 3); Need Attention (R = 3, FM &lt; 3); At Risk (R ≤ 2, FM ≥ 3); Hibernating (R ≤ 2, FM &lt; 3). “Promising” trước đây đặt tên “New / Promising”, nhưng mọi khách có thâm niên ít nhất 2.159 ngày nên đây không phải khách mới. “At Risk” là nhãn RFM tương đối, không xác nhận khách đã rời bỏ.</w:t>
+        <w:t xml:space="preserve">Sáu phân khúc RFM: Champions (R ≥ 4, FM ≥ 4); Loyal Customers (R ≥ 3, FM ≥ 3); Promising (R ≥ 4, FM &lt; 3); Need Attention (R = 3, FM &lt; 3); At Risk (R ≤ 2, FM ≥ 3); Hibernating (R ≤ 2, FM &lt; 3). Nhóm này không gọi là “khách mới” vì mọi khách có thâm niên ít nhất 2.159 ngày. “At Risk” là nhãn RFM tương đối, không xác nhận khách đã rời bỏ.</w:t>
       </w:r>
     </w:p>
     <w:p>
@@ -6110,7 +6198,7 @@
                 <w:sz w:val="22"/>
                 <w:szCs w:val="22"/>
               </w:rPr>
-              <w:t xml:space="preserve">Rút gọn: TOPN 20% khách theo Total_Spend trong ALLSELECTED, chia tổng chi tiêu chung (nguyên văn ở Phụ lục)</w:t>
+              <w:t xml:space="preserve">Rút gọn: TOPN 20% khách theo Total_Spend trong ALLSELECTED, chia tổng chi tiêu chung (đầy đủ ở Phụ lục 1)</w:t>
             </w:r>
           </w:p>
         </w:tc>
@@ -6156,7 +6244,7 @@
                 <w:sz w:val="22"/>
                 <w:szCs w:val="22"/>
               </w:rPr>
-              <w:t xml:space="preserve">AVERAGEX(FILTER(Campaign_Response, Campaign_Response[Accepted] = 1), RELATED(Customers[Income]))</w:t>
+              <w:t xml:space="preserve">VAR _kh = FILTER(VALUES(Customers[CustomerID]), CALCULATE(MAX(Campaign_Response[Accepted])) = 1) RETURN CALCULATE(AVERAGE(Customers[Income]), _kh)</w:t>
             </w:r>
           </w:p>
         </w:tc>
@@ -6182,7 +6270,7 @@
                 <w:sz w:val="22"/>
                 <w:szCs w:val="22"/>
               </w:rPr>
-              <w:t xml:space="preserve">Doanh thu rủi ro (At Risk)</w:t>
+              <w:t xml:space="preserve">Chi tiêu lịch sử nhóm At Risk</w:t>
             </w:r>
           </w:p>
         </w:tc>
@@ -6294,7 +6382,7 @@
                 <w:sz w:val="22"/>
                 <w:szCs w:val="22"/>
               </w:rPr>
-              <w:t xml:space="preserve">[Doanh thu rủi ro (At Risk)] * [Tỷ lệ win-back]</w:t>
+              <w:t xml:space="preserve">[Chi tiêu lịch sử nhóm At Risk] * [Tỷ lệ win-back]</w:t>
             </w:r>
           </w:p>
         </w:tc>
@@ -6314,6 +6402,24 @@
           <w:szCs w:val="22"/>
         </w:rPr>
         <w:t xml:space="preserve">Nguồn: Nhóm tác giả, từ file Power BI của nhóm.</w:t>
+      </w:r>
+    </w:p>
+    <w:p>
+      <w:pPr>
+        <w:spacing w:after="240" w:line="240" w:lineRule="auto"/>
+      </w:pPr>
+      <w:r>
+        <w:t xml:space="preserve">Measure thu nhập của khách chấp nhận được tính </w:t>
+      </w:r>
+      <w:r>
+        <w:rPr>
+          <w:b/>
+          <w:bCs/>
+        </w:rPr>
+        <w:t xml:space="preserve">theo khách</w:t>
+      </w:r>
+      <w:r>
+        <w:t xml:space="preserve">, không theo lượt: khi lọc một chiến dịch, kết quả bằng cách tính theo lượt; khi không lọc, kết quả là 65.183 ĐVTT (trung bình của 418 khách khác nhau), trong khi lấy trung bình trên 602 lượt chấp nhận sẽ ra 69.868 ĐVTT vì khách chấp nhận nhiều chiến dịch bị tính nhiều lần. Các thẻ trên trang 5 vẫn phản ứng theo slicer: slicer phân khúc lọc qua bảng Dim_Segment, nên khi chọn một phân khúc khác At Risk, thẻ At Risk để trống thay vì giữ số cũ.</w:t>
       </w:r>
     </w:p>
     <w:p>
@@ -6514,7 +6620,7 @@
         </w:rPr>
         <w:drawing>
           <wp:inline distT="0" distB="0" distL="0" distR="0">
-            <wp:extent cx="5394960" cy="3034665"/>
+            <wp:extent cx="5943600" cy="3343275"/>
             <wp:effectExtent l="0" t="0" r="0" b="0"/>
             <wp:docPr id="103" name="Picture 103"/>
             <wp:cNvGraphicFramePr>
@@ -6536,7 +6642,7 @@
                   <pic:spPr>
                     <a:xfrm>
                       <a:off x="0" y="0"/>
-                      <a:ext cx="5394960" cy="3034665"/>
+                      <a:ext cx="5943600" cy="3343275"/>
                     </a:xfrm>
                     <a:prstGeom prst="rect">
                       <a:avLst/>
@@ -6603,7 +6709,7 @@
         </w:rPr>
         <w:drawing>
           <wp:inline distT="0" distB="0" distL="0" distR="0">
-            <wp:extent cx="5394960" cy="3034665"/>
+            <wp:extent cx="5943600" cy="3343275"/>
             <wp:effectExtent l="0" t="0" r="0" b="0"/>
             <wp:docPr id="104" name="Picture 104"/>
             <wp:cNvGraphicFramePr>
@@ -6625,7 +6731,7 @@
                   <pic:spPr>
                     <a:xfrm>
                       <a:off x="0" y="0"/>
-                      <a:ext cx="5394960" cy="3034665"/>
+                      <a:ext cx="5943600" cy="3343275"/>
                     </a:xfrm>
                     <a:prstGeom prst="rect">
                       <a:avLst/>
@@ -6692,7 +6798,7 @@
         </w:rPr>
         <w:drawing>
           <wp:inline distT="0" distB="0" distL="0" distR="0">
-            <wp:extent cx="5394960" cy="3034665"/>
+            <wp:extent cx="5943600" cy="3343275"/>
             <wp:effectExtent l="0" t="0" r="0" b="0"/>
             <wp:docPr id="105" name="Picture 105"/>
             <wp:cNvGraphicFramePr>
@@ -6714,7 +6820,7 @@
                   <pic:spPr>
                     <a:xfrm>
                       <a:off x="0" y="0"/>
-                      <a:ext cx="5394960" cy="3034665"/>
+                      <a:ext cx="5943600" cy="3343275"/>
                     </a:xfrm>
                     <a:prstGeom prst="rect">
                       <a:avLst/>
@@ -6781,7 +6887,7 @@
         </w:rPr>
         <w:drawing>
           <wp:inline distT="0" distB="0" distL="0" distR="0">
-            <wp:extent cx="5394960" cy="3034665"/>
+            <wp:extent cx="5943600" cy="3343275"/>
             <wp:effectExtent l="0" t="0" r="0" b="0"/>
             <wp:docPr id="106" name="Picture 106"/>
             <wp:cNvGraphicFramePr>
@@ -6803,7 +6909,7 @@
                   <pic:spPr>
                     <a:xfrm>
                       <a:off x="0" y="0"/>
-                      <a:ext cx="5394960" cy="3034665"/>
+                      <a:ext cx="5943600" cy="3343275"/>
                     </a:xfrm>
                     <a:prstGeom prst="rect">
                       <a:avLst/>
@@ -6870,7 +6976,7 @@
         </w:rPr>
         <w:drawing>
           <wp:inline distT="0" distB="0" distL="0" distR="0">
-            <wp:extent cx="5394960" cy="3034665"/>
+            <wp:extent cx="5943600" cy="3343275"/>
             <wp:effectExtent l="0" t="0" r="0" b="0"/>
             <wp:docPr id="107" name="Picture 107"/>
             <wp:cNvGraphicFramePr>
@@ -6892,7 +6998,7 @@
                   <pic:spPr>
                     <a:xfrm>
                       <a:off x="0" y="0"/>
-                      <a:ext cx="5394960" cy="3034665"/>
+                      <a:ext cx="5943600" cy="3343275"/>
                     </a:xfrm>
                     <a:prstGeom prst="rect">
                       <a:avLst/>
@@ -7933,7 +8039,7 @@
         <w:spacing w:after="240" w:line="240" w:lineRule="auto"/>
       </w:pPr>
       <w:r>
-        <w:t xml:space="preserve">Thu nhập là biến phân tách chi tiêu rõ nhất: nhóm 70-90K chiếm 20,7% số khách nhưng 47,1% tổng chi tiêu. Biến rõ thứ hai là con cái: hộ không con chiếm 52,5% số khách nhưng 68,3% tổng chi tiêu, chi gấp 3,2 lần hộ có 2 con, và 26,1% đã chấp nhận chiến dịch so với 12,4%. Ngay trong nhóm thu nhập 50-70K, hộ không con vẫn chi 792 so với 600 ĐVTT. Với biến kiểm soát, khách tốt nghiệp đại học chi trung bình 591 so với 364 ĐVTT (nhóm chưa tốt nghiệp chỉ 230 khách), chi tiêu theo tuổi dao động 451-700 ĐVTT, còn khách độc thân và đã kết hôn chi gần như bằng nhau (583 và 555 ĐVTT).</w:t>
+        <w:t xml:space="preserve">Thu nhập là biến phân tách chi tiêu rõ nhất: nhóm 70-90K chiếm 20,7% số khách nhưng 47,1% tổng chi tiêu. Biến rõ thứ hai là con cái: khách không có con chiếm 52,5% số khách nhưng 68,3% tổng chi tiêu, chi gấp 3,2 lần khách có 2 con, và 26,1% đã chấp nhận chiến dịch so với 12,4%. Ngay trong nhóm thu nhập 50-70K, khách không có con vẫn chi 792 so với 600 ĐVTT. Với biến kiểm soát, khách tốt nghiệp đại học chi trung bình 591 so với 364 ĐVTT (nhóm chưa tốt nghiệp chỉ 230 khách), chi tiêu theo tuổi dao động 451-700 ĐVTT, còn khách độc thân và đã kết hôn chi gần như bằng nhau (583 và 555 ĐVTT).</w:t>
       </w:r>
     </w:p>
     <w:p>
@@ -8095,7 +8201,7 @@
                 <w:sz w:val="22"/>
                 <w:szCs w:val="22"/>
               </w:rPr>
-              <w:t xml:space="preserve">% tổng chi tiêu của nhóm</w:t>
+              <w:t xml:space="preserve">% tổng chi tiêu toàn mẫu của nhóm khách</w:t>
             </w:r>
           </w:p>
         </w:tc>
@@ -8639,7 +8745,7 @@
         <w:t xml:space="preserve">nhóm khách</w:t>
       </w:r>
       <w:r>
-        <w:t xml:space="preserve"> theo kênh có nhiều đơn nhất, không mô tả đơn của từng kênh: “% tổng chi tiêu của nhóm” gồm chi tiêu trên mọi kênh. Nhóm catalog có AOV trung vị gấp 3,0 lần nhóm Store (theo measure dashboard: 69,3 so với 43,7 và 39,2 ĐVTT), nhưng thu nhập cao hơn nhiều; trong cùng nhóm 70-90K, AOV của ba nhóm gần như bằng nhau (67,4-68,8 ĐVTT). Khách có từ 40% đơn giảm giá trở lên chiếm 22,1% số khách nhưng chỉ 6,2% tổng chi tiêu. 735 khách truy cập web từ 7 lần/tháng chi trung bình 290 so với 726 ĐVTT ở nhóm còn lại, có thu nhập thấp hơn và tỷ lệ đơn giảm giá cao hơn (30,7% so với 13,6%); dữ liệu không đủ để giải thích lý do, chỉ cho thấy lượt truy cập không phải thước đo giá trị.</w:t>
+        <w:t xml:space="preserve"> theo kênh có nhiều đơn nhất, không mô tả đơn của từng kênh: “% tổng chi tiêu toàn mẫu của nhóm khách” gồm chi tiêu của nhóm đó trên mọi kênh, không phải doanh thu riêng của Store, Web hay Catalog. Nhóm catalog có AOV trung vị gấp 3,0 lần nhóm Store (theo measure dashboard: 69,3 so với 43,7 và 39,2 ĐVTT), nhưng thu nhập cao hơn nhiều; trong cùng nhóm 70-90K, AOV của ba nhóm gần như bằng nhau (67,4-68,8 ĐVTT). Khách có từ 40% đơn giảm giá trở lên chiếm 22,1% số khách nhưng chỉ 6,2% tổng chi tiêu. 735 khách truy cập web từ 7 lần/tháng chi trung bình 290 so với 726 ĐVTT ở nhóm còn lại, có thu nhập thấp hơn và tỷ lệ đơn giảm giá cao hơn (30,7% so với 13,6%); dữ liệu không đủ để giải thích lý do, chỉ cho thấy lượt truy cập không phải thước đo giá trị.</w:t>
       </w:r>
     </w:p>
     <w:p>
@@ -9793,7 +9899,7 @@
           <w:sz w:val="22"/>
           <w:szCs w:val="22"/>
         </w:rPr>
-        <w:t xml:space="preserve">Nguồn: Nhóm tác giả, từ file Power BI của nhóm. Promising có tên trong file là New / Promising.</w:t>
+        <w:t xml:space="preserve">Nguồn: Nhóm tác giả, từ file Power BI của nhóm.</w:t>
       </w:r>
     </w:p>
     <w:p>
@@ -10840,7 +10946,7 @@
                 <w:sz w:val="22"/>
                 <w:szCs w:val="22"/>
               </w:rPr>
-              <w:t xml:space="preserve">OR con nhỏ 0,66; con teen 0,56</w:t>
+              <w:t xml:space="preserve">OR con teen 0,56 (p &lt; 0,001); con nhỏ 0,66 (p = 0,037)</w:t>
             </w:r>
           </w:p>
         </w:tc>
@@ -10860,7 +10966,7 @@
                 <w:sz w:val="22"/>
                 <w:szCs w:val="22"/>
               </w:rPr>
-              <w:t xml:space="preserve">Được ủng hộ</w:t>
+              <w:t xml:space="preserve">Ủng hộ với con teen; bằng chứng yếu với con nhỏ (mất ý nghĩa nếu hiệu chỉnh Holm)</w:t>
             </w:r>
           </w:p>
         </w:tc>
@@ -11270,7 +11376,7 @@
                 <w:sz w:val="22"/>
                 <w:szCs w:val="22"/>
               </w:rPr>
-              <w:t xml:space="preserve">Tuổi, học vấn p ≥ 0,11; kết hôn +45%, OR 1,58</w:t>
+              <w:t xml:space="preserve">Tuổi, học vấn p ≥ 0,11; hệ số kết hôn đổi từ -0,019 đến 0,460 tùy đặc tả</w:t>
             </w:r>
           </w:p>
         </w:tc>
@@ -11290,7 +11396,7 @@
                 <w:sz w:val="22"/>
                 <w:szCs w:val="22"/>
               </w:rPr>
-              <w:t xml:space="preserve">Chỉ hôn nhân có liên hệ riêng</w:t>
+              <w:t xml:space="preserve">Tuổi, học vấn: chưa có bằng chứng; hôn nhân: quan hệ phụ thuộc đặc tả, không diễn giải là tác động riêng</w:t>
             </w:r>
           </w:p>
         </w:tc>
@@ -11499,7 +11605,7 @@
         <w:t xml:space="preserve">không có khách Single nào có con</w:t>
       </w:r>
       <w:r>
-        <w:t xml:space="preserve"> (712 khách Single đều 0 con; 1.280 khách Married có 334 hộ không con). Mô hình rút gọn (ln thu nhập, Married) cho β = -0,019 (p = 0,66); thêm số con cho β = 0,460 (+58,3%); mô hình đầy đủ cho β = 0,373 (+45,2%). Hệ số này thực chất đến từ so sánh 334 hộ kết hôn không con (chi trung bình 1.059 ĐVTT) với 712 khách độc thân (583 ĐVTT), nên không được diễn giải là tác động của hôn nhân.</w:t>
+        <w:t xml:space="preserve"> (712 khách Single đều 0 con; 1.280 khách Married có 334 khách không có con). Mô hình rút gọn (ln thu nhập, Married) cho β = -0,019 (p = 0,66); thêm số con cho β = 0,460 (+58,3%); mô hình đầy đủ cho β = 0,373 (+45,2%). Hệ số này thực chất đến từ so sánh 334 khách đã kết hôn không có con (chi trung bình 1.059 ĐVTT) với 712 khách độc thân (583 ĐVTT), nên không được diễn giải là tác động của hôn nhân.</w:t>
       </w:r>
     </w:p>
     <w:p>
@@ -13119,7 +13225,7 @@
         <w:spacing w:after="240" w:line="240" w:lineRule="auto"/>
       </w:pPr>
       <w:r>
-        <w:t xml:space="preserve">Mô hình giải thích 73,0% biến thiên của ln(chi tiêu). Hệ số co giãn 2,31 cho thấy, trong đặc tả này, tổng chi tiêu tại app tăng nhanh hơn tỷ lệ thuận với thu nhập. Phần dư gần đối xứng (độ lệch -0,39); Cook lớn nhất 0,079, và khi bỏ 117 quan sát vượt 4/n, dấu và ý nghĩa các hệ số chính không đổi (ln thu nhập 2,69). Mô hình phụ ln(AOV) (R² = 0,698, kiểm soát thu nhập, số con, tỷ lệ giảm giá) cho nhóm Catalog β = 0,376 [0,294; 0,458] tức +46% và nhóm Web β = 0,309 tức +36% so với Store; chênh lệch Catalog - Web là 0,067 (p = 0,12).</w:t>
+        <w:t xml:space="preserve">R² = 0,730 là mức khớp của ln(chi tiêu) trên chính mẫu ước lượng, không phải tỷ lệ giải thích chi tiêu gốc hay độ chính xác dự báo cho khách mới. Hệ số co giãn 2,31 cho thấy, trong đặc tả này, tổng chi tiêu tại app tăng nhanh hơn tỷ lệ thuận với thu nhập. Phần dư gần đối xứng (độ lệch -0,39); Cook lớn nhất 0,079, và khi bỏ 117 quan sát vượt 4/n, dấu và ý nghĩa các hệ số chính không đổi (ln thu nhập 2,69). Mô hình phụ ln(AOV) (R² = 0,698, kiểm soát thu nhập, số con, tỷ lệ giảm giá) cho nhóm Catalog β = 0,376 [0,294; 0,458] tức +46% và nhóm Web β = 0,309 tức +36% so với Store; chênh lệch Catalog - Web là 0,067 (p = 0,12).</w:t>
       </w:r>
     </w:p>
     <w:p>
@@ -14715,17 +14821,37 @@
         <w:spacing w:after="240" w:line="240" w:lineRule="auto"/>
       </w:pPr>
       <w:r>
-        <w:t xml:space="preserve">Dữ liệu được chia ngẫu nhiên theo tầng 70/30 (random_state = 42): 1.394 khách huấn luyện và 598 khách kiểm tra (125 đã chấp nhận). Ngưỡng được chọn </w:t>
+        <w:t xml:space="preserve">Toàn bộ bước đánh giá được viết trong file </w:t>
+      </w:r>
+      <w:r>
+        <w:rPr>
+          <w:i/>
+          <w:iCs/>
+        </w:rPr>
+        <w:t xml:space="preserve">food_app_analysis.py</w:t>
+      </w:r>
+      <w:r>
+        <w:t xml:space="preserve"> (Phụ lục 3), chạy từ file Excel gốc với dữ liệu xếp theo Raw_Row, cùng một mô hình logistic không phạt (statsmodels) và random_state = 42 cho mọi phép ngẫu nhiên. Có ba lớp, tách bạch nhau: (1) chia ngẫu nhiên theo tầng 70/30: 1.394 khách huấn luyện (293 đã chấp nhận) và 598 khách kiểm tra (125 đã chấp nhận); (2) </w:t>
       </w:r>
       <w:r>
         <w:rPr>
           <w:b/>
           <w:bCs/>
         </w:rPr>
-        <w:t xml:space="preserve">chỉ trên tập huấn luyện</w:t>
-      </w:r>
-      <w:r>
-        <w:t xml:space="preserve"> bằng kiểm định chéo 5 lần: F1 của dự báo ngoài fold (OOF) cao nhất ở 0,31 và gần như bằng ở 0,25-0,30, nên chọn 0,3; tập kiểm tra chỉ dùng một lần ở Bảng 6.4. AUC kiểm định chéo trên toàn bộ dữ liệu là 0,761 (độ lệch chuẩn giữa 5 fold 0,035).</w:t>
+        <w:t xml:space="preserve">chọn ngưỡng chỉ trên tập huấn luyện</w:t>
+      </w:r>
+      <w:r>
+        <w:t xml:space="preserve"> bằng kiểm định chéo 5 lần trong tập này: F1 của dự báo ngoài fold (OOF) là 0,481 ở ngưỡng 0,20; 0,502 ở 0,25; 0,508 ở 0,30; 0,475 ở 0,35; 0,445 ở 0,40 và 0,339 ở 0,50, cao nhất ở 0,31 (0,513), nên chọn ngưỡng tròn 0,3; tập kiểm tra chỉ dùng một lần ở Bảng 6.4; (3) kiểm định chéo 5 lần trên </w:t>
+      </w:r>
+      <w:r>
+        <w:rPr>
+          <w:b/>
+          <w:bCs/>
+        </w:rPr>
+        <w:t xml:space="preserve">toàn mẫu</w:t>
+      </w:r>
+      <w:r>
+        <w:t xml:space="preserve"> để đo độ ổn định và tính lift: AUC trung bình 0,758, độ lệch chuẩn giữa 5 fold 0,037.</w:t>
       </w:r>
     </w:p>
     <w:p>
@@ -14750,7 +14876,7 @@
           <w:sz w:val="24"/>
           <w:szCs w:val="24"/>
         </w:rPr>
-        <w:t xml:space="preserve"> Kết quả trên tập kiểm tra (598 khách)</w:t>
+        <w:t xml:space="preserve"> Kết quả trên tập kiểm tra (598 khách, 125 đã chấp nhận)</w:t>
       </w:r>
     </w:p>
     <w:tbl>
@@ -14876,7 +15002,7 @@
                 <w:sz w:val="22"/>
                 <w:szCs w:val="22"/>
               </w:rPr>
-              <w:t xml:space="preserve">AUC; accuracy</w:t>
+              <w:t xml:space="preserve">Ma trận nhầm lẫn: TP / FP / FN / TN</w:t>
             </w:r>
           </w:p>
         </w:tc>
@@ -14896,7 +15022,7 @@
                 <w:sz w:val="22"/>
                 <w:szCs w:val="22"/>
               </w:rPr>
-              <w:t xml:space="preserve">0,742; 80,6%</w:t>
+              <w:t xml:space="preserve">34 / 20 / 91 / 453</w:t>
             </w:r>
           </w:p>
         </w:tc>
@@ -14916,7 +15042,7 @@
                 <w:sz w:val="22"/>
                 <w:szCs w:val="22"/>
               </w:rPr>
-              <w:t xml:space="preserve">0,742; 74,6%</w:t>
+              <w:t xml:space="preserve">67 / 83 / 58 / 390</w:t>
             </w:r>
           </w:p>
         </w:tc>
@@ -14942,7 +15068,7 @@
                 <w:sz w:val="22"/>
                 <w:szCs w:val="22"/>
               </w:rPr>
-              <w:t xml:space="preserve">Recall (khách đã chấp nhận được chọn)</w:t>
+              <w:t xml:space="preserve">Recall; precision; F1</w:t>
             </w:r>
           </w:p>
         </w:tc>
@@ -14962,7 +15088,7 @@
                 <w:sz w:val="22"/>
                 <w:szCs w:val="22"/>
               </w:rPr>
-              <w:t xml:space="preserve">20,0% (25/125)</w:t>
+              <w:t xml:space="preserve">27,2%; 63,0%; 0,380</w:t>
             </w:r>
           </w:p>
         </w:tc>
@@ -14982,7 +15108,7 @@
                 <w:sz w:val="22"/>
                 <w:szCs w:val="22"/>
               </w:rPr>
-              <w:t xml:space="preserve">57,6% (72/125)</w:t>
+              <w:t xml:space="preserve">53,6%; 44,7%; 0,487</w:t>
             </w:r>
           </w:p>
         </w:tc>
@@ -15008,7 +15134,7 @@
                 <w:sz w:val="22"/>
                 <w:szCs w:val="22"/>
               </w:rPr>
-              <w:t xml:space="preserve">Precision; số được chọn / chọn nhầm</w:t>
+              <w:t xml:space="preserve">Accuracy; % khách được chọn</w:t>
             </w:r>
           </w:p>
         </w:tc>
@@ -15028,7 +15154,7 @@
                 <w:sz w:val="22"/>
                 <w:szCs w:val="22"/>
               </w:rPr>
-              <w:t xml:space="preserve">61,0%; 41 / 16</w:t>
+              <w:t xml:space="preserve">81,4%; 9,0%</w:t>
             </w:r>
           </w:p>
         </w:tc>
@@ -15048,7 +15174,7 @@
                 <w:sz w:val="22"/>
                 <w:szCs w:val="22"/>
               </w:rPr>
-              <w:t xml:space="preserve">42,1%; 171 / 99</w:t>
+              <w:t xml:space="preserve">76,4%; 25,1%</w:t>
             </w:r>
           </w:p>
         </w:tc>
@@ -15074,7 +15200,7 @@
                 <w:sz w:val="22"/>
                 <w:szCs w:val="22"/>
               </w:rPr>
-              <w:t xml:space="preserve">% khách được chọn</w:t>
+              <w:t xml:space="preserve">AUC; Brier score (mô hình hằng số: 0,165)</w:t>
             </w:r>
           </w:p>
         </w:tc>
@@ -15094,7 +15220,7 @@
                 <w:sz w:val="22"/>
                 <w:szCs w:val="22"/>
               </w:rPr>
-              <w:t xml:space="preserve">6,9%</w:t>
+              <w:t xml:space="preserve">0,746; 0,138</w:t>
             </w:r>
           </w:p>
         </w:tc>
@@ -15114,7 +15240,7 @@
                 <w:sz w:val="22"/>
                 <w:szCs w:val="22"/>
               </w:rPr>
-              <w:t xml:space="preserve">28,6%</w:t>
+              <w:t xml:space="preserve">0,746; 0,138</w:t>
             </w:r>
           </w:p>
         </w:tc>
@@ -15141,7 +15267,7 @@
         <w:spacing w:after="240" w:line="240" w:lineRule="auto"/>
       </w:pPr>
       <w:r>
-        <w:t xml:space="preserve">Mô hình “không ai chấp nhận” đã có 79,0% accuracy, nên recall và precision phù hợp hơn: ở ngưỡng 0,3, precision 42,1% gấp đôi tỷ lệ chung 21,0%. Cây quyết định 3 tầng (mỗi lá ≥ 30 khách) có AUC 0,737 trên cùng tập kiểm tra, nên logistic nhỉnh hơn trên tập này. Cây dùng thêm tổng chi tiêu, số đơn catalog và thâm niên, cũng có thể chịu rò rỉ thời gian; sau khi đánh giá, cây được huấn luyện lại trên 1.992 khách để hiển thị (Hình 6.1).</w:t>
+        <w:t xml:space="preserve">Mô hình “không ai chấp nhận” đã có 79,1% accuracy, nên F1, recall và precision phù hợp hơn: ở ngưỡng 0,3, precision 44,7% gấp đôi tỷ lệ chung 21,0%. AUC 0,746 chỉ cho biết khả năng phân biệt tương đối trên tập kiểm tra này. Về hiệu chỉnh, chia tập kiểm tra thành 5 nhóm điểm, xác suất dự báo trung bình và tỷ lệ thực tế khá gần ở ba nhóm giữa và nhóm cao nhất (0,50 so với 0,50), nhưng thấp hơn thực tế ở nhóm thấp nhất (0,04 so với 0,08) và cao hơn ở nhóm thứ tư (0,27 so với 0,21); kết hợp với Hosmer-Lemeshow, xác suất cần được hiệu chỉnh lại trước khi dùng làm ngưỡng ngân sách. Cây quyết định 3 tầng (mỗi lá ≥ 30 khách) có AUC 0,739 trên cùng tập kiểm tra, nên logistic chỉ nhỉnh hơn một chút. Cây dùng thêm tổng chi tiêu, số đơn catalog và thâm niên, cũng có thể chịu rò rỉ thời gian; sau khi đánh giá, cây được huấn luyện lại trên 1.992 khách để hiển thị (Hình 6.1).</w:t>
       </w:r>
     </w:p>
     <w:p>
@@ -15182,7 +15308,7 @@
         </w:rPr>
         <w:drawing>
           <wp:inline distT="0" distB="0" distL="0" distR="0">
-            <wp:extent cx="4114800" cy="2598821"/>
+            <wp:extent cx="5760720" cy="3638349"/>
             <wp:effectExtent l="0" t="0" r="0" b="0"/>
             <wp:docPr id="108" name="Picture 108"/>
             <wp:cNvGraphicFramePr>
@@ -15204,7 +15330,7 @@
                   <pic:spPr>
                     <a:xfrm>
                       <a:off x="0" y="0"/>
-                      <a:ext cx="4114800" cy="2598821"/>
+                      <a:ext cx="5760720" cy="3638349"/>
                     </a:xfrm>
                     <a:prstGeom prst="rect">
                       <a:avLst/>
@@ -15273,7 +15399,7 @@
         <w:t xml:space="preserve">Nhắm mục tiêu:</w:t>
       </w:r>
       <w:r>
-        <w:t xml:space="preserve"> xếp hạng 1.992 khách theo xác suất OOF, 30% khách điểm cao nhất chứa 62,2% số khách đã từng chấp nhận (lift 2,1). Đây là bằng chứng về khả năng xếp hạng, không phải về ngưỡng 0,3 (chọn 28,6% khách). Nếu chi phí chủ yếu biến đổi theo lượt gửi và phản hồi lịch sử phản ánh phản hồi tương lai, gửi cho 30% khách giảm khoảng 70% chi phí biến đổi. Mô hình đo khả năng phản hồi sẵn có, chưa đo phần tăng thêm nhờ chiến dịch (uplift).</w:t>
+        <w:t xml:space="preserve"> xếp hạng 1.992 khách theo xác suất OOF, 20% khách điểm cao nhất chứa 47,4% số khách đã từng chấp nhận (lift 2,4) và 30% chứa 60,3% (lift 2,0). Đây là bằng chứng về khả năng xếp hạng trên dữ liệu lịch sử, không phải về ngưỡng 0,3 (ngưỡng này chọn 25,1% khách trên tập kiểm tra). Nếu chi phí chủ yếu biến đổi theo lượt gửi và phản hồi lịch sử phản ánh phản hồi tương lai, gửi cho 30% khách giảm khoảng 70% chi phí biến đổi. Mô hình đo khả năng phản hồi sẵn có, chưa đo phần tăng thêm nhờ chiến dịch (uplift).</w:t>
       </w:r>
     </w:p>
     <w:p>
@@ -15317,7 +15443,7 @@
         <w:spacing w:after="240" w:line="240" w:lineRule="auto"/>
       </w:pPr>
       <w:r>
-        <w:t xml:space="preserve">Các đề xuất là giả thuyết hành động cần kiểm chứng. Bảng 7.1 nêu căn cứ, thiết kế thử nghiệm và KPI có mẫu số rõ ràng.</w:t>
+        <w:t xml:space="preserve">Các đề xuất là giả thuyết hành động cần kiểm chứng. Các con số chi tiêu là chi tiêu đã ghi nhận, không phải doanh thu có thể giữ lại hay lợi nhuận; để quyết định triển khai còn cần biên lợi nhuận, chi phí quà tặng hoặc giảm giá, chi phí liên hệ và phần mua thêm do can thiệp tạo ra. Bảng 7.1 nêu căn cứ, thiết kế thử nghiệm và KPI có mẫu số rõ ràng.</w:t>
       </w:r>
     </w:p>
     <w:p>
@@ -15532,7 +15658,7 @@
                 <w:sz w:val="22"/>
                 <w:szCs w:val="22"/>
               </w:rPr>
-              <w:t xml:space="preserve">446.346 ĐVTT (39,6%); VIP 252.404 ĐVTT (22,4%). Giả định: khách chưa rời bỏ hẳn</w:t>
+              <w:t xml:space="preserve">Nhóm nắm 446.346 ĐVTT chi tiêu lịch sử (39,6%); VIP 252.404 ĐVTT (22,4%). Giả định: khách chưa rời bỏ hẳn</w:t>
             </w:r>
           </w:p>
         </w:tc>
@@ -15552,7 +15678,7 @@
                 <w:sz w:val="22"/>
                 <w:szCs w:val="22"/>
               </w:rPr>
-              <w:t xml:space="preserve">Chia ngẫu nhiên 240 tác động / 240 đối chứng (phân tầng VIP); với tỷ lệ quay lại tự nhiên giả định 10%, phát hiện được mức tăng khoảng 9 điểm % (lực 80%, α = 0,05). KPI: số khách mua lại trong 60 ngày ÷ số khách mỗi nhóm. Marketing CRM, tháng 1-3</w:t>
+              <w:t xml:space="preserve">Chia ngẫu nhiên 240 tác động / 240 đối chứng (phân tầng VIP). Nếu tỷ lệ mua tự nhiên đúng là 10%, cỡ mẫu này có lực khoảng 80% (α = 0,05) để phát hiện mức tăng 9 điểm % cho toàn nhóm; 166 VIP chỉ đủ phát hiện khoảng 17 điểm %, nên kết quả riêng của VIP chỉ mang tính mô tả. KPI chính: tỷ lệ mua trong 60 ngày (số khách mua ÷ số khách mỗi nhóm); KPI phụ: chi tiêu và lãi góp tăng thêm mỗi khách sau chi phí. Marketing CRM, tháng 1-3</w:t>
             </w:r>
           </w:p>
         </w:tc>
@@ -15618,7 +15744,7 @@
                 <w:sz w:val="22"/>
                 <w:szCs w:val="22"/>
               </w:rPr>
-              <w:t xml:space="preserve">Lift top 30% = 2,1 trên dữ liệu lịch sử. Giả định: phản hồi lịch sử phản ánh tương lai</w:t>
+              <w:t xml:space="preserve">Lift top 30% = 2,0 trên dữ liệu lịch sử. Giả định: phản hồi lịch sử phản ánh tương lai; điểm chỉ dùng biến có trước chiến dịch</w:t>
             </w:r>
           </w:p>
         </w:tc>
@@ -15638,7 +15764,7 @@
                 <w:sz w:val="22"/>
                 <w:szCs w:val="22"/>
               </w:rPr>
-              <w:t xml:space="preserve">Gửi nhóm điểm cao và một nhóm ngẫu nhiên cùng cỡ; KPI: số chấp nhận ÷ số khách được gửi, so hai nhóm. Marketing và Phân tích, chiến dịch kế tiếp</w:t>
+              <w:t xml:space="preserve">Trước chiến dịch, chia ngẫu nhiên toàn bộ khách thành 3 nhánh không trùng nhau, phân tầng theo nhóm điểm: A gửi cho 30% điểm cao nhất trong nhánh, B gửi cho 30% chọn ngẫu nhiên trong nhánh, C không gửi (hoặc nhận phương án chuẩn). KPI tính trên mọi khách của nhánh: mua hàng và lãi góp mỗi khách sau chi phí; so A với C trong từng tầng điểm để ước lượng phần tăng thêm (uplift). Marketing và Phân tích, chiến dịch kế tiếp</w:t>
             </w:r>
           </w:p>
         </w:tc>
@@ -15724,7 +15850,7 @@
                 <w:sz w:val="22"/>
                 <w:szCs w:val="22"/>
               </w:rPr>
-              <w:t xml:space="preserve">A/B quà tặng và giảm giá; KPI: % vẫn có R ≥ 4 sau 3 tháng. Marketing CRM, tháng 2-4</w:t>
+              <w:t xml:space="preserve">A/B quà tặng và giảm giá; KPI: tỷ lệ mua lại thực tế trong 90 ngày, kèm % vẫn có R ≥ 4 theo ngưỡng cố định của kỳ gốc. Marketing CRM, tháng 2-4</w:t>
             </w:r>
           </w:p>
         </w:tc>
@@ -15770,7 +15896,7 @@
                 <w:sz w:val="22"/>
                 <w:szCs w:val="22"/>
               </w:rPr>
-              <w:t xml:space="preserve">Gói bữa ăn gia đình cho 946 hộ có con</w:t>
+              <w:t xml:space="preserve">Gói bữa ăn gia đình cho 946 khách có ghi nhận con</w:t>
             </w:r>
           </w:p>
         </w:tc>
@@ -15810,7 +15936,7 @@
                 <w:sz w:val="22"/>
                 <w:szCs w:val="22"/>
               </w:rPr>
-              <w:t xml:space="preserve">Thí điểm ngẫu nhiên; KPI: chi tiêu TB mỗi hộ so với đối chứng. Sản phẩm, tháng 3-5</w:t>
+              <w:t xml:space="preserve">Thí điểm ngẫu nhiên; KPI: chi tiêu TB mỗi khách so với nhóm đối chứng. Sản phẩm, tháng 3-5</w:t>
             </w:r>
           </w:p>
         </w:tc>
@@ -15962,7 +16088,7 @@
                 <w:sz w:val="22"/>
                 <w:szCs w:val="22"/>
               </w:rPr>
-              <w:t xml:space="preserve">Khách ≥ 40% đơn giảm giá: 22,1% khách, 6,2% chi tiêu</w:t>
+              <w:t xml:space="preserve">Khách ≥ 40% đơn giảm giá: 22,1% khách, 6,2% chi tiêu; chưa có dữ liệu biên lợi nhuận nên không kết luận nhóm này sinh lợi kém</w:t>
             </w:r>
           </w:p>
         </w:tc>
@@ -16035,7 +16161,7 @@
         <w:t xml:space="preserve">Kết luận.</w:t>
       </w:r>
       <w:r>
-        <w:t xml:space="preserve"> (1) 20% khách tạo 53,4% tổng chi tiêu; nhóm thu nhập 70-90K và hộ không con đóng góp lớn nhất. (2) Khi xét đồng thời, thu nhập (co giãn 2,31), số con nhỏ (-44% mỗi trẻ), số con teen (-20%), tỷ lệ mua giảm giá và thâm niên gắn rõ với chi tiêu; chưa tìm thấy bằng chứng về liên hệ riêng của tuổi, học vấn, lượt truy cập web và recency. (3) CD2 có tỷ lệ chấp nhận trên toàn mẫu thấp nhất; khách chấp nhận tập trung ở nhóm thu nhập cao (OR = 1,91 mỗi 10.000 ĐVTT). (4) Nên thử nghiệm win-back có đối chứng với 480 khách At Risk (39,6% chi tiêu lịch sử) và xếp hạng khách trước chiến dịch.</w:t>
+        <w:t xml:space="preserve"> (1) 20% khách tạo 53,4% tổng chi tiêu; nhóm thu nhập 70-90K và khách không có con đóng góp lớn nhất. (2) Khi xét đồng thời, thu nhập (co giãn 2,31), số con nhỏ (-44% mỗi trẻ), số con teen (-20%), tỷ lệ mua giảm giá và thâm niên gắn rõ với chi tiêu; chưa tìm thấy bằng chứng về liên hệ riêng của tuổi, học vấn, lượt truy cập web và recency. (3) CD2 có tỷ lệ chấp nhận trên toàn mẫu thấp nhất; khách chấp nhận tập trung ở nhóm thu nhập cao (OR = 1,91 mỗi 10.000 ĐVTT). (4) Nên thử nghiệm win-back có đối chứng với 480 khách At Risk (39,6% chi tiêu lịch sử) và xếp hạng khách trước chiến dịch.</w:t>
       </w:r>
     </w:p>
     <w:p>
@@ -16269,7 +16395,17 @@
         <w:jc w:val="left"/>
       </w:pPr>
       <w:r>
-        <w:t xml:space="preserve">Phụ lục. Công thức DAX đầy đủ</w:t>
+        <w:t xml:space="preserve">Phụ lục</w:t>
+      </w:r>
+    </w:p>
+    <w:p>
+      <w:pPr>
+        <w:pStyle w:val="Heading2"/>
+        <w:spacing w:before="120" w:after="240" w:line="240" w:lineRule="auto"/>
+        <w:jc w:val="left"/>
+      </w:pPr>
+      <w:r>
+        <w:t xml:space="preserve">Phụ lục 1. Một số công thức DAX tiêu biểu</w:t>
       </w:r>
     </w:p>
     <w:p>
@@ -16277,19 +16413,7 @@
         <w:spacing w:after="240" w:line="240" w:lineRule="auto"/>
       </w:pPr>
       <w:r>
-        <w:t xml:space="preserve">Trích nguyên văn từ file mon.pbix. TOPN trả về mọi khách bằng giá trị tại ranh giới; trên 1.992 khách, khách thứ 398 và 399 chi 1.101 và 1.099 ĐVTT nên không có giá trị bằng nhau và kết quả đúng là 53,4%.</w:t>
-      </w:r>
-    </w:p>
-    <w:p>
-      <w:pPr>
-        <w:spacing w:after="240" w:line="240" w:lineRule="auto"/>
-      </w:pPr>
-      <w:r>
-        <w:rPr>
-          <w:b/>
-          <w:bCs/>
-        </w:rPr>
-        <w:t xml:space="preserve">Top 20% khách chiếm % doanh thu</w:t>
+        <w:t xml:space="preserve">Các measure dưới đây tạo nên các thẻ KPI và hình chính. Công thức được trích từ mô hình dữ liệu của mon.pbix bằng thư viện pbixray (Python); riêng measure thu nhập của khách chấp nhận là công thức đã sửa để tính theo khách, và các tên measure là tên sau khi đổi để khớp với báo cáo.</w:t>
       </w:r>
     </w:p>
     <w:p>
@@ -16304,7 +16428,7 @@
           <w:sz w:val="19"/>
           <w:szCs w:val="19"/>
         </w:rPr>
-        <w:t xml:space="preserve">VAR _all = CALCULATETABLE(Customers, ALLSELECTED(Customers))</w:t>
+        <w:t xml:space="preserve">Số khách hàng = COUNTROWS(Customers)</w:t>
       </w:r>
     </w:p>
     <w:p>
@@ -16319,7 +16443,7 @@
           <w:sz w:val="19"/>
           <w:szCs w:val="19"/>
         </w:rPr>
-        <w:t xml:space="preserve">VAR _n = ROUND(COUNTROWS(_all) * 0.2, 0)</w:t>
+        <w:t xml:space="preserve">Tổng chi tiêu = SUM(Customers[Total_Spend])</w:t>
       </w:r>
     </w:p>
     <w:p>
@@ -16334,7 +16458,7 @@
           <w:sz w:val="19"/>
           <w:szCs w:val="19"/>
         </w:rPr>
-        <w:t xml:space="preserve">VAR _top = TOPN(_n, _all, Customers[Total_Spend], DESC)</w:t>
+        <w:t xml:space="preserve">AOV (giá trị TB/đơn) = DIVIDE([Tổng chi tiêu], [Tổng số đơn])</w:t>
       </w:r>
     </w:p>
     <w:p>
@@ -16349,7 +16473,7 @@
           <w:sz w:val="19"/>
           <w:szCs w:val="19"/>
         </w:rPr>
-        <w:t xml:space="preserve">RETURN</w:t>
+        <w:t xml:space="preserve">Khách phản hồi CD = CALCULATE([Số khách hàng], Customers[Campaign_Responder] = 1)</w:t>
       </w:r>
     </w:p>
     <w:p>
@@ -16364,7 +16488,7 @@
           <w:sz w:val="19"/>
           <w:szCs w:val="19"/>
         </w:rPr>
-        <w:t xml:space="preserve">    DIVIDE(SUMX(_top, Customers[Total_Spend]), SUMX(_all, Customers[Total_Spend]))</w:t>
+        <w:t xml:space="preserve">Tỷ lệ phản hồi CD = DIVIDE([Khách phản hồi CD], [Số khách hàng])</w:t>
       </w:r>
     </w:p>
     <w:p>
@@ -16376,7 +16500,10 @@
           <w:b/>
           <w:bCs/>
         </w:rPr>
-        <w:t xml:space="preserve">% doanh thu lũy kế</w:t>
+        <w:t xml:space="preserve">Top 20% khách chiếm % doanh thu</w:t>
+      </w:r>
+      <w:r>
+        <w:t xml:space="preserve"> (TOPN trả về mọi khách bằng giá trị tại ranh giới; trên 1.992 khách, khách thứ 398 và 399 chi 1.101 và 1.099 ĐVTT nên không có giá trị bằng nhau và kết quả là 53,4%):</w:t>
       </w:r>
     </w:p>
     <w:p>
@@ -16391,7 +16518,7 @@
           <w:sz w:val="19"/>
           <w:szCs w:val="19"/>
         </w:rPr>
-        <w:t xml:space="preserve">VAR _d = MAX(Customers[Spend_Decile])</w:t>
+        <w:t xml:space="preserve">VAR _all = CALCULATETABLE(Customers, ALLSELECTED(Customers))</w:t>
       </w:r>
     </w:p>
     <w:p>
@@ -16406,7 +16533,7 @@
           <w:sz w:val="19"/>
           <w:szCs w:val="19"/>
         </w:rPr>
-        <w:t xml:space="preserve">RETURN</w:t>
+        <w:t xml:space="preserve">VAR _n = ROUND(COUNTROWS(_all) * 0.2, 0)</w:t>
       </w:r>
     </w:p>
     <w:p>
@@ -16421,7 +16548,7 @@
           <w:sz w:val="19"/>
           <w:szCs w:val="19"/>
         </w:rPr>
-        <w:t xml:space="preserve">    DIVIDE(</w:t>
+        <w:t xml:space="preserve">VAR _top = TOPN(_n, _all, Customers[Total_Spend], DESC)</w:t>
       </w:r>
     </w:p>
     <w:p>
@@ -16436,7 +16563,34 @@
           <w:sz w:val="19"/>
           <w:szCs w:val="19"/>
         </w:rPr>
-        <w:t xml:space="preserve">        CALCULATE([Tổng chi tiêu], REMOVEFILTERS(Customers[Spend_Decile_Label]), Customers[Spend_Decile] &lt;= _d),</w:t>
+        <w:t xml:space="preserve">RETURN</w:t>
+      </w:r>
+    </w:p>
+    <w:p>
+      <w:pPr>
+        <w:spacing w:after="200" w:line="240" w:lineRule="auto"/>
+        <w:ind w:left="360" w:firstLine="0"/>
+        <w:jc w:val="left"/>
+      </w:pPr>
+      <w:r>
+        <w:rPr>
+          <w:rFonts w:ascii="Courier New" w:hAnsi="Courier New" w:cs="Courier New"/>
+          <w:sz w:val="19"/>
+          <w:szCs w:val="19"/>
+        </w:rPr>
+        <w:t xml:space="preserve">    DIVIDE(SUMX(_top, Customers[Total_Spend]), SUMX(_all, Customers[Total_Spend]))</w:t>
+      </w:r>
+    </w:p>
+    <w:p>
+      <w:pPr>
+        <w:spacing w:after="240" w:line="240" w:lineRule="auto"/>
+      </w:pPr>
+      <w:r>
+        <w:rPr>
+          <w:b/>
+          <w:bCs/>
+        </w:rPr>
+        <w:t xml:space="preserve">% doanh thu lũy kế:</w:t>
       </w:r>
     </w:p>
     <w:p>
@@ -16451,6 +16605,66 @@
           <w:sz w:val="19"/>
           <w:szCs w:val="19"/>
         </w:rPr>
+        <w:t xml:space="preserve">VAR _d = MAX(Customers[Spend_Decile])</w:t>
+      </w:r>
+    </w:p>
+    <w:p>
+      <w:pPr>
+        <w:spacing w:after="0" w:line="240" w:lineRule="auto"/>
+        <w:ind w:left="360" w:firstLine="0"/>
+        <w:jc w:val="left"/>
+      </w:pPr>
+      <w:r>
+        <w:rPr>
+          <w:rFonts w:ascii="Courier New" w:hAnsi="Courier New" w:cs="Courier New"/>
+          <w:sz w:val="19"/>
+          <w:szCs w:val="19"/>
+        </w:rPr>
+        <w:t xml:space="preserve">RETURN</w:t>
+      </w:r>
+    </w:p>
+    <w:p>
+      <w:pPr>
+        <w:spacing w:after="0" w:line="240" w:lineRule="auto"/>
+        <w:ind w:left="360" w:firstLine="0"/>
+        <w:jc w:val="left"/>
+      </w:pPr>
+      <w:r>
+        <w:rPr>
+          <w:rFonts w:ascii="Courier New" w:hAnsi="Courier New" w:cs="Courier New"/>
+          <w:sz w:val="19"/>
+          <w:szCs w:val="19"/>
+        </w:rPr>
+        <w:t xml:space="preserve">    DIVIDE(</w:t>
+      </w:r>
+    </w:p>
+    <w:p>
+      <w:pPr>
+        <w:spacing w:after="0" w:line="240" w:lineRule="auto"/>
+        <w:ind w:left="360" w:firstLine="0"/>
+        <w:jc w:val="left"/>
+      </w:pPr>
+      <w:r>
+        <w:rPr>
+          <w:rFonts w:ascii="Courier New" w:hAnsi="Courier New" w:cs="Courier New"/>
+          <w:sz w:val="19"/>
+          <w:szCs w:val="19"/>
+        </w:rPr>
+        <w:t xml:space="preserve">        CALCULATE([Tổng chi tiêu], REMOVEFILTERS(Customers[Spend_Decile_Label]), Customers[Spend_Decile] &lt;= _d),</w:t>
+      </w:r>
+    </w:p>
+    <w:p>
+      <w:pPr>
+        <w:spacing w:after="0" w:line="240" w:lineRule="auto"/>
+        <w:ind w:left="360" w:firstLine="0"/>
+        <w:jc w:val="left"/>
+      </w:pPr>
+      <w:r>
+        <w:rPr>
+          <w:rFonts w:ascii="Courier New" w:hAnsi="Courier New" w:cs="Courier New"/>
+          <w:sz w:val="19"/>
+          <w:szCs w:val="19"/>
+        </w:rPr>
         <w:t xml:space="preserve">        CALCULATE([Tổng chi tiêu], REMOVEFILTERS(Customers[Spend_Decile_Label], Customers[Spend_Decile]))</w:t>
       </w:r>
     </w:p>
@@ -16467,6 +16681,697 @@
           <w:szCs w:val="19"/>
         </w:rPr>
         <w:t xml:space="preserve">    )</w:t>
+      </w:r>
+    </w:p>
+    <w:p>
+      <w:pPr>
+        <w:spacing w:after="240" w:line="240" w:lineRule="auto"/>
+      </w:pPr>
+      <w:r>
+        <w:rPr>
+          <w:b/>
+          <w:bCs/>
+        </w:rPr>
+        <w:t xml:space="preserve">Thu nhập TB khách chấp nhận CD</w:t>
+      </w:r>
+      <w:r>
+        <w:t xml:space="preserve"> (theo khách) và các measure của trang RFM:</w:t>
+      </w:r>
+    </w:p>
+    <w:p>
+      <w:pPr>
+        <w:spacing w:after="0" w:line="240" w:lineRule="auto"/>
+        <w:ind w:left="360" w:firstLine="0"/>
+        <w:jc w:val="left"/>
+      </w:pPr>
+      <w:r>
+        <w:rPr>
+          <w:rFonts w:ascii="Courier New" w:hAnsi="Courier New" w:cs="Courier New"/>
+          <w:sz w:val="19"/>
+          <w:szCs w:val="19"/>
+        </w:rPr>
+        <w:t xml:space="preserve">VAR _kh = FILTER(VALUES(Customers[CustomerID]),</w:t>
+      </w:r>
+    </w:p>
+    <w:p>
+      <w:pPr>
+        <w:spacing w:after="0" w:line="240" w:lineRule="auto"/>
+        <w:ind w:left="360" w:firstLine="0"/>
+        <w:jc w:val="left"/>
+      </w:pPr>
+      <w:r>
+        <w:rPr>
+          <w:rFonts w:ascii="Courier New" w:hAnsi="Courier New" w:cs="Courier New"/>
+          <w:sz w:val="19"/>
+          <w:szCs w:val="19"/>
+        </w:rPr>
+        <w:t xml:space="preserve">    CALCULATE(MAX(Campaign_Response[Accepted])) = 1)</w:t>
+      </w:r>
+    </w:p>
+    <w:p>
+      <w:pPr>
+        <w:spacing w:after="0" w:line="240" w:lineRule="auto"/>
+        <w:ind w:left="360" w:firstLine="0"/>
+        <w:jc w:val="left"/>
+      </w:pPr>
+      <w:r>
+        <w:rPr>
+          <w:rFonts w:ascii="Courier New" w:hAnsi="Courier New" w:cs="Courier New"/>
+          <w:sz w:val="19"/>
+          <w:szCs w:val="19"/>
+        </w:rPr>
+        <w:t xml:space="preserve">RETURN CALCULATE(AVERAGE(Customers[Income]), _kh)</w:t>
+      </w:r>
+    </w:p>
+    <w:p>
+      <w:pPr>
+        <w:spacing w:after="0" w:line="240" w:lineRule="auto"/>
+        <w:ind w:left="360" w:firstLine="0"/>
+        <w:jc w:val="left"/>
+      </w:pPr>
+      <w:r>
+        <w:rPr>
+          <w:rFonts w:ascii="Courier New" w:hAnsi="Courier New" w:cs="Courier New"/>
+          <w:sz w:val="19"/>
+          <w:szCs w:val="19"/>
+        </w:rPr>
+        <w:t xml:space="preserve"/>
+      </w:r>
+    </w:p>
+    <w:p>
+      <w:pPr>
+        <w:spacing w:after="0" w:line="240" w:lineRule="auto"/>
+        <w:ind w:left="360" w:firstLine="0"/>
+        <w:jc w:val="left"/>
+      </w:pPr>
+      <w:r>
+        <w:rPr>
+          <w:rFonts w:ascii="Courier New" w:hAnsi="Courier New" w:cs="Courier New"/>
+          <w:sz w:val="19"/>
+          <w:szCs w:val="19"/>
+        </w:rPr>
+        <w:t xml:space="preserve">Chi tiêu lịch sử nhóm At Risk = CALCULATE([Tổng chi tiêu], Customers[RFM_Segment] = "At Risk")</w:t>
+      </w:r>
+    </w:p>
+    <w:p>
+      <w:pPr>
+        <w:spacing w:after="0" w:line="240" w:lineRule="auto"/>
+        <w:ind w:left="360" w:firstLine="0"/>
+        <w:jc w:val="left"/>
+      </w:pPr>
+      <w:r>
+        <w:rPr>
+          <w:rFonts w:ascii="Courier New" w:hAnsi="Courier New" w:cs="Courier New"/>
+          <w:sz w:val="19"/>
+          <w:szCs w:val="19"/>
+        </w:rPr>
+        <w:t xml:space="preserve">Khách VIP đang At Risk = CALCULATE([Số khách hàng], Customers[RFM_Segment] = "At Risk", Customers[Value_Tier] = "High")</w:t>
+      </w:r>
+    </w:p>
+    <w:p>
+      <w:pPr>
+        <w:spacing w:after="0" w:line="240" w:lineRule="auto"/>
+        <w:ind w:left="360" w:firstLine="0"/>
+        <w:jc w:val="left"/>
+      </w:pPr>
+      <w:r>
+        <w:rPr>
+          <w:rFonts w:ascii="Courier New" w:hAnsi="Courier New" w:cs="Courier New"/>
+          <w:sz w:val="19"/>
+          <w:szCs w:val="19"/>
+        </w:rPr>
+        <w:t xml:space="preserve">Tỷ lệ win-back = SELECTEDVALUE('Winback Rate'[Winback Rate], 0.1)</w:t>
+      </w:r>
+    </w:p>
+    <w:p>
+      <w:pPr>
+        <w:spacing w:after="200" w:line="240" w:lineRule="auto"/>
+        <w:ind w:left="360" w:firstLine="0"/>
+        <w:jc w:val="left"/>
+      </w:pPr>
+      <w:r>
+        <w:rPr>
+          <w:rFonts w:ascii="Courier New" w:hAnsi="Courier New" w:cs="Courier New"/>
+          <w:sz w:val="19"/>
+          <w:szCs w:val="19"/>
+        </w:rPr>
+        <w:t xml:space="preserve">Chi tiêu lịch sử theo kịch bản win-back = [Chi tiêu lịch sử nhóm At Risk] * [Tỷ lệ win-back]</w:t>
+      </w:r>
+    </w:p>
+    <w:p>
+      <w:pPr>
+        <w:pStyle w:val="Heading2"/>
+        <w:spacing w:before="120" w:after="240" w:line="240" w:lineRule="auto"/>
+        <w:jc w:val="left"/>
+      </w:pPr>
+      <w:r>
+        <w:t xml:space="preserve">Phụ lục 2. Quan hệ bảng và quy tắc xử lý dữ liệu</w:t>
+      </w:r>
+    </w:p>
+    <w:p>
+      <w:pPr>
+        <w:keepNext/>
+        <w:keepLines/>
+        <w:spacing w:after="120" w:line="240" w:lineRule="auto"/>
+        <w:ind w:firstLine="0"/>
+        <w:jc w:val="center"/>
+      </w:pPr>
+      <w:r>
+        <w:rPr>
+          <w:b/>
+          <w:bCs/>
+          <w:sz w:val="24"/>
+          <w:szCs w:val="24"/>
+        </w:rPr>
+        <w:t xml:space="preserve">Bảng PL1.</w:t>
+      </w:r>
+      <w:r>
+        <w:rPr>
+          <w:sz w:val="24"/>
+          <w:szCs w:val="24"/>
+        </w:rPr>
+        <w:t xml:space="preserve"> Quan hệ giữa các bảng trong mô hình</w:t>
+      </w:r>
+    </w:p>
+    <w:tbl>
+      <w:tblPr>
+        <w:tblW w:w="9360" w:type="dxa"/>
+        <w:jc w:val="center"/>
+        <w:tblBorders>
+          <w:top w:val="single" w:sz="4" w:space="0" w:color="000000"/>
+          <w:left w:val="single" w:sz="4" w:space="0" w:color="000000"/>
+          <w:bottom w:val="single" w:sz="4" w:space="0" w:color="000000"/>
+          <w:right w:val="single" w:sz="4" w:space="0" w:color="000000"/>
+          <w:insideH w:val="single" w:sz="4" w:space="0" w:color="000000"/>
+          <w:insideV w:val="single" w:sz="4" w:space="0" w:color="000000"/>
+        </w:tblBorders>
+        <w:tblLayout w:type="fixed"/>
+        <w:tblCellMar>
+          <w:top w:w="40" w:type="dxa"/>
+          <w:left w:w="80" w:type="dxa"/>
+          <w:bottom w:w="40" w:type="dxa"/>
+          <w:right w:w="80" w:type="dxa"/>
+        </w:tblCellMar>
+        <w:tblLook w:val="04A0" w:firstRow="1" w:lastRow="0" w:firstColumn="1" w:lastColumn="0" w:noHBand="0" w:noVBand="1"/>
+      </w:tblPr>
+      <w:tblGrid>
+        <w:gridCol w:w="3500"/>
+        <w:gridCol w:w="3100"/>
+        <w:gridCol w:w="2760"/>
+      </w:tblGrid>
+      <w:tr>
+        <w:trPr>
+          <w:cantSplit/>
+          <w:tblHeader/>
+          <w:jc w:val="center"/>
+        </w:trPr>
+        <w:tc>
+          <w:tcPr>
+            <w:tcW w:w="3500" w:type="dxa"/>
+            <w:shd w:val="clear" w:color="auto" w:fill="F2F2F2"/>
+            <w:vAlign w:val="center"/>
+          </w:tcPr>
+          <w:p>
+            <w:pPr>
+              <w:spacing w:line="240" w:lineRule="auto"/>
+              <w:ind w:firstLine="0"/>
+              <w:jc w:val="center"/>
+            </w:pPr>
+            <w:r>
+              <w:rPr>
+                <w:b/>
+                <w:bCs/>
+                <w:sz w:val="22"/>
+                <w:szCs w:val="22"/>
+              </w:rPr>
+              <w:t xml:space="preserve">Bảng phía nhiều</w:t>
+            </w:r>
+          </w:p>
+        </w:tc>
+        <w:tc>
+          <w:tcPr>
+            <w:tcW w:w="3100" w:type="dxa"/>
+            <w:shd w:val="clear" w:color="auto" w:fill="F2F2F2"/>
+            <w:vAlign w:val="center"/>
+          </w:tcPr>
+          <w:p>
+            <w:pPr>
+              <w:spacing w:line="240" w:lineRule="auto"/>
+              <w:ind w:firstLine="0"/>
+              <w:jc w:val="center"/>
+            </w:pPr>
+            <w:r>
+              <w:rPr>
+                <w:b/>
+                <w:bCs/>
+                <w:sz w:val="22"/>
+                <w:szCs w:val="22"/>
+              </w:rPr>
+              <w:t xml:space="preserve">Bảng phía một (khóa)</w:t>
+            </w:r>
+          </w:p>
+        </w:tc>
+        <w:tc>
+          <w:tcPr>
+            <w:tcW w:w="2760" w:type="dxa"/>
+            <w:shd w:val="clear" w:color="auto" w:fill="F2F2F2"/>
+            <w:vAlign w:val="center"/>
+          </w:tcPr>
+          <w:p>
+            <w:pPr>
+              <w:spacing w:line="240" w:lineRule="auto"/>
+              <w:ind w:firstLine="0"/>
+              <w:jc w:val="center"/>
+            </w:pPr>
+            <w:r>
+              <w:rPr>
+                <w:b/>
+                <w:bCs/>
+                <w:sz w:val="22"/>
+                <w:szCs w:val="22"/>
+              </w:rPr>
+              <w:t xml:space="preserve">Kiểu, chiều lọc</w:t>
+            </w:r>
+          </w:p>
+        </w:tc>
+      </w:tr>
+      <w:tr>
+        <w:trPr>
+          <w:cantSplit/>
+          <w:jc w:val="center"/>
+        </w:trPr>
+        <w:tc>
+          <w:tcPr>
+            <w:tcW w:w="3500" w:type="dxa"/>
+            <w:vAlign w:val="center"/>
+          </w:tcPr>
+          <w:p>
+            <w:pPr>
+              <w:spacing w:line="240" w:lineRule="auto"/>
+              <w:ind w:firstLine="0"/>
+              <w:jc w:val="left"/>
+            </w:pPr>
+            <w:r>
+              <w:rPr>
+                <w:sz w:val="22"/>
+                <w:szCs w:val="22"/>
+              </w:rPr>
+              <w:t xml:space="preserve">Customers</w:t>
+            </w:r>
+          </w:p>
+        </w:tc>
+        <w:tc>
+          <w:tcPr>
+            <w:tcW w:w="3100" w:type="dxa"/>
+            <w:vAlign w:val="center"/>
+          </w:tcPr>
+          <w:p>
+            <w:pPr>
+              <w:spacing w:line="240" w:lineRule="auto"/>
+              <w:ind w:firstLine="0"/>
+              <w:jc w:val="left"/>
+            </w:pPr>
+            <w:r>
+              <w:rPr>
+                <w:sz w:val="22"/>
+                <w:szCs w:val="22"/>
+              </w:rPr>
+              <w:t xml:space="preserve">Dim_IncomeGroup (Income_Group)</w:t>
+            </w:r>
+          </w:p>
+        </w:tc>
+        <w:tc>
+          <w:tcPr>
+            <w:tcW w:w="2760" w:type="dxa"/>
+            <w:vAlign w:val="center"/>
+          </w:tcPr>
+          <w:p>
+            <w:pPr>
+              <w:spacing w:line="240" w:lineRule="auto"/>
+              <w:ind w:firstLine="0"/>
+              <w:jc w:val="left"/>
+            </w:pPr>
+            <w:r>
+              <w:rPr>
+                <w:sz w:val="22"/>
+                <w:szCs w:val="22"/>
+              </w:rPr>
+              <w:t xml:space="preserve">Nhiều-một, lọc một chiều từ bảng chiều</w:t>
+            </w:r>
+          </w:p>
+        </w:tc>
+      </w:tr>
+      <w:tr>
+        <w:trPr>
+          <w:cantSplit/>
+          <w:jc w:val="center"/>
+        </w:trPr>
+        <w:tc>
+          <w:tcPr>
+            <w:tcW w:w="3500" w:type="dxa"/>
+            <w:vAlign w:val="center"/>
+          </w:tcPr>
+          <w:p>
+            <w:pPr>
+              <w:spacing w:line="240" w:lineRule="auto"/>
+              <w:ind w:firstLine="0"/>
+              <w:jc w:val="left"/>
+            </w:pPr>
+            <w:r>
+              <w:rPr>
+                <w:sz w:val="22"/>
+                <w:szCs w:val="22"/>
+              </w:rPr>
+              <w:t xml:space="preserve">Customers</w:t>
+            </w:r>
+          </w:p>
+        </w:tc>
+        <w:tc>
+          <w:tcPr>
+            <w:tcW w:w="3100" w:type="dxa"/>
+            <w:vAlign w:val="center"/>
+          </w:tcPr>
+          <w:p>
+            <w:pPr>
+              <w:spacing w:line="240" w:lineRule="auto"/>
+              <w:ind w:firstLine="0"/>
+              <w:jc w:val="left"/>
+            </w:pPr>
+            <w:r>
+              <w:rPr>
+                <w:sz w:val="22"/>
+                <w:szCs w:val="22"/>
+              </w:rPr>
+              <w:t xml:space="preserve">Dim_AgeGroup (Age_Group)</w:t>
+            </w:r>
+          </w:p>
+        </w:tc>
+        <w:tc>
+          <w:tcPr>
+            <w:tcW w:w="2760" w:type="dxa"/>
+            <w:vAlign w:val="center"/>
+          </w:tcPr>
+          <w:p>
+            <w:pPr>
+              <w:spacing w:line="240" w:lineRule="auto"/>
+              <w:ind w:firstLine="0"/>
+              <w:jc w:val="left"/>
+            </w:pPr>
+            <w:r>
+              <w:rPr>
+                <w:sz w:val="22"/>
+                <w:szCs w:val="22"/>
+              </w:rPr>
+              <w:t xml:space="preserve">Nhiều-một, lọc một chiều từ bảng chiều</w:t>
+            </w:r>
+          </w:p>
+        </w:tc>
+      </w:tr>
+      <w:tr>
+        <w:trPr>
+          <w:cantSplit/>
+          <w:jc w:val="center"/>
+        </w:trPr>
+        <w:tc>
+          <w:tcPr>
+            <w:tcW w:w="3500" w:type="dxa"/>
+            <w:vAlign w:val="center"/>
+          </w:tcPr>
+          <w:p>
+            <w:pPr>
+              <w:spacing w:line="240" w:lineRule="auto"/>
+              <w:ind w:firstLine="0"/>
+              <w:jc w:val="left"/>
+            </w:pPr>
+            <w:r>
+              <w:rPr>
+                <w:sz w:val="22"/>
+                <w:szCs w:val="22"/>
+              </w:rPr>
+              <w:t xml:space="preserve">Customers</w:t>
+            </w:r>
+          </w:p>
+        </w:tc>
+        <w:tc>
+          <w:tcPr>
+            <w:tcW w:w="3100" w:type="dxa"/>
+            <w:vAlign w:val="center"/>
+          </w:tcPr>
+          <w:p>
+            <w:pPr>
+              <w:spacing w:line="240" w:lineRule="auto"/>
+              <w:ind w:firstLine="0"/>
+              <w:jc w:val="left"/>
+            </w:pPr>
+            <w:r>
+              <w:rPr>
+                <w:sz w:val="22"/>
+                <w:szCs w:val="22"/>
+              </w:rPr>
+              <w:t xml:space="preserve">Dim_Segment (RFM_Segment)</w:t>
+            </w:r>
+          </w:p>
+        </w:tc>
+        <w:tc>
+          <w:tcPr>
+            <w:tcW w:w="2760" w:type="dxa"/>
+            <w:vAlign w:val="center"/>
+          </w:tcPr>
+          <w:p>
+            <w:pPr>
+              <w:spacing w:line="240" w:lineRule="auto"/>
+              <w:ind w:firstLine="0"/>
+              <w:jc w:val="left"/>
+            </w:pPr>
+            <w:r>
+              <w:rPr>
+                <w:sz w:val="22"/>
+                <w:szCs w:val="22"/>
+              </w:rPr>
+              <w:t xml:space="preserve">Nhiều-một, lọc một chiều từ bảng chiều</w:t>
+            </w:r>
+          </w:p>
+        </w:tc>
+      </w:tr>
+      <w:tr>
+        <w:trPr>
+          <w:cantSplit/>
+          <w:jc w:val="center"/>
+        </w:trPr>
+        <w:tc>
+          <w:tcPr>
+            <w:tcW w:w="3500" w:type="dxa"/>
+            <w:vAlign w:val="center"/>
+          </w:tcPr>
+          <w:p>
+            <w:pPr>
+              <w:spacing w:line="240" w:lineRule="auto"/>
+              <w:ind w:firstLine="0"/>
+              <w:jc w:val="left"/>
+            </w:pPr>
+            <w:r>
+              <w:rPr>
+                <w:sz w:val="22"/>
+                <w:szCs w:val="22"/>
+              </w:rPr>
+              <w:t xml:space="preserve">Spend_By_Category, Purchases_By_Channel, Campaign_Response</w:t>
+            </w:r>
+          </w:p>
+        </w:tc>
+        <w:tc>
+          <w:tcPr>
+            <w:tcW w:w="3100" w:type="dxa"/>
+            <w:vAlign w:val="center"/>
+          </w:tcPr>
+          <w:p>
+            <w:pPr>
+              <w:spacing w:line="240" w:lineRule="auto"/>
+              <w:ind w:firstLine="0"/>
+              <w:jc w:val="left"/>
+            </w:pPr>
+            <w:r>
+              <w:rPr>
+                <w:sz w:val="22"/>
+                <w:szCs w:val="22"/>
+              </w:rPr>
+              <w:t xml:space="preserve">Customers (CustomerID)</w:t>
+            </w:r>
+          </w:p>
+        </w:tc>
+        <w:tc>
+          <w:tcPr>
+            <w:tcW w:w="2760" w:type="dxa"/>
+            <w:vAlign w:val="center"/>
+          </w:tcPr>
+          <w:p>
+            <w:pPr>
+              <w:spacing w:line="240" w:lineRule="auto"/>
+              <w:ind w:firstLine="0"/>
+              <w:jc w:val="left"/>
+            </w:pPr>
+            <w:r>
+              <w:rPr>
+                <w:sz w:val="22"/>
+                <w:szCs w:val="22"/>
+              </w:rPr>
+              <w:t xml:space="preserve">Nhiều-một, lọc một chiều từ Customers</w:t>
+            </w:r>
+          </w:p>
+        </w:tc>
+      </w:tr>
+    </w:tbl>
+    <w:p>
+      <w:pPr>
+        <w:spacing w:after="240" w:line="240" w:lineRule="auto"/>
+        <w:ind w:firstLine="0"/>
+        <w:jc w:val="left"/>
+      </w:pPr>
+      <w:r>
+        <w:rPr>
+          <w:i/>
+          <w:iCs/>
+          <w:sz w:val="22"/>
+          <w:szCs w:val="22"/>
+        </w:rPr>
+        <w:t xml:space="preserve">Nguồn: Nhóm tác giả, từ file Power BI của nhóm.</w:t>
+      </w:r>
+    </w:p>
+    <w:p>
+      <w:pPr>
+        <w:tabs>
+          <w:tab w:val="left" w:pos="1080"/>
+        </w:tabs>
+        <w:spacing w:after="120" w:line="240" w:lineRule="auto"/>
+        <w:ind w:left="1080" w:hanging="360"/>
+      </w:pPr>
+      <w:r>
+        <w:t xml:space="preserve">•</w:t>
+      </w:r>
+      <w:r>
+        <w:tab/>
+      </w:r>
+      <w:r>
+        <w:rPr>
+          <w:b/>
+          <w:bCs/>
+        </w:rPr>
+        <w:t xml:space="preserve">Làm sạch (R2-R6):</w:t>
+      </w:r>
+      <w:r>
+        <w:t xml:space="preserve"> áp dụng theo thứ tự trên dữ liệu còn lại: bỏ dòng trùng 26/26 cột (giữ bản đầu); bỏ Total_Spend &gt; 0 và Total_Purchases = 0; bỏ Deals_Purchases &gt; Total_Purchases; bỏ Total_Spend ÷ Income &gt; 0,5; bỏ Web_Purchases &gt; 20 và Web_Visits_Month ≤ 1.</w:t>
+      </w:r>
+    </w:p>
+    <w:p>
+      <w:pPr>
+        <w:tabs>
+          <w:tab w:val="left" w:pos="1080"/>
+        </w:tabs>
+        <w:spacing w:after="120" w:line="240" w:lineRule="auto"/>
+        <w:ind w:left="1080" w:hanging="360"/>
+      </w:pPr>
+      <w:r>
+        <w:t xml:space="preserve">•</w:t>
+      </w:r>
+      <w:r>
+        <w:tab/>
+      </w:r>
+      <w:r>
+        <w:rPr>
+          <w:b/>
+          <w:bCs/>
+        </w:rPr>
+        <w:t xml:space="preserve">Biến dẫn xuất:</w:t>
+      </w:r>
+      <w:r>
+        <w:t xml:space="preserve"> Tenure_Years = Tenure_Days ÷ 365 (2 chữ số); AOV = Total_Spend ÷ Total_Purchases (2 chữ số); Deal_Ratio = Deals_Purchases ÷ Total_Purchases (4 chữ số); Campaign_Responder = 1 khi Total_Campaigns &gt; 0.</w:t>
+      </w:r>
+    </w:p>
+    <w:p>
+      <w:pPr>
+        <w:tabs>
+          <w:tab w:val="left" w:pos="1080"/>
+        </w:tabs>
+        <w:spacing w:after="120" w:line="240" w:lineRule="auto"/>
+        <w:ind w:left="1080" w:hanging="360"/>
+      </w:pPr>
+      <w:r>
+        <w:t xml:space="preserve">•</w:t>
+      </w:r>
+      <w:r>
+        <w:tab/>
+      </w:r>
+      <w:r>
+        <w:rPr>
+          <w:b/>
+          <w:bCs/>
+        </w:rPr>
+        <w:t xml:space="preserve">Kênh có nhiều đơn nhất:</w:t>
+      </w:r>
+      <w:r>
+        <w:t xml:space="preserve"> Web nếu Web ≥ Catalog và Web ≥ Store; ngược lại Catalog nếu Catalog ≥ Store; còn lại Store. Quy tắc cho 538 Web, 138 Catalog, 1.316 Store.</w:t>
+      </w:r>
+    </w:p>
+    <w:p>
+      <w:pPr>
+        <w:tabs>
+          <w:tab w:val="left" w:pos="1080"/>
+        </w:tabs>
+        <w:spacing w:after="240" w:line="240" w:lineRule="auto"/>
+        <w:ind w:left="1080" w:hanging="360"/>
+      </w:pPr>
+      <w:r>
+        <w:t xml:space="preserve">•</w:t>
+      </w:r>
+      <w:r>
+        <w:tab/>
+      </w:r>
+      <w:r>
+        <w:rPr>
+          <w:b/>
+          <w:bCs/>
+        </w:rPr>
+        <w:t xml:space="preserve">Điểm RFM:</w:t>
+      </w:r>
+      <w:r>
+        <w:t xml:space="preserve"> sắp khách theo khóa ổn định Raw_Row, xếp hạng với rank(method = "first") rồi chia 5 nhóm bằng nhau. Ngưỡng của kỳ gốc (phiên bản 1, 1.992 khách): R = 5 khi recency 0-19, 4: 19-39, 3: 39-59, 2: 59-79, 1: 79-99 ngày; F theo tổng số đơn 1-5, 5-9, 9-15, 15-20, 20-32; M theo chi tiêu 6-44, 44-182, 182-589, 590-1.098, 1.099-2.491 ĐVTT (giá trị ở ranh giới chia theo thứ tự Raw_Row). Khi cập nhật hằng tháng, nên giữ cố định bộ ngưỡng này (ghi số phiên bản) thay vì xếp hạng lại cả mẫu, và lưu bảng đối chiếu khách chuyển phân khúc giữa hai kỳ.</w:t>
+      </w:r>
+    </w:p>
+    <w:p>
+      <w:pPr>
+        <w:pStyle w:val="Heading2"/>
+        <w:spacing w:before="120" w:after="240" w:line="240" w:lineRule="auto"/>
+        <w:jc w:val="left"/>
+      </w:pPr>
+      <w:r>
+        <w:t xml:space="preserve">Phụ lục 3. Mã Python tái lập kết quả</w:t>
+      </w:r>
+    </w:p>
+    <w:p>
+      <w:pPr>
+        <w:spacing w:after="240" w:line="240" w:lineRule="auto"/>
+      </w:pPr>
+      <w:r>
+        <w:t xml:space="preserve">File </w:t>
+      </w:r>
+      <w:r>
+        <w:rPr>
+          <w:i/>
+          <w:iCs/>
+        </w:rPr>
+        <w:t xml:space="preserve">food_app_analysis.py</w:t>
+      </w:r>
+      <w:r>
+        <w:t xml:space="preserve"> (nộp kèm) chạy từ </w:t>
+      </w:r>
+      <w:r>
+        <w:rPr>
+          <w:i/>
+          <w:iCs/>
+        </w:rPr>
+        <w:t xml:space="preserve">05_FoodAppBusiness.xlsx</w:t>
+      </w:r>
+      <w:r>
+        <w:t xml:space="preserve"> qua các bước: làm sạch R1-R8, tạo biến và điểm RFM, OLS (HC3), logistic, chia train/test, chọn ngưỡng bằng CV trên train, đánh giá trên test, CV và lift OOF toàn mẫu, cây quyết định, độ nhạy của bước làm sạch. random_state = 42; dữ liệu xếp theo Raw_Row trước khi chia. Lệnh chạy: python food_app_analysis.py.</w:t>
       </w:r>
     </w:p>
     <w:sectPr>

</xml_diff>

<commit_message>
Sửa báo cáo Food App: một trang bìa, danh mục bảng/hình, hình chữ Times, khớp file Power BI bản cuối
- Bỏ trang bìa phụ, chỉ giữ một trang bìa
- Sửa trường danh mục bảng và danh mục hình (dùng tên style Caption Table/Caption Figure) để Word cập nhật được
- Vẽ lại khung khái niệm, mô hình dữ liệu và cây quyết định đúng kích thước in, chữ Times New Roman
- Dashboard dựng lại bằng Times New Roman, giữ nguyên tiêu đề và tên thẻ như mon.pbix bản cuối
- Viết lại phần measure (mục 4.2 Chương II, Phụ lục 1) theo đúng tên và công thức DAX trong mon.pbix

Co-Authored-By: Claude Opus 5.5 <noreply@anthropic.com>
Claude-Session: https://claude.ai/code/session_01X5xVffgcgtEXBxQQecpyTH
</commit_message>
<xml_diff>
--- a/Báo cáo cuối kỳ - Food App Business.docx
+++ b/Báo cáo cuối kỳ - Food App Business.docx
@@ -206,7 +206,7 @@
     </w:p>
     <w:p>
       <w:pPr>
-        <w:spacing w:before="1700" w:after="0" w:line="312" w:lineRule="auto"/>
+        <w:spacing w:before="4000" w:after="0" w:line="312" w:lineRule="auto"/>
         <w:ind w:firstLine="0"/>
         <w:jc w:val="center"/>
       </w:pPr>
@@ -218,134 +218,6 @@
           <w:szCs w:val="26"/>
         </w:rPr>
         <w:t xml:space="preserve">Hà Nội, tháng 10 năm 2026</w:t>
-      </w:r>
-    </w:p>
-    <w:p>
-      <w:pPr>
-        <w:pageBreakBefore/>
-        <w:spacing w:before="0" w:after="60" w:line="312" w:lineRule="auto"/>
-        <w:ind w:firstLine="0"/>
-        <w:jc w:val="center"/>
-      </w:pPr>
-      <w:r>
-        <w:rPr>
-          <w:b/>
-          <w:bCs/>
-          <w:sz w:val="28"/>
-          <w:szCs w:val="28"/>
-        </w:rPr>
-        <w:t xml:space="preserve">TRƯỜNG ĐẠI HỌC NGOẠI THƯƠNG</w:t>
-      </w:r>
-    </w:p>
-    <w:p>
-      <w:pPr>
-        <w:spacing w:before="0" w:after="240" w:line="312" w:lineRule="auto"/>
-        <w:ind w:firstLine="0"/>
-        <w:jc w:val="center"/>
-      </w:pPr>
-      <w:r>
-        <w:rPr>
-          <w:b/>
-          <w:bCs/>
-          <w:sz w:val="28"/>
-          <w:szCs w:val="28"/>
-        </w:rPr>
-        <w:t xml:space="preserve">TRƯỜNG KINH DOANH VÀ SÁNG TẠO VIỆT – NHẬT</w:t>
-      </w:r>
-    </w:p>
-    <w:p>
-      <w:pPr>
-        <w:spacing w:before="60" w:after="300" w:line="312" w:lineRule="auto"/>
-        <w:ind w:firstLine="0"/>
-        <w:jc w:val="center"/>
-      </w:pPr>
-      <w:r>
-        <w:rPr>
-          <w:noProof/>
-        </w:rPr>
-        <w:drawing>
-          <wp:inline distT="0" distB="0" distL="0" distR="0">
-            <wp:extent cx="1600200" cy="1600200"/>
-            <wp:effectExtent l="0" t="0" r="0" b="0"/>
-            <wp:docPr id="102" name="Logo 102"/>
-            <wp:cNvGraphicFramePr>
-              <a:graphicFrameLocks xmlns:a="http://schemas.openxmlformats.org/drawingml/2006/main" noChangeAspect="1"/>
-            </wp:cNvGraphicFramePr>
-            <a:graphic xmlns:a="http://schemas.openxmlformats.org/drawingml/2006/main">
-              <a:graphicData uri="http://schemas.openxmlformats.org/drawingml/2006/picture">
-                <pic:pic xmlns:pic="http://schemas.openxmlformats.org/drawingml/2006/picture">
-                  <pic:nvPicPr>
-                    <pic:cNvPr id="0" name="logo.png"/>
-                    <pic:cNvPicPr/>
-                  </pic:nvPicPr>
-                  <pic:blipFill>
-                    <a:blip r:embed="rIdLogo"/>
-                    <a:stretch>
-                      <a:fillRect/>
-                    </a:stretch>
-                  </pic:blipFill>
-                  <pic:spPr>
-                    <a:xfrm>
-                      <a:off x="0" y="0"/>
-                      <a:ext cx="1600200" cy="1600200"/>
-                    </a:xfrm>
-                    <a:prstGeom prst="rect">
-                      <a:avLst/>
-                    </a:prstGeom>
-                  </pic:spPr>
-                </pic:pic>
-              </a:graphicData>
-            </a:graphic>
-          </wp:inline>
-        </w:drawing>
-      </w:r>
-    </w:p>
-    <w:p>
-      <w:pPr>
-        <w:spacing w:before="0" w:after="120" w:line="312" w:lineRule="auto"/>
-        <w:ind w:firstLine="0"/>
-        <w:jc w:val="center"/>
-      </w:pPr>
-      <w:r>
-        <w:rPr>
-          <w:b/>
-          <w:bCs/>
-          <w:sz w:val="30"/>
-          <w:szCs w:val="30"/>
-        </w:rPr>
-        <w:t xml:space="preserve">BÁO CÁO CUỐI KỲ</w:t>
-      </w:r>
-    </w:p>
-    <w:p>
-      <w:pPr>
-        <w:spacing w:before="0" w:after="120" w:line="312" w:lineRule="auto"/>
-        <w:ind w:firstLine="0"/>
-        <w:jc w:val="center"/>
-      </w:pPr>
-      <w:r>
-        <w:rPr>
-          <w:b/>
-          <w:bCs/>
-          <w:sz w:val="28"/>
-          <w:szCs w:val="28"/>
-        </w:rPr>
-        <w:t xml:space="preserve">HỌC PHẦN: PHÂN TÍCH DỮ LIỆU KINH DOANH</w:t>
-      </w:r>
-    </w:p>
-    <w:p>
-      <w:pPr>
-        <w:spacing w:before="0" w:after="480" w:line="312" w:lineRule="auto"/>
-        <w:ind w:firstLine="0"/>
-        <w:jc w:val="center"/>
-      </w:pPr>
-      <w:r>
-        <w:rPr>
-          <w:b/>
-          <w:bCs/>
-          <w:sz w:val="28"/>
-          <w:szCs w:val="28"/>
-        </w:rPr>
-        <w:t xml:space="preserve">ĐỀ TÀI: PHÂN TÍCH HÀNH VI CHI TIÊU VÀ PHẢN HỒI CHIẾN DỊCH MARKETING CỦA KHÁCH HÀNG FOOD APP</w:t>
       </w:r>
     </w:p>
     <w:p>
@@ -973,7 +845,7 @@
       </w:r>
       <w:r>
         <w:tab/>
-        <w:t>10</w:t>
+        <w:t>9</w:t>
       </w:r>
     </w:p>
     <w:p>
@@ -982,6 +854,54 @@
       </w:pPr>
       <w:r>
         <w:t xml:space="preserve">CHƯƠNG I: TỔNG QUAN VẤN ĐỀ VÀ CƠ SỞ NGHIÊN CỨU</w:t>
+      </w:r>
+      <w:r>
+        <w:tab/>
+        <w:t>11</w:t>
+      </w:r>
+    </w:p>
+    <w:p>
+      <w:pPr>
+        <w:pStyle w:val="TOC2"/>
+      </w:pPr>
+      <w:r>
+        <w:t xml:space="preserve">1. Bối cảnh và vấn đề kinh doanh của Food App</w:t>
+      </w:r>
+      <w:r>
+        <w:tab/>
+        <w:t>11</w:t>
+      </w:r>
+    </w:p>
+    <w:p>
+      <w:pPr>
+        <w:pStyle w:val="TOC3"/>
+      </w:pPr>
+      <w:r>
+        <w:t xml:space="preserve">1.1. Bối cảnh</w:t>
+      </w:r>
+      <w:r>
+        <w:tab/>
+        <w:t>11</w:t>
+      </w:r>
+    </w:p>
+    <w:p>
+      <w:pPr>
+        <w:pStyle w:val="TOC3"/>
+      </w:pPr>
+      <w:r>
+        <w:t xml:space="preserve">1.2. Vấn đề kinh doanh</w:t>
+      </w:r>
+      <w:r>
+        <w:tab/>
+        <w:t>11</w:t>
+      </w:r>
+    </w:p>
+    <w:p>
+      <w:pPr>
+        <w:pStyle w:val="TOC2"/>
+      </w:pPr>
+      <w:r>
+        <w:t xml:space="preserve">2. Mục tiêu và câu hỏi nghiên cứu</w:t>
       </w:r>
       <w:r>
         <w:tab/>
@@ -990,10 +910,10 @@
     </w:p>
     <w:p>
       <w:pPr>
-        <w:pStyle w:val="TOC2"/>
-      </w:pPr>
-      <w:r>
-        <w:t xml:space="preserve">1. Bối cảnh và vấn đề kinh doanh của Food App</w:t>
+        <w:pStyle w:val="TOC3"/>
+      </w:pPr>
+      <w:r>
+        <w:t xml:space="preserve">2.1. Mục tiêu tổng quát</w:t>
       </w:r>
       <w:r>
         <w:tab/>
@@ -1005,7 +925,7 @@
         <w:pStyle w:val="TOC3"/>
       </w:pPr>
       <w:r>
-        <w:t xml:space="preserve">1.1. Bối cảnh</w:t>
+        <w:t xml:space="preserve">2.2. Mục tiêu cụ thể</w:t>
       </w:r>
       <w:r>
         <w:tab/>
@@ -1017,7 +937,7 @@
         <w:pStyle w:val="TOC3"/>
       </w:pPr>
       <w:r>
-        <w:t xml:space="preserve">1.2. Vấn đề kinh doanh</w:t>
+        <w:t xml:space="preserve">2.3. Câu hỏi nghiên cứu</w:t>
       </w:r>
       <w:r>
         <w:tab/>
@@ -1029,7 +949,7 @@
         <w:pStyle w:val="TOC2"/>
       </w:pPr>
       <w:r>
-        <w:t xml:space="preserve">2. Mục tiêu và câu hỏi nghiên cứu</w:t>
+        <w:t xml:space="preserve">3. Đối tượng, phạm vi và cách tiếp cận nghiên cứu</w:t>
       </w:r>
       <w:r>
         <w:tab/>
@@ -1038,10 +958,10 @@
     </w:p>
     <w:p>
       <w:pPr>
-        <w:pStyle w:val="TOC3"/>
-      </w:pPr>
-      <w:r>
-        <w:t xml:space="preserve">2.1. Mục tiêu tổng quát</w:t>
+        <w:pStyle w:val="TOC2"/>
+      </w:pPr>
+      <w:r>
+        <w:t xml:space="preserve">4. Cơ sở lý thuyết và các nghiên cứu liên quan</w:t>
       </w:r>
       <w:r>
         <w:tab/>
@@ -1053,7 +973,7 @@
         <w:pStyle w:val="TOC3"/>
       </w:pPr>
       <w:r>
-        <w:t xml:space="preserve">2.2. Mục tiêu cụ thể</w:t>
+        <w:t xml:space="preserve">4.1. Mô hình RFM và phân khúc khách hàng</w:t>
       </w:r>
       <w:r>
         <w:tab/>
@@ -1065,19 +985,7 @@
         <w:pStyle w:val="TOC3"/>
       </w:pPr>
       <w:r>
-        <w:t xml:space="preserve">2.3. Câu hỏi nghiên cứu</w:t>
-      </w:r>
-      <w:r>
-        <w:tab/>
-        <w:t>13</w:t>
-      </w:r>
-    </w:p>
-    <w:p>
-      <w:pPr>
-        <w:pStyle w:val="TOC2"/>
-      </w:pPr>
-      <w:r>
-        <w:t xml:space="preserve">3. Đối tượng, phạm vi và cách tiếp cận nghiên cứu</w:t>
+        <w:t xml:space="preserve">4.2. Lý thuyết vòng đời gia đình</w:t>
       </w:r>
       <w:r>
         <w:tab/>
@@ -1086,10 +994,10 @@
     </w:p>
     <w:p>
       <w:pPr>
-        <w:pStyle w:val="TOC2"/>
-      </w:pPr>
-      <w:r>
-        <w:t xml:space="preserve">4. Cơ sở lý thuyết và các nghiên cứu liên quan</w:t>
+        <w:pStyle w:val="TOC3"/>
+      </w:pPr>
+      <w:r>
+        <w:t xml:space="preserve">4.3. Xu hướng phản ứng với ưu đãi</w:t>
       </w:r>
       <w:r>
         <w:tab/>
@@ -1101,19 +1009,7 @@
         <w:pStyle w:val="TOC3"/>
       </w:pPr>
       <w:r>
-        <w:t xml:space="preserve">4.1. Mô hình RFM và phân khúc khách hàng</w:t>
-      </w:r>
-      <w:r>
-        <w:tab/>
-        <w:t>14</w:t>
-      </w:r>
-    </w:p>
-    <w:p>
-      <w:pPr>
-        <w:pStyle w:val="TOC3"/>
-      </w:pPr>
-      <w:r>
-        <w:t xml:space="preserve">4.2. Lý thuyết vòng đời gia đình</w:t>
+        <w:t xml:space="preserve">4.4. Hành vi mua sắm đa kênh</w:t>
       </w:r>
       <w:r>
         <w:tab/>
@@ -1125,7 +1021,7 @@
         <w:pStyle w:val="TOC3"/>
       </w:pPr>
       <w:r>
-        <w:t xml:space="preserve">4.3. Xu hướng phản ứng với ưu đãi</w:t>
+        <w:t xml:space="preserve">4.5. Giữ chân khách hàng và nhắm mục tiêu chiến dịch</w:t>
       </w:r>
       <w:r>
         <w:tab/>
@@ -1134,14 +1030,50 @@
     </w:p>
     <w:p>
       <w:pPr>
+        <w:pStyle w:val="TOC2"/>
+      </w:pPr>
+      <w:r>
+        <w:t xml:space="preserve">5. Khung khái niệm và giả thuyết nghiên cứu</w:t>
+      </w:r>
+      <w:r>
+        <w:tab/>
+        <w:t>15</w:t>
+      </w:r>
+    </w:p>
+    <w:p>
+      <w:pPr>
+        <w:pStyle w:val="TOC1"/>
+      </w:pPr>
+      <w:r>
+        <w:t xml:space="preserve">CHƯƠNG II: TỔNG QUAN DỮ LIỆU VÀ XỬ LÝ DỮ LIỆU</w:t>
+      </w:r>
+      <w:r>
+        <w:tab/>
+        <w:t>18</w:t>
+      </w:r>
+    </w:p>
+    <w:p>
+      <w:pPr>
+        <w:pStyle w:val="TOC2"/>
+      </w:pPr>
+      <w:r>
+        <w:t xml:space="preserve">1. Giới thiệu bộ dữ liệu</w:t>
+      </w:r>
+      <w:r>
+        <w:tab/>
+        <w:t>18</w:t>
+      </w:r>
+    </w:p>
+    <w:p>
+      <w:pPr>
         <w:pStyle w:val="TOC3"/>
       </w:pPr>
       <w:r>
-        <w:t xml:space="preserve">4.4. Hành vi mua sắm đa kênh</w:t>
+        <w:t xml:space="preserve">1.1. Nguồn, đơn vị quan sát và bản chất dữ liệu</w:t>
       </w:r>
       <w:r>
         <w:tab/>
-        <w:t>16</w:t>
+        <w:t>18</w:t>
       </w:r>
     </w:p>
     <w:p>
@@ -1149,31 +1081,19 @@
         <w:pStyle w:val="TOC3"/>
       </w:pPr>
       <w:r>
-        <w:t xml:space="preserve">4.5. Giữ chân khách hàng và nhắm mục tiêu chiến dịch</w:t>
+        <w:t xml:space="preserve">1.2. Từ điển biến</w:t>
       </w:r>
       <w:r>
         <w:tab/>
-        <w:t>16</w:t>
-      </w:r>
-    </w:p>
-    <w:p>
-      <w:pPr>
-        <w:pStyle w:val="TOC2"/>
-      </w:pPr>
-      <w:r>
-        <w:t xml:space="preserve">5. Khung khái niệm và giả thuyết nghiên cứu</w:t>
-      </w:r>
-      <w:r>
-        <w:tab/>
-        <w:t>16</w:t>
-      </w:r>
-    </w:p>
-    <w:p>
-      <w:pPr>
-        <w:pStyle w:val="TOC1"/>
-      </w:pPr>
-      <w:r>
-        <w:t xml:space="preserve">CHƯƠNG II: TỔNG QUAN DỮ LIỆU VÀ XỬ LÝ DỮ LIỆU</w:t>
+        <w:t>18</w:t>
+      </w:r>
+    </w:p>
+    <w:p>
+      <w:pPr>
+        <w:pStyle w:val="TOC3"/>
+      </w:pPr>
+      <w:r>
+        <w:t xml:space="preserve">1.3. Thống kê mô tả ban đầu</w:t>
       </w:r>
       <w:r>
         <w:tab/>
@@ -1185,43 +1105,7 @@
         <w:pStyle w:val="TOC2"/>
       </w:pPr>
       <w:r>
-        <w:t xml:space="preserve">1. Giới thiệu bộ dữ liệu</w:t>
-      </w:r>
-      <w:r>
-        <w:tab/>
-        <w:t>19</w:t>
-      </w:r>
-    </w:p>
-    <w:p>
-      <w:pPr>
-        <w:pStyle w:val="TOC3"/>
-      </w:pPr>
-      <w:r>
-        <w:t xml:space="preserve">1.1. Nguồn, đơn vị quan sát và bản chất dữ liệu</w:t>
-      </w:r>
-      <w:r>
-        <w:tab/>
-        <w:t>19</w:t>
-      </w:r>
-    </w:p>
-    <w:p>
-      <w:pPr>
-        <w:pStyle w:val="TOC3"/>
-      </w:pPr>
-      <w:r>
-        <w:t xml:space="preserve">1.2. Từ điển biến</w:t>
-      </w:r>
-      <w:r>
-        <w:tab/>
-        <w:t>19</w:t>
-      </w:r>
-    </w:p>
-    <w:p>
-      <w:pPr>
-        <w:pStyle w:val="TOC3"/>
-      </w:pPr>
-      <w:r>
-        <w:t xml:space="preserve">1.3. Thống kê mô tả ban đầu</w:t>
+        <w:t xml:space="preserve">2. Xử lý và làm sạch dữ liệu</w:t>
       </w:r>
       <w:r>
         <w:tab/>
@@ -1230,34 +1114,34 @@
     </w:p>
     <w:p>
       <w:pPr>
+        <w:pStyle w:val="TOC3"/>
+      </w:pPr>
+      <w:r>
+        <w:t xml:space="preserve">2.1. Quy trình làm sạch</w:t>
+      </w:r>
+      <w:r>
+        <w:tab/>
+        <w:t>20</w:t>
+      </w:r>
+    </w:p>
+    <w:p>
+      <w:pPr>
+        <w:pStyle w:val="TOC3"/>
+      </w:pPr>
+      <w:r>
+        <w:t xml:space="preserve">2.2. Giá trị ngoại lai và phân phối chi tiêu</w:t>
+      </w:r>
+      <w:r>
+        <w:tab/>
+        <w:t>22</w:t>
+      </w:r>
+    </w:p>
+    <w:p>
+      <w:pPr>
         <w:pStyle w:val="TOC2"/>
       </w:pPr>
       <w:r>
-        <w:t xml:space="preserve">2. Xử lý và làm sạch dữ liệu</w:t>
-      </w:r>
-      <w:r>
-        <w:tab/>
-        <w:t>21</w:t>
-      </w:r>
-    </w:p>
-    <w:p>
-      <w:pPr>
-        <w:pStyle w:val="TOC3"/>
-      </w:pPr>
-      <w:r>
-        <w:t xml:space="preserve">2.1. Quy trình làm sạch</w:t>
-      </w:r>
-      <w:r>
-        <w:tab/>
-        <w:t>21</w:t>
-      </w:r>
-    </w:p>
-    <w:p>
-      <w:pPr>
-        <w:pStyle w:val="TOC3"/>
-      </w:pPr>
-      <w:r>
-        <w:t xml:space="preserve">2.2. Giá trị ngoại lai và phân phối chi tiêu</w:t>
+        <w:t xml:space="preserve">3. Biến đổi và tạo biến mới</w:t>
       </w:r>
       <w:r>
         <w:tab/>
@@ -1266,10 +1150,22 @@
     </w:p>
     <w:p>
       <w:pPr>
-        <w:pStyle w:val="TOC2"/>
-      </w:pPr>
-      <w:r>
-        <w:t xml:space="preserve">3. Biến đổi và tạo biến mới</w:t>
+        <w:pStyle w:val="TOC3"/>
+      </w:pPr>
+      <w:r>
+        <w:t xml:space="preserve">3.1. Các biến đo lường giá trị và hành vi mua</w:t>
+      </w:r>
+      <w:r>
+        <w:tab/>
+        <w:t>23</w:t>
+      </w:r>
+    </w:p>
+    <w:p>
+      <w:pPr>
+        <w:pStyle w:val="TOC3"/>
+      </w:pPr>
+      <w:r>
+        <w:t xml:space="preserve">3.2. Chấm điểm và phân khúc RFM</w:t>
       </w:r>
       <w:r>
         <w:tab/>
@@ -1278,10 +1174,10 @@
     </w:p>
     <w:p>
       <w:pPr>
-        <w:pStyle w:val="TOC3"/>
-      </w:pPr>
-      <w:r>
-        <w:t xml:space="preserve">3.1. Các biến đo lường giá trị và hành vi mua</w:t>
+        <w:pStyle w:val="TOC2"/>
+      </w:pPr>
+      <w:r>
+        <w:t xml:space="preserve">4. Mô hình dữ liệu và các measure DAX trong Power BI</w:t>
       </w:r>
       <w:r>
         <w:tab/>
@@ -1293,7 +1189,19 @@
         <w:pStyle w:val="TOC3"/>
       </w:pPr>
       <w:r>
-        <w:t xml:space="preserve">3.2. Chấm điểm và phân khúc RFM</w:t>
+        <w:t xml:space="preserve">4.1. Cấu trúc mô hình dữ liệu</w:t>
+      </w:r>
+      <w:r>
+        <w:tab/>
+        <w:t>24</w:t>
+      </w:r>
+    </w:p>
+    <w:p>
+      <w:pPr>
+        <w:pStyle w:val="TOC3"/>
+      </w:pPr>
+      <w:r>
+        <w:t xml:space="preserve">4.2. Các measure chính</w:t>
       </w:r>
       <w:r>
         <w:tab/>
@@ -1302,42 +1210,6 @@
     </w:p>
     <w:p>
       <w:pPr>
-        <w:pStyle w:val="TOC2"/>
-      </w:pPr>
-      <w:r>
-        <w:t xml:space="preserve">4. Mô hình dữ liệu và các measure DAX trong Power BI</w:t>
-      </w:r>
-      <w:r>
-        <w:tab/>
-        <w:t>25</w:t>
-      </w:r>
-    </w:p>
-    <w:p>
-      <w:pPr>
-        <w:pStyle w:val="TOC3"/>
-      </w:pPr>
-      <w:r>
-        <w:t xml:space="preserve">4.1. Cấu trúc mô hình dữ liệu</w:t>
-      </w:r>
-      <w:r>
-        <w:tab/>
-        <w:t>25</w:t>
-      </w:r>
-    </w:p>
-    <w:p>
-      <w:pPr>
-        <w:pStyle w:val="TOC3"/>
-      </w:pPr>
-      <w:r>
-        <w:t xml:space="preserve">4.2. Các measure chính</w:t>
-      </w:r>
-      <w:r>
-        <w:tab/>
-        <w:t>26</w:t>
-      </w:r>
-    </w:p>
-    <w:p>
-      <w:pPr>
         <w:pStyle w:val="TOC1"/>
       </w:pPr>
       <w:r>
@@ -1477,7 +1349,7 @@
       </w:r>
       <w:r>
         <w:tab/>
-        <w:t>39</w:t>
+        <w:t>40</w:t>
       </w:r>
     </w:p>
     <w:p>
@@ -1489,7 +1361,7 @@
       </w:r>
       <w:r>
         <w:tab/>
-        <w:t>40</w:t>
+        <w:t>41</w:t>
       </w:r>
     </w:p>
     <w:p>
@@ -1513,7 +1385,7 @@
       </w:r>
       <w:r>
         <w:tab/>
-        <w:t>43</w:t>
+        <w:t>44</w:t>
       </w:r>
     </w:p>
     <w:p>
@@ -1525,7 +1397,7 @@
       </w:r>
       <w:r>
         <w:tab/>
-        <w:t>43</w:t>
+        <w:t>44</w:t>
       </w:r>
     </w:p>
     <w:p>
@@ -1537,7 +1409,7 @@
       </w:r>
       <w:r>
         <w:tab/>
-        <w:t>43</w:t>
+        <w:t>44</w:t>
       </w:r>
     </w:p>
     <w:p>
@@ -1546,18 +1418,6 @@
       </w:pPr>
       <w:r>
         <w:t xml:space="preserve">7.3. Phân tích độ nhạy</w:t>
-      </w:r>
-      <w:r>
-        <w:tab/>
-        <w:t>46</w:t>
-      </w:r>
-    </w:p>
-    <w:p>
-      <w:pPr>
-        <w:pStyle w:val="TOC2"/>
-      </w:pPr>
-      <w:r>
-        <w:t xml:space="preserve">8. Thảo luận kết quả</w:t>
       </w:r>
       <w:r>
         <w:tab/>
@@ -1566,10 +1426,10 @@
     </w:p>
     <w:p>
       <w:pPr>
-        <w:pStyle w:val="TOC1"/>
-      </w:pPr>
-      <w:r>
-        <w:t xml:space="preserve">CHƯƠNG V: KẾT LUẬN VÀ ĐỀ XUẤT GIẢI PHÁP</w:t>
+        <w:pStyle w:val="TOC2"/>
+      </w:pPr>
+      <w:r>
+        <w:t xml:space="preserve">8. Thảo luận kết quả</w:t>
       </w:r>
       <w:r>
         <w:tab/>
@@ -1578,22 +1438,10 @@
     </w:p>
     <w:p>
       <w:pPr>
-        <w:pStyle w:val="TOC2"/>
-      </w:pPr>
-      <w:r>
-        <w:t xml:space="preserve">1. Kết luận theo câu hỏi nghiên cứu</w:t>
-      </w:r>
-      <w:r>
-        <w:tab/>
-        <w:t>48</w:t>
-      </w:r>
-    </w:p>
-    <w:p>
-      <w:pPr>
-        <w:pStyle w:val="TOC2"/>
-      </w:pPr>
-      <w:r>
-        <w:t xml:space="preserve">2. Đề xuất giải pháp</w:t>
+        <w:pStyle w:val="TOC1"/>
+      </w:pPr>
+      <w:r>
+        <w:t xml:space="preserve">CHƯƠNG V: KẾT LUẬN VÀ ĐỀ XUẤT GIẢI PHÁP</w:t>
       </w:r>
       <w:r>
         <w:tab/>
@@ -1602,10 +1450,10 @@
     </w:p>
     <w:p>
       <w:pPr>
-        <w:pStyle w:val="TOC3"/>
-      </w:pPr>
-      <w:r>
-        <w:t xml:space="preserve">2.1. Giải pháp 1: Thử nghiệm tái kích hoạt khách giá trị cao trong nhóm At Risk</w:t>
+        <w:pStyle w:val="TOC2"/>
+      </w:pPr>
+      <w:r>
+        <w:t xml:space="preserve">1. Kết luận theo câu hỏi nghiên cứu</w:t>
       </w:r>
       <w:r>
         <w:tab/>
@@ -1614,10 +1462,10 @@
     </w:p>
     <w:p>
       <w:pPr>
-        <w:pStyle w:val="TOC3"/>
-      </w:pPr>
-      <w:r>
-        <w:t xml:space="preserve">2.2. Giải pháp 2: Thử nghiệm chọn khách cho chiến dịch dựa trên điểm phân loại</w:t>
+        <w:pStyle w:val="TOC2"/>
+      </w:pPr>
+      <w:r>
+        <w:t xml:space="preserve">2. Đề xuất giải pháp</w:t>
       </w:r>
       <w:r>
         <w:tab/>
@@ -1629,7 +1477,7 @@
         <w:pStyle w:val="TOC3"/>
       </w:pPr>
       <w:r>
-        <w:t xml:space="preserve">2.3. Giải pháp 3: Thử nghiệm nội dung ưu đãi theo phân khúc và hành vi kênh</w:t>
+        <w:t xml:space="preserve">2.1. Giải pháp 1: Thử nghiệm tái kích hoạt khách giá trị cao trong nhóm At Risk</w:t>
       </w:r>
       <w:r>
         <w:tab/>
@@ -1641,43 +1489,31 @@
         <w:pStyle w:val="TOC3"/>
       </w:pPr>
       <w:r>
+        <w:t xml:space="preserve">2.2. Giải pháp 2: Thử nghiệm chọn khách cho chiến dịch dựa trên điểm phân loại</w:t>
+      </w:r>
+      <w:r>
+        <w:tab/>
+        <w:t>51</w:t>
+      </w:r>
+    </w:p>
+    <w:p>
+      <w:pPr>
+        <w:pStyle w:val="TOC3"/>
+      </w:pPr>
+      <w:r>
+        <w:t xml:space="preserve">2.3. Giải pháp 3: Thử nghiệm nội dung ưu đãi theo phân khúc và hành vi kênh</w:t>
+      </w:r>
+      <w:r>
+        <w:tab/>
+        <w:t>51</w:t>
+      </w:r>
+    </w:p>
+    <w:p>
+      <w:pPr>
+        <w:pStyle w:val="TOC3"/>
+      </w:pPr>
+      <w:r>
         <w:t xml:space="preserve">2.4. Lộ trình triển khai và hệ thống theo dõi</w:t>
-      </w:r>
-      <w:r>
-        <w:tab/>
-        <w:t>52</w:t>
-      </w:r>
-    </w:p>
-    <w:p>
-      <w:pPr>
-        <w:pStyle w:val="TOC2"/>
-      </w:pPr>
-      <w:r>
-        <w:t xml:space="preserve">3. Hạn chế của nghiên cứu</w:t>
-      </w:r>
-      <w:r>
-        <w:tab/>
-        <w:t>52</w:t>
-      </w:r>
-    </w:p>
-    <w:p>
-      <w:pPr>
-        <w:pStyle w:val="TOC3"/>
-      </w:pPr>
-      <w:r>
-        <w:t xml:space="preserve">3.1. Hạn chế về dữ liệu</w:t>
-      </w:r>
-      <w:r>
-        <w:tab/>
-        <w:t>52</w:t>
-      </w:r>
-    </w:p>
-    <w:p>
-      <w:pPr>
-        <w:pStyle w:val="TOC3"/>
-      </w:pPr>
-      <w:r>
-        <w:t xml:space="preserve">3.2. Hạn chế về phương pháp</w:t>
       </w:r>
       <w:r>
         <w:tab/>
@@ -1686,10 +1522,10 @@
     </w:p>
     <w:p>
       <w:pPr>
-        <w:pStyle w:val="TOC3"/>
-      </w:pPr>
-      <w:r>
-        <w:t xml:space="preserve">3.3. Hạn chế về khả năng áp dụng</w:t>
+        <w:pStyle w:val="TOC2"/>
+      </w:pPr>
+      <w:r>
+        <w:t xml:space="preserve">3. Hạn chế của nghiên cứu</w:t>
       </w:r>
       <w:r>
         <w:tab/>
@@ -1698,10 +1534,10 @@
     </w:p>
     <w:p>
       <w:pPr>
-        <w:pStyle w:val="TOC2"/>
-      </w:pPr>
-      <w:r>
-        <w:t xml:space="preserve">4. Hướng phát triển</w:t>
+        <w:pStyle w:val="TOC3"/>
+      </w:pPr>
+      <w:r>
+        <w:t xml:space="preserve">3.1. Hạn chế về dữ liệu</w:t>
       </w:r>
       <w:r>
         <w:tab/>
@@ -1710,6 +1546,42 @@
     </w:p>
     <w:p>
       <w:pPr>
+        <w:pStyle w:val="TOC3"/>
+      </w:pPr>
+      <w:r>
+        <w:t xml:space="preserve">3.2. Hạn chế về phương pháp</w:t>
+      </w:r>
+      <w:r>
+        <w:tab/>
+        <w:t>54</w:t>
+      </w:r>
+    </w:p>
+    <w:p>
+      <w:pPr>
+        <w:pStyle w:val="TOC3"/>
+      </w:pPr>
+      <w:r>
+        <w:t xml:space="preserve">3.3. Hạn chế về khả năng áp dụng</w:t>
+      </w:r>
+      <w:r>
+        <w:tab/>
+        <w:t>54</w:t>
+      </w:r>
+    </w:p>
+    <w:p>
+      <w:pPr>
+        <w:pStyle w:val="TOC2"/>
+      </w:pPr>
+      <w:r>
+        <w:t xml:space="preserve">4. Hướng phát triển</w:t>
+      </w:r>
+      <w:r>
+        <w:tab/>
+        <w:t>54</w:t>
+      </w:r>
+    </w:p>
+    <w:p>
+      <w:pPr>
         <w:pStyle w:val="TOC1"/>
       </w:pPr>
       <w:r>
@@ -1717,7 +1589,7 @@
       </w:r>
       <w:r>
         <w:tab/>
-        <w:t>55</w:t>
+        <w:t>56</w:t>
       </w:r>
     </w:p>
     <w:p>
@@ -1726,30 +1598,6 @@
       </w:pPr>
       <w:r>
         <w:t xml:space="preserve">PHỤ LỤC</w:t>
-      </w:r>
-      <w:r>
-        <w:tab/>
-        <w:t>57</w:t>
-      </w:r>
-    </w:p>
-    <w:p>
-      <w:pPr>
-        <w:pStyle w:val="TOC2"/>
-      </w:pPr>
-      <w:r>
-        <w:t xml:space="preserve">Phụ lục 1. Một số công thức DAX tiêu biểu</w:t>
-      </w:r>
-      <w:r>
-        <w:tab/>
-        <w:t>57</w:t>
-      </w:r>
-    </w:p>
-    <w:p>
-      <w:pPr>
-        <w:pStyle w:val="TOC2"/>
-      </w:pPr>
-      <w:r>
-        <w:t xml:space="preserve">Phụ lục 2. Quan hệ bảng và quy tắc xử lý dữ liệu</w:t>
       </w:r>
       <w:r>
         <w:tab/>
@@ -1761,11 +1609,35 @@
         <w:pStyle w:val="TOC2"/>
       </w:pPr>
       <w:r>
-        <w:t xml:space="preserve">Phụ lục 3. Mã Python tái lập kết quả</w:t>
+        <w:t xml:space="preserve">Phụ lục 1. Một số công thức DAX tiêu biểu</w:t>
       </w:r>
       <w:r>
         <w:tab/>
         <w:t>58</w:t>
+      </w:r>
+    </w:p>
+    <w:p>
+      <w:pPr>
+        <w:pStyle w:val="TOC2"/>
+      </w:pPr>
+      <w:r>
+        <w:t xml:space="preserve">Phụ lục 2. Quan hệ bảng và quy tắc xử lý dữ liệu</w:t>
+      </w:r>
+      <w:r>
+        <w:tab/>
+        <w:t>59</w:t>
+      </w:r>
+    </w:p>
+    <w:p>
+      <w:pPr>
+        <w:pStyle w:val="TOC2"/>
+      </w:pPr>
+      <w:r>
+        <w:t xml:space="preserve">Phụ lục 3. Mã Python tái lập kết quả</w:t>
+      </w:r>
+      <w:r>
+        <w:tab/>
+        <w:t>59</w:t>
       </w:r>
       <w:r>
         <w:fldChar w:fldCharType="end"/>
@@ -1797,13 +1669,25 @@
         <w:fldChar w:fldCharType="begin"/>
       </w:r>
       <w:r>
-        <w:instrText xml:space="preserve"> TOC \h \z \t "CaptionTable,1" </w:instrText>
+        <w:instrText xml:space="preserve"> TOC \h \z \t "Caption Table,1" </w:instrText>
       </w:r>
       <w:r>
         <w:fldChar w:fldCharType="separate"/>
       </w:r>
       <w:r>
         <w:t xml:space="preserve">Bảng 1.1. Các giả thuyết và câu hỏi khám phá</w:t>
+      </w:r>
+      <w:r>
+        <w:tab/>
+        <w:t>17</w:t>
+      </w:r>
+    </w:p>
+    <w:p>
+      <w:pPr>
+        <w:pStyle w:val="TOCList"/>
+      </w:pPr>
+      <w:r>
+        <w:t xml:space="preserve">Bảng 2.1. Thông tin mô tả bộ dữ liệu</w:t>
       </w:r>
       <w:r>
         <w:tab/>
@@ -1815,7 +1699,7 @@
         <w:pStyle w:val="TOCList"/>
       </w:pPr>
       <w:r>
-        <w:t xml:space="preserve">Bảng 2.1. Thông tin mô tả bộ dữ liệu</w:t>
+        <w:t xml:space="preserve">Bảng 2.2. Từ điển biến gốc của bộ dữ liệu</w:t>
       </w:r>
       <w:r>
         <w:tab/>
@@ -1827,7 +1711,7 @@
         <w:pStyle w:val="TOCList"/>
       </w:pPr>
       <w:r>
-        <w:t xml:space="preserve">Bảng 2.2. Từ điển biến gốc của bộ dữ liệu</w:t>
+        <w:t xml:space="preserve">Bảng 2.3. Thống kê mô tả các biến chính sau làm sạch (n = 1.992)</w:t>
       </w:r>
       <w:r>
         <w:tab/>
@@ -1839,11 +1723,11 @@
         <w:pStyle w:val="TOCList"/>
       </w:pPr>
       <w:r>
-        <w:t xml:space="preserve">Bảng 2.3. Thống kê mô tả các biến chính sau làm sạch (n = 1.992)</w:t>
+        <w:t xml:space="preserve">Bảng 2.4. So sánh khách đã và chưa từng chấp nhận chiến dịch</w:t>
       </w:r>
       <w:r>
         <w:tab/>
-        <w:t>21</w:t>
+        <w:t>20</w:t>
       </w:r>
     </w:p>
     <w:p>
@@ -1851,11 +1735,11 @@
         <w:pStyle w:val="TOCList"/>
       </w:pPr>
       <w:r>
-        <w:t xml:space="preserve">Bảng 2.4. So sánh khách đã và chưa từng chấp nhận chiến dịch</w:t>
+        <w:t xml:space="preserve">Bảng 2.5. Các bước kiểm tra và làm sạch dữ liệu</w:t>
       </w:r>
       <w:r>
         <w:tab/>
-        <w:t>21</w:t>
+        <w:t>22</w:t>
       </w:r>
     </w:p>
     <w:p>
@@ -1863,7 +1747,7 @@
         <w:pStyle w:val="TOCList"/>
       </w:pPr>
       <w:r>
-        <w:t xml:space="preserve">Bảng 2.5. Các bước kiểm tra và làm sạch dữ liệu</w:t>
+        <w:t xml:space="preserve">Bảng 2.6. Các biến dẫn xuất chính</w:t>
       </w:r>
       <w:r>
         <w:tab/>
@@ -1875,7 +1759,7 @@
         <w:pStyle w:val="TOCList"/>
       </w:pPr>
       <w:r>
-        <w:t xml:space="preserve">Bảng 2.6. Các biến dẫn xuất chính</w:t>
+        <w:t xml:space="preserve">Bảng 2.7. Ngưỡng chấm điểm RFM của kỳ gốc (1.992 khách)</w:t>
       </w:r>
       <w:r>
         <w:tab/>
@@ -1887,18 +1771,6 @@
         <w:pStyle w:val="TOCList"/>
       </w:pPr>
       <w:r>
-        <w:t xml:space="preserve">Bảng 2.7. Ngưỡng chấm điểm RFM của kỳ gốc (1.992 khách)</w:t>
-      </w:r>
-      <w:r>
-        <w:tab/>
-        <w:t>25</w:t>
-      </w:r>
-    </w:p>
-    <w:p>
-      <w:pPr>
-        <w:pStyle w:val="TOCList"/>
-      </w:pPr>
-      <w:r>
         <w:t xml:space="preserve">Bảng 3.1. Chi tiêu và phản hồi chiến dịch theo nhóm thu nhập</w:t>
       </w:r>
       <w:r>
@@ -1999,7 +1871,7 @@
       </w:r>
       <w:r>
         <w:tab/>
-        <w:t>39</w:t>
+        <w:t>40</w:t>
       </w:r>
     </w:p>
     <w:p>
@@ -2011,7 +1883,7 @@
       </w:r>
       <w:r>
         <w:tab/>
-        <w:t>40</w:t>
+        <w:t>41</w:t>
       </w:r>
     </w:p>
     <w:p>
@@ -2035,7 +1907,7 @@
       </w:r>
       <w:r>
         <w:tab/>
-        <w:t>42</w:t>
+        <w:t>43</w:t>
       </w:r>
     </w:p>
     <w:p>
@@ -2059,7 +1931,7 @@
       </w:r>
       <w:r>
         <w:tab/>
-        <w:t>45</w:t>
+        <w:t>46</w:t>
       </w:r>
     </w:p>
     <w:p>
@@ -2071,7 +1943,7 @@
       </w:r>
       <w:r>
         <w:tab/>
-        <w:t>47</w:t>
+        <w:t>48</w:t>
       </w:r>
     </w:p>
     <w:p>
@@ -2083,7 +1955,7 @@
       </w:r>
       <w:r>
         <w:tab/>
-        <w:t>52</w:t>
+        <w:t>53</w:t>
       </w:r>
     </w:p>
     <w:p>
@@ -2095,7 +1967,7 @@
       </w:r>
       <w:r>
         <w:tab/>
-        <w:t>58</w:t>
+        <w:t>59</w:t>
       </w:r>
       <w:r>
         <w:fldChar w:fldCharType="end"/>
@@ -2127,7 +1999,7 @@
         <w:fldChar w:fldCharType="begin"/>
       </w:r>
       <w:r>
-        <w:instrText xml:space="preserve"> TOC \h \z \t "CaptionFigure,1" </w:instrText>
+        <w:instrText xml:space="preserve"> TOC \h \z \t "Caption Figure,1" </w:instrText>
       </w:r>
       <w:r>
         <w:fldChar w:fldCharType="separate"/>
@@ -2137,7 +2009,7 @@
       </w:r>
       <w:r>
         <w:tab/>
-        <w:t>17</w:t>
+        <w:t>16</w:t>
       </w:r>
     </w:p>
     <w:p>
@@ -2149,7 +2021,7 @@
       </w:r>
       <w:r>
         <w:tab/>
-        <w:t>22</w:t>
+        <w:t>21</w:t>
       </w:r>
     </w:p>
     <w:p>
@@ -2161,7 +2033,7 @@
       </w:r>
       <w:r>
         <w:tab/>
-        <w:t>24</w:t>
+        <w:t>23</w:t>
       </w:r>
     </w:p>
     <w:p>
@@ -2173,7 +2045,7 @@
       </w:r>
       <w:r>
         <w:tab/>
-        <w:t>26</w:t>
+        <w:t>25</w:t>
       </w:r>
     </w:p>
     <w:p>
@@ -2217,7 +2089,7 @@
         <w:pStyle w:val="TOCList"/>
       </w:pPr>
       <w:r>
-        <w:t xml:space="preserve">Hình 3.4. Dashboard trang 4 - Phản hồi chiến dịch</w:t>
+        <w:t xml:space="preserve">Hình 3.4. Dashboard trang 4 - Hiệu quả chiến dịch</w:t>
       </w:r>
       <w:r>
         <w:tab/>
@@ -2269,7 +2141,7 @@
       </w:r>
       <w:r>
         <w:tab/>
-        <w:t>44</w:t>
+        <w:t>45</w:t>
       </w:r>
     </w:p>
     <w:p>
@@ -2281,7 +2153,7 @@
       </w:r>
       <w:r>
         <w:tab/>
-        <w:t>46</w:t>
+        <w:t>47</w:t>
       </w:r>
       <w:r>
         <w:fldChar w:fldCharType="end"/>
@@ -3759,7 +3631,7 @@
         </w:rPr>
         <w:drawing>
           <wp:inline distT="0" distB="0" distL="0" distR="0">
-            <wp:extent cx="5120640" cy="2335730"/>
+            <wp:extent cx="5760085" cy="3062902"/>
             <wp:effectExtent l="0" t="0" r="0" b="0"/>
             <wp:docPr id="101" name="Picture 101"/>
             <wp:cNvGraphicFramePr>
@@ -3781,7 +3653,7 @@
                   <pic:spPr>
                     <a:xfrm>
                       <a:off x="0" y="0"/>
-                      <a:ext cx="5120640" cy="2335730"/>
+                      <a:ext cx="5760085" cy="3062902"/>
                     </a:xfrm>
                     <a:prstGeom prst="rect">
                       <a:avLst/>
@@ -9368,7 +9240,7 @@
         </w:rPr>
         <w:drawing>
           <wp:inline distT="0" distB="0" distL="0" distR="0">
-            <wp:extent cx="3474720" cy="3640182"/>
+            <wp:extent cx="4480560" cy="4480560"/>
             <wp:effectExtent l="0" t="0" r="0" b="0"/>
             <wp:docPr id="102" name="Picture 102"/>
             <wp:cNvGraphicFramePr>
@@ -9390,7 +9262,7 @@
                   <pic:spPr>
                     <a:xfrm>
                       <a:off x="0" y="0"/>
-                      <a:ext cx="3474720" cy="3640182"/>
+                      <a:ext cx="4480560" cy="4480560"/>
                     </a:xfrm>
                     <a:prstGeom prst="rect">
                       <a:avLst/>
@@ -10199,7 +10071,7 @@
         </w:rPr>
         <w:drawing>
           <wp:inline distT="0" distB="0" distL="0" distR="0">
-            <wp:extent cx="4572000" cy="2032000"/>
+            <wp:extent cx="5486400" cy="2286000"/>
             <wp:effectExtent l="0" t="0" r="0" b="0"/>
             <wp:docPr id="103" name="Picture 103"/>
             <wp:cNvGraphicFramePr>
@@ -10221,7 +10093,7 @@
                   <pic:spPr>
                     <a:xfrm>
                       <a:off x="0" y="0"/>
-                      <a:ext cx="4572000" cy="2032000"/>
+                      <a:ext cx="5486400" cy="2286000"/>
                     </a:xfrm>
                     <a:prstGeom prst="rect">
                       <a:avLst/>
@@ -11821,7 +11693,7 @@
         <w:jc w:val="both"/>
       </w:pPr>
       <w:r>
-        <w:t xml:space="preserve">Khi cập nhật hằng tháng, bộ ngưỡng ở Bảng 2.7 được giữ cố định thay vì xếp hạng lại cả mẫu (quy tắc chi tiết ở Phụ lục 2).</w:t>
+        <w:t xml:space="preserve">Khi cập nhật hằng tháng, nhóm đề xuất giữ cố định bộ ngưỡng ở Bảng 2.7 thay vì xếp hạng lại cả mẫu (quy tắc chi tiết ở Phụ lục 2).</w:t>
       </w:r>
     </w:p>
     <w:p>
@@ -11883,7 +11755,7 @@
         </w:rPr>
         <w:drawing>
           <wp:inline distT="0" distB="0" distL="0" distR="0">
-            <wp:extent cx="4023360" cy="1835216"/>
+            <wp:extent cx="5760085" cy="3017187"/>
             <wp:effectExtent l="0" t="0" r="0" b="0"/>
             <wp:docPr id="104" name="Picture 104"/>
             <wp:cNvGraphicFramePr>
@@ -11905,7 +11777,7 @@
                   <pic:spPr>
                     <a:xfrm>
                       <a:off x="0" y="0"/>
-                      <a:ext cx="4023360" cy="1835216"/>
+                      <a:ext cx="5760085" cy="3017187"/>
                     </a:xfrm>
                     <a:prstGeom prst="rect">
                       <a:avLst/>
@@ -11968,14 +11840,14 @@
         <w:jc w:val="both"/>
       </w:pPr>
       <w:r>
-        <w:t xml:space="preserve">Toàn bộ chỉ số trên dashboard được viết bằng measure để phản ứng theo slicer; công thức đầy đủ ở Phụ lục 1. Mỗi nhóm measure gắn với một câu hỏi quản trị: </w:t>
+        <w:t xml:space="preserve">Toàn bộ chỉ số trên dashboard được viết bằng measure để phản ứng theo slicer; công thức đầy đủ ở Phụ lục 1. Tên measure được giữ nguyên như trong file Power BI; chữ “doanh thu” trong tên measure được hiểu là tổng chi tiêu cộng dồn của khách. Mỗi nhóm measure gắn với một câu hỏi quản trị: </w:t>
       </w:r>
       <w:r>
         <w:rPr>
           <w:b/>
           <w:bCs/>
         </w:rPr>
-        <w:t xml:space="preserve">Tổng chi tiêu, Số khách hàng và AOV</w:t>
+        <w:t xml:space="preserve">Tổng chi tiêu, Số khách hàng và AOV (giá trị TB/đơn)</w:t>
       </w:r>
       <w:r>
         <w:t xml:space="preserve"> đo quy mô giá trị của nhóm đang xem; </w:t>
@@ -12005,7 +11877,7 @@
           <w:b/>
           <w:bCs/>
         </w:rPr>
-        <w:t xml:space="preserve">Thu nhập TB khách chấp nhận CD</w:t>
+        <w:t xml:space="preserve">Thu nhập TB người nhận CD</w:t>
       </w:r>
       <w:r>
         <w:t xml:space="preserve"> mô tả ai đã chấp nhận chiến dịch; </w:t>
@@ -12015,7 +11887,7 @@
           <w:b/>
           <w:bCs/>
         </w:rPr>
-        <w:t xml:space="preserve">Chi tiêu lịch sử nhóm At Risk</w:t>
+        <w:t xml:space="preserve">Doanh thu rủi ro (At Risk)</w:t>
       </w:r>
       <w:r>
         <w:t xml:space="preserve"> cho biết bao nhiêu chi tiêu nằm ở nhóm lâu chưa quay lại; và </w:t>
@@ -12025,10 +11897,10 @@
           <w:b/>
           <w:bCs/>
         </w:rPr>
-        <w:t xml:space="preserve">Chi tiêu lịch sử theo kịch bản win-back</w:t>
-      </w:r>
-      <w:r>
-        <w:t xml:space="preserve"> cho biết quy mô của một kịch bản giả định.</w:t>
+        <w:t xml:space="preserve">Doanh thu giữ lại được</w:t>
+      </w:r>
+      <w:r>
+        <w:t xml:space="preserve"> cho biết quy mô của một kịch bản win-back giả định.</w:t>
       </w:r>
     </w:p>
     <w:p>
@@ -12038,17 +11910,17 @@
         <w:jc w:val="both"/>
       </w:pPr>
       <w:r>
-        <w:t xml:space="preserve">Measure thu nhập của khách chấp nhận được tính </w:t>
+        <w:t xml:space="preserve">Measure </w:t>
       </w:r>
       <w:r>
         <w:rPr>
           <w:b/>
           <w:bCs/>
         </w:rPr>
-        <w:t xml:space="preserve">theo khách</w:t>
-      </w:r>
-      <w:r>
-        <w:t xml:space="preserve">, không theo lượt: khi không lọc, kết quả là 65.183 ĐVTT (418 khách khác nhau), trong khi tính trên 602 lượt chấp nhận sẽ ra 69.868 ĐVTT vì khách chấp nhận nhiều chiến dịch bị đếm nhiều lần. Các thẻ ở trang RFM phản ứng theo slicer phân khúc qua bảng Dim_Segment.</w:t>
+        <w:t xml:space="preserve">Thu nhập TB người nhận CD</w:t>
+      </w:r>
+      <w:r>
+        <w:t xml:space="preserve"> lấy trung bình thu nhập trên các dòng có Accepted = 1 của bảng Campaign_Response. Trên biểu đồ theo từng chiến dịch, mỗi khách chỉ xuất hiện một lần nên giá trị đúng bằng thu nhập trung bình của khách chấp nhận chiến dịch đó. Khi không lọc theo chiến dịch, measure tính theo lượt (69.868 ĐVTT trên 602 lượt), cao hơn mức 65.183 ĐVTT tính theo 418 khách vì khách chấp nhận nhiều chiến dịch được đếm nhiều lần; vì vậy khi nói về toàn bộ khách đã chấp nhận, báo cáo dùng con số tính theo khách (Bảng 2.4). Chữ “người nhận” trong tên measure và tiêu đề hình được hiểu là khách đã chấp nhận, vì dữ liệu không có danh sách khách được gửi chiến dịch.</w:t>
       </w:r>
     </w:p>
     <w:p>
@@ -12058,7 +11930,37 @@
         <w:jc w:val="both"/>
       </w:pPr>
       <w:r>
-        <w:t xml:space="preserve">Measure chi tiêu lịch sử theo kịch bản win-back dùng tham số do người xem chọn trên slicer, theo công thức:</w:t>
+        <w:t xml:space="preserve">Measure </w:t>
+      </w:r>
+      <w:r>
+        <w:rPr>
+          <w:b/>
+          <w:bCs/>
+        </w:rPr>
+        <w:t xml:space="preserve">Doanh thu giữ lại được</w:t>
+      </w:r>
+      <w:r>
+        <w:t xml:space="preserve"> nhân </w:t>
+      </w:r>
+      <w:r>
+        <w:rPr>
+          <w:b/>
+          <w:bCs/>
+        </w:rPr>
+        <w:t xml:space="preserve">Doanh thu rủi ro (At Risk)</w:t>
+      </w:r>
+      <w:r>
+        <w:t xml:space="preserve"> với </w:t>
+      </w:r>
+      <w:r>
+        <w:rPr>
+          <w:b/>
+          <w:bCs/>
+        </w:rPr>
+        <w:t xml:space="preserve">Tỷ lệ win-back</w:t>
+      </w:r>
+      <w:r>
+        <w:t xml:space="preserve"> do người xem chọn trên slicer, tương đương công thức:</w:t>
       </w:r>
     </w:p>
     <w:p>
@@ -12191,7 +12093,7 @@
         <w:t xml:space="preserve">r</w:t>
       </w:r>
       <w:r>
-        <w:t xml:space="preserve"> là tỷ lệ khách At Risk giả định quay lại, với chi tiêu lịch sử bằng mức trung bình của nhóm. Kết quả là phần chi tiêu lịch sử tương ứng với kịch bản, không phải dự báo doanh thu hay lợi nhuận. Slicer không được chọn sẵn; 10% chỉ là giá trị dự phòng của SELECTEDVALUE.</w:t>
+        <w:t xml:space="preserve"> là tỷ lệ khách At Risk giả định quay lại, với chi tiêu lịch sử bằng mức trung bình của nhóm. Dù tên measure là “doanh thu giữ lại được”, kết quả chỉ là phần chi tiêu lịch sử tương ứng với kịch bản, không phải dự báo doanh thu hay lợi nhuận. Slicer không được chọn sẵn; 10% là giá trị dự phòng của SELECTEDVALUE.</w:t>
       </w:r>
     </w:p>
     <w:p>
@@ -12219,7 +12121,7 @@
         <w:t xml:space="preserve">“Bao nhiêu → Ai → Mua gì, ở đâu → Chiến dịch → Giữ ai”</w:t>
       </w:r>
       <w:r>
-        <w:t xml:space="preserve">, dùng một theme màu thống nhất (xanh lá #2E6B4F chủ đạo, cam #E4572E cho trạng thái cần chú ý) và bốn slicer đồng bộ ở cùng vị trí. Mỗi mục dưới đây phân tích một trang theo cùng mạch: câu hỏi của trang, chỉ số chính, phát hiện, khác biệt giữa các nhóm khách, hàm ý và giới hạn. Mọi con số là của toàn bộ 1.992 khách và là quan hệ mô tả, chưa kiểm soát các yếu tố khác.</w:t>
+        <w:t xml:space="preserve">, dùng một theme màu thống nhất (xanh lá #2E6B4F chủ đạo, cam #E4572E cho trạng thái cần chú ý) và bốn slicer đồng bộ ở cùng vị trí. Mỗi mục dưới đây phân tích một trang theo cùng mạch: câu hỏi của trang, chỉ số chính, phát hiện, khác biệt giữa các nhóm khách, hàm ý và giới hạn. Mọi con số là của toàn bộ 1.992 khách và là quan hệ mô tả, chưa kiểm soát các yếu tố khác. Tiêu đề, tên thẻ và nhãn trên các hình được giữ nguyên như file Power BI; “doanh thu” trên dashboard được hiểu là tổng chi tiêu cộng dồn, còn “người nhận” hay “đã nhận” ở trang 4 nghĩa là khách đã chấp nhận chiến dịch.</w:t>
       </w:r>
     </w:p>
     <w:p>
@@ -15273,7 +15175,7 @@
           <w:b/>
           <w:bCs/>
         </w:rPr>
-        <w:t xml:space="preserve"> Dashboard trang 4 - Phản hồi chiến dịch</w:t>
+        <w:t xml:space="preserve"> Dashboard trang 4 - Hiệu quả chiến dịch</w:t>
       </w:r>
     </w:p>
     <w:p>
@@ -15289,7 +15191,7 @@
           <w:sz w:val="22"/>
           <w:szCs w:val="22"/>
         </w:rPr>
-        <w:t xml:space="preserve">Nguồn: Nhóm tác giả, dựng lại từ bố cục, màu sắc và trường dữ liệu của trang “4. Phản hồi chiến dịch” trong file mon.pbix (bộ lọc ở trạng thái Tất cả).</w:t>
+        <w:t xml:space="preserve">Nguồn: Nhóm tác giả, dựng lại từ bố cục, màu sắc và trường dữ liệu của trang “4. Hiệu quả chiến dịch” trong file mon.pbix (bộ lọc ở trạng thái Tất cả).</w:t>
       </w:r>
     </w:p>
     <w:p>
@@ -16378,7 +16280,7 @@
         </w:rPr>
         <w:drawing>
           <wp:inline distT="0" distB="0" distL="0" distR="0">
-            <wp:extent cx="3108960" cy="2568271"/>
+            <wp:extent cx="3291840" cy="2743200"/>
             <wp:effectExtent l="0" t="0" r="0" b="0"/>
             <wp:docPr id="109" name="Picture 109"/>
             <wp:cNvGraphicFramePr>
@@ -16400,7 +16302,7 @@
                   <pic:spPr>
                     <a:xfrm>
                       <a:off x="0" y="0"/>
-                      <a:ext cx="3108960" cy="2568271"/>
+                      <a:ext cx="3291840" cy="2743200"/>
                     </a:xfrm>
                     <a:prstGeom prst="rect">
                       <a:avLst/>
@@ -16573,7 +16475,7 @@
         <w:t xml:space="preserve">Câu hỏi của trang:</w:t>
       </w:r>
       <w:r>
-        <w:t xml:space="preserve"> giá trị nào đang nằm ở nhóm lâu chưa quay lại. Bốn thẻ KPI cho thấy nhóm At Risk nắm 446,3 nghìn ĐVTT chi tiêu lịch sử (39,6% tổng chi tiêu), trong đó có 166 khách VIP; với giả định 10% khách At Risk quay lại, thẻ kịch bản win-back cho 44,6 nghìn ĐVTT chi tiêu lịch sử tương ứng. Scatter ở góc trái đặt mỗi phân khúc theo recency trung bình và chi tiêu trung bình, cho thấy At Risk nằm ở góc “chi nhiều nhưng lâu chưa quay lại”, đối xứng với Champions ở góc “chi nhiều và mua gần đây”.</w:t>
+        <w:t xml:space="preserve"> giá trị nào đang nằm ở nhóm lâu chưa quay lại. Bốn thẻ KPI cho thấy nhóm At Risk nắm 446,3 nghìn ĐVTT chi tiêu lịch sử (thẻ “Doanh thu rủi ro (At Risk)”, bằng 39,6% tổng chi tiêu), trong đó có 166 khách VIP; với giả định 10% khách At Risk quay lại, thẻ “Doanh thu giữ lại được” cho 44,6 nghìn ĐVTT, tức phần chi tiêu lịch sử tương ứng với kịch bản chứ không phải doanh thu dự báo. Scatter ở góc trái đặt mỗi phân khúc theo recency trung bình và chi tiêu trung bình, cho thấy At Risk nằm ở góc “chi nhiều nhưng lâu chưa quay lại”, đối xứng với Champions ở góc “chi nhiều và mua gần đây”.</w:t>
       </w:r>
     </w:p>
     <w:p>
@@ -21959,7 +21861,7 @@
         </w:rPr>
         <w:drawing>
           <wp:inline distT="0" distB="0" distL="0" distR="0">
-            <wp:extent cx="3657600" cy="3077028"/>
+            <wp:extent cx="5120640" cy="4297680"/>
             <wp:effectExtent l="0" t="0" r="0" b="0"/>
             <wp:docPr id="111" name="Picture 111"/>
             <wp:cNvGraphicFramePr>
@@ -21981,7 +21883,7 @@
                   <pic:spPr>
                     <a:xfrm>
                       <a:off x="0" y="0"/>
-                      <a:ext cx="3657600" cy="3077028"/>
+                      <a:ext cx="5120640" cy="4297680"/>
                     </a:xfrm>
                     <a:prstGeom prst="rect">
                       <a:avLst/>
@@ -28671,7 +28573,7 @@
         </w:rPr>
         <w:drawing>
           <wp:inline distT="0" distB="0" distL="0" distR="0">
-            <wp:extent cx="5669280" cy="2662843"/>
+            <wp:extent cx="5760085" cy="2742897"/>
             <wp:effectExtent l="0" t="0" r="0" b="0"/>
             <wp:docPr id="112" name="Picture 112"/>
             <wp:cNvGraphicFramePr>
@@ -28693,7 +28595,7 @@
                   <pic:spPr>
                     <a:xfrm>
                       <a:off x="0" y="0"/>
-                      <a:ext cx="5669280" cy="2662843"/>
+                      <a:ext cx="5760085" cy="2742897"/>
                     </a:xfrm>
                     <a:prstGeom prst="rect">
                       <a:avLst/>
@@ -30313,6 +30215,16 @@
     </w:p>
     <w:p>
       <w:pPr>
+        <w:spacing w:before="0" w:after="120" w:line="360" w:lineRule="auto"/>
+        <w:ind w:firstLine="567"/>
+        <w:jc w:val="both"/>
+      </w:pPr>
+      <w:r>
+        <w:t xml:space="preserve">Cây quyết định (Hình 4.3) dùng thêm tổng chi tiêu, số đơn catalog và thâm niên, nên cũng có thể chịu rò rỉ thời gian như đã nêu ở mục 2; cây được huấn luyện lại trên 1.992 khách để hiển thị quy tắc. Nút gốc tách theo tổng chi tiêu: 336 khách chi trên 1.204 ĐVTT có 55,4% đã từng chấp nhận, so với 14,0% ở số còn lại. Lá cao nhất là khách chi trên 1.600 ĐVTT với thâm niên không quá 2.646 ngày (71/80, 88,8%); lá thấp nhất là khách chi không quá 1.204 ĐVTT, chưa mua catalog và truy cập web không quá 8 lượt/tháng (15/476, 3,2%). Đây là tỷ lệ lịch sử trên chính dữ liệu dựng cây.</w:t>
+      </w:r>
+    </w:p>
+    <w:p>
+      <w:pPr>
         <w:keepNext/>
         <w:spacing w:before="120" w:after="60" w:line="240" w:lineRule="auto"/>
         <w:ind w:firstLine="0"/>
@@ -30324,7 +30236,7 @@
         </w:rPr>
         <w:drawing>
           <wp:inline distT="0" distB="0" distL="0" distR="0">
-            <wp:extent cx="5760085" cy="3637948"/>
+            <wp:extent cx="5760085" cy="4160061"/>
             <wp:effectExtent l="0" t="0" r="0" b="0"/>
             <wp:docPr id="113" name="Picture 113"/>
             <wp:cNvGraphicFramePr>
@@ -30346,7 +30258,7 @@
                   <pic:spPr>
                     <a:xfrm>
                       <a:off x="0" y="0"/>
-                      <a:ext cx="5760085" cy="3637948"/>
+                      <a:ext cx="5760085" cy="4160061"/>
                     </a:xfrm>
                     <a:prstGeom prst="rect">
                       <a:avLst/>
@@ -30392,16 +30304,6 @@
           <w:szCs w:val="22"/>
         </w:rPr>
         <w:t xml:space="preserve">Nguồn: Nhóm tác giả tính toán bằng Python (scikit-learn), cây huấn luyện lại trên toàn bộ 1.992 khách.</w:t>
-      </w:r>
-    </w:p>
-    <w:p>
-      <w:pPr>
-        <w:spacing w:before="0" w:after="120" w:line="360" w:lineRule="auto"/>
-        <w:ind w:firstLine="567"/>
-        <w:jc w:val="both"/>
-      </w:pPr>
-      <w:r>
-        <w:t xml:space="preserve">Cây quyết định (Hình 4.3) dùng thêm tổng chi tiêu, số đơn catalog và thâm niên, nên cũng có thể chịu rò rỉ thời gian như đã nêu ở mục 2; cây được huấn luyện lại trên 1.992 khách để hiển thị quy tắc. Nút gốc tách theo tổng chi tiêu: 336 khách chi trên 1.204 ĐVTT có 55,4% đã từng chấp nhận, so với 14,0% ở số còn lại. Lá cao nhất là khách chi trên 1.600 ĐVTT với thâm niên không quá 2.646 ngày (71/80, 88,8%); lá thấp nhất là khách chi không quá 1.204 ĐVTT, chưa mua catalog và truy cập web không quá 8 lượt/tháng (15/476, 3,2%). Đây là tỷ lệ lịch sử trên chính dữ liệu dựng cây.</w:t>
       </w:r>
     </w:p>
     <w:p>
@@ -33159,7 +33061,7 @@
         <w:jc w:val="both"/>
       </w:pPr>
       <w:r>
-        <w:t xml:space="preserve">Các measure dưới đây tạo nên các thẻ KPI và hình chính của dashboard. Công thức được trích từ mô hình dữ liệu của file mon.pbix bằng thư viện pbixray (Python); riêng measure thu nhập của khách chấp nhận là công thức đã sửa để tính theo khách, và các tên measure là tên sau khi đổi để khớp với báo cáo.</w:t>
+        <w:t xml:space="preserve">Các measure dưới đây tạo nên các thẻ KPI và hình chính của dashboard. Công thức và tên measure được trích nguyên văn từ mô hình dữ liệu của file mon.pbix (bản cuối) bằng thư viện pbixray (Python).</w:t>
       </w:r>
     </w:p>
     <w:p>
@@ -33447,10 +33349,10 @@
           <w:b/>
           <w:bCs/>
         </w:rPr>
-        <w:t xml:space="preserve">Thu nhập TB khách chấp nhận CD</w:t>
-      </w:r>
-      <w:r>
-        <w:t xml:space="preserve"> (tính theo khách) và các measure của trang RFM:</w:t>
+        <w:t xml:space="preserve">Thu nhập TB người nhận CD</w:t>
+      </w:r>
+      <w:r>
+        <w:t xml:space="preserve"> (tính trên các dòng chấp nhận, xem mục 4.2 Chương II) và các measure của trang RFM:</w:t>
       </w:r>
     </w:p>
     <w:p>
@@ -33465,7 +33367,7 @@
           <w:sz w:val="19"/>
           <w:szCs w:val="19"/>
         </w:rPr>
-        <w:t xml:space="preserve">VAR _kh = FILTER(VALUES(Customers[CustomerID]),</w:t>
+        <w:t xml:space="preserve">Thu nhập TB người nhận CD =</w:t>
       </w:r>
     </w:p>
     <w:p>
@@ -33480,7 +33382,7 @@
           <w:sz w:val="19"/>
           <w:szCs w:val="19"/>
         </w:rPr>
-        <w:t xml:space="preserve">    CALCULATE(MAX(Campaign_Response[Accepted])) = 1)</w:t>
+        <w:t xml:space="preserve">    AVERAGEX(FILTER(Campaign_Response, Campaign_Response[Accepted] = 1),</w:t>
       </w:r>
     </w:p>
     <w:p>
@@ -33495,7 +33397,7 @@
           <w:sz w:val="19"/>
           <w:szCs w:val="19"/>
         </w:rPr>
-        <w:t xml:space="preserve">RETURN CALCULATE(AVERAGE(Customers[Income]), _kh)</w:t>
+        <w:t xml:space="preserve">        RELATED(Customers[Income]))</w:t>
       </w:r>
     </w:p>
     <w:p>
@@ -33525,7 +33427,22 @@
           <w:sz w:val="19"/>
           <w:szCs w:val="19"/>
         </w:rPr>
-        <w:t xml:space="preserve">Chi tiêu lịch sử nhóm At Risk = CALCULATE([Tổng chi tiêu], Customers[RFM_Segment] = "At Risk")</w:t>
+        <w:t xml:space="preserve">Doanh thu rủi ro (At Risk) = CALCULATE([Tổng chi tiêu], Customers[RFM_Segment] = "At Risk")</w:t>
+      </w:r>
+    </w:p>
+    <w:p>
+      <w:pPr>
+        <w:spacing w:after="0" w:line="240" w:lineRule="auto"/>
+        <w:ind w:left="567" w:firstLine="0"/>
+        <w:jc w:val="left"/>
+      </w:pPr>
+      <w:r>
+        <w:rPr>
+          <w:rFonts w:ascii="Courier New" w:hAnsi="Courier New" w:cs="Courier New"/>
+          <w:sz w:val="19"/>
+          <w:szCs w:val="19"/>
+        </w:rPr>
+        <w:t xml:space="preserve">% doanh thu rủi ro = DIVIDE([Doanh thu rủi ro (At Risk)], [Tổng chi tiêu])</w:t>
       </w:r>
     </w:p>
     <w:p>
@@ -33570,7 +33487,7 @@
           <w:sz w:val="19"/>
           <w:szCs w:val="19"/>
         </w:rPr>
-        <w:t xml:space="preserve">Chi tiêu lịch sử theo kịch bản win-back = [Chi tiêu lịch sử nhóm At Risk] * [Tỷ lệ win-back]</w:t>
+        <w:t xml:space="preserve">Doanh thu giữ lại được = [Doanh thu rủi ro (At Risk)] * [Tỷ lệ win-back]</w:t>
       </w:r>
     </w:p>
     <w:p>
@@ -34096,7 +34013,7 @@
         <w:t xml:space="preserve">Điểm RFM:</w:t>
       </w:r>
       <w:r>
-        <w:t xml:space="preserve"> sắp khách theo khóa ổn định Raw_Row, xếp hạng với rank(method = "first") rồi chia 5 nhóm bằng nhau (ngưỡng ở Bảng 2.7). Khi cập nhật hằng tháng, giữ cố định bộ ngưỡng của kỳ gốc (ghi số phiên bản) thay vì xếp hạng lại cả mẫu, và lưu bảng đối chiếu khách chuyển phân khúc giữa hai kỳ.</w:t>
+        <w:t xml:space="preserve"> sắp khách theo khóa ổn định Raw_Row, xếp hạng với rank(method = "first") rồi chia 5 nhóm bằng nhau (ngưỡng ở Bảng 2.7). Khi cập nhật hằng tháng, nhóm đề xuất giữ cố định bộ ngưỡng của kỳ gốc (ghi số phiên bản) thay vì xếp hạng lại cả mẫu, và lưu bảng đối chiếu khách chuyển phân khúc giữa hai kỳ.</w:t>
       </w:r>
     </w:p>
     <w:p>

</xml_diff>